<commit_message>
Updated the docs to add a dev-* branch
</commit_message>
<xml_diff>
--- a/הכשרת בדיקות אוטומטיות.docx
+++ b/הכשרת בדיקות אוטומטיות.docx
@@ -13,9 +13,6 @@
           <w:between w:val="nil"/>
         </w:pBdr>
         <w:spacing w:after="0" w:line="276" w:lineRule="auto"/>
-        <w:rPr>
-          <w:rFonts w:hint="cs"/>
-        </w:rPr>
       </w:pPr>
     </w:p>
     <w:p>
@@ -500,7 +497,7 @@
         <w:pStyle w:val="1"/>
       </w:pPr>
       <w:bookmarkStart w:id="0" w:name="_Toc200903255"/>
-      <w:bookmarkStart w:id="1" w:name="_Toc219898095"/>
+      <w:bookmarkStart w:id="1" w:name="_Toc223262720"/>
       <w:r>
         <w:rPr>
           <w:rtl/>
@@ -575,7 +572,7 @@
             </w:rPr>
             <w:fldChar w:fldCharType="separate"/>
           </w:r>
-          <w:hyperlink w:anchor="_Toc219898095" w:history="1">
+          <w:hyperlink w:anchor="_Toc223262720" w:history="1">
             <w:r>
               <w:rPr>
                 <w:rStyle w:val="Hyperlink"/>
@@ -621,7 +618,7 @@
                 <w:noProof/>
                 <w:webHidden/>
               </w:rPr>
-              <w:instrText xml:space="preserve"> PAGEREF _Toc219898095 \h </w:instrText>
+              <w:instrText xml:space="preserve"> PAGEREF _Toc223262720 \h </w:instrText>
             </w:r>
             <w:r>
               <w:rPr>
@@ -665,7 +662,7 @@
               <w14:ligatures w14:val="standardContextual"/>
             </w:rPr>
           </w:pPr>
-          <w:hyperlink w:anchor="_Toc219898096" w:history="1">
+          <w:hyperlink w:anchor="_Toc223262721" w:history="1">
             <w:r>
               <w:rPr>
                 <w:rStyle w:val="Hyperlink"/>
@@ -694,7 +691,7 @@
                 <w:noProof/>
                 <w:webHidden/>
               </w:rPr>
-              <w:instrText xml:space="preserve"> PAGEREF _Toc219898096 \h </w:instrText>
+              <w:instrText xml:space="preserve"> PAGEREF _Toc223262721 \h </w:instrText>
             </w:r>
             <w:r>
               <w:rPr>
@@ -741,7 +738,7 @@
               <w14:ligatures w14:val="standardContextual"/>
             </w:rPr>
           </w:pPr>
-          <w:hyperlink w:anchor="_Toc219898097" w:history="1">
+          <w:hyperlink w:anchor="_Toc223262722" w:history="1">
             <w:r>
               <w:rPr>
                 <w:rStyle w:val="Hyperlink"/>
@@ -821,7 +818,7 @@
                 <w:noProof/>
                 <w:webHidden/>
               </w:rPr>
-              <w:instrText xml:space="preserve"> PAGEREF _Toc219898097 \h </w:instrText>
+              <w:instrText xml:space="preserve"> PAGEREF _Toc223262722 \h </w:instrText>
             </w:r>
             <w:r>
               <w:rPr>
@@ -865,7 +862,7 @@
               <w14:ligatures w14:val="standardContextual"/>
             </w:rPr>
           </w:pPr>
-          <w:hyperlink w:anchor="_Toc219898098" w:history="1">
+          <w:hyperlink w:anchor="_Toc223262723" w:history="1">
             <w:r>
               <w:rPr>
                 <w:rStyle w:val="Hyperlink"/>
@@ -894,7 +891,7 @@
                 <w:noProof/>
                 <w:webHidden/>
               </w:rPr>
-              <w:instrText xml:space="preserve"> PAGEREF _Toc219898098 \h </w:instrText>
+              <w:instrText xml:space="preserve"> PAGEREF _Toc223262723 \h </w:instrText>
             </w:r>
             <w:r>
               <w:rPr>
@@ -941,7 +938,7 @@
               <w14:ligatures w14:val="standardContextual"/>
             </w:rPr>
           </w:pPr>
-          <w:hyperlink w:anchor="_Toc219898099" w:history="1">
+          <w:hyperlink w:anchor="_Toc223262724" w:history="1">
             <w:r>
               <w:rPr>
                 <w:rStyle w:val="Hyperlink"/>
@@ -968,7 +965,7 @@
                 <w:noProof/>
                 <w:webHidden/>
               </w:rPr>
-              <w:instrText xml:space="preserve"> PAGEREF _Toc219898099 \h </w:instrText>
+              <w:instrText xml:space="preserve"> PAGEREF _Toc223262724 \h </w:instrText>
             </w:r>
             <w:r>
               <w:rPr>
@@ -1015,7 +1012,7 @@
               <w14:ligatures w14:val="standardContextual"/>
             </w:rPr>
           </w:pPr>
-          <w:hyperlink w:anchor="_Toc219898100" w:history="1">
+          <w:hyperlink w:anchor="_Toc223262725" w:history="1">
             <w:r>
               <w:rPr>
                 <w:rStyle w:val="Hyperlink"/>
@@ -1059,7 +1056,7 @@
                 <w:noProof/>
                 <w:webHidden/>
               </w:rPr>
-              <w:instrText xml:space="preserve"> PAGEREF _Toc219898100 \h </w:instrText>
+              <w:instrText xml:space="preserve"> PAGEREF _Toc223262725 \h </w:instrText>
             </w:r>
             <w:r>
               <w:rPr>
@@ -1106,7 +1103,7 @@
               <w14:ligatures w14:val="standardContextual"/>
             </w:rPr>
           </w:pPr>
-          <w:hyperlink w:anchor="_Toc219898101" w:history="1">
+          <w:hyperlink w:anchor="_Toc223262726" w:history="1">
             <w:r>
               <w:rPr>
                 <w:rStyle w:val="Hyperlink"/>
@@ -1133,7 +1130,7 @@
                 <w:noProof/>
                 <w:webHidden/>
               </w:rPr>
-              <w:instrText xml:space="preserve"> PAGEREF _Toc219898101 \h </w:instrText>
+              <w:instrText xml:space="preserve"> PAGEREF _Toc223262726 \h </w:instrText>
             </w:r>
             <w:r>
               <w:rPr>
@@ -1180,7 +1177,7 @@
               <w14:ligatures w14:val="standardContextual"/>
             </w:rPr>
           </w:pPr>
-          <w:hyperlink w:anchor="_Toc219898102" w:history="1">
+          <w:hyperlink w:anchor="_Toc223262727" w:history="1">
             <w:r>
               <w:rPr>
                 <w:rStyle w:val="Hyperlink"/>
@@ -1241,7 +1238,7 @@
                 <w:noProof/>
                 <w:webHidden/>
               </w:rPr>
-              <w:instrText xml:space="preserve"> PAGEREF _Toc219898102 \h </w:instrText>
+              <w:instrText xml:space="preserve"> PAGEREF _Toc223262727 \h </w:instrText>
             </w:r>
             <w:r>
               <w:rPr>
@@ -1288,7 +1285,7 @@
               <w14:ligatures w14:val="standardContextual"/>
             </w:rPr>
           </w:pPr>
-          <w:hyperlink w:anchor="_Toc219898103" w:history="1">
+          <w:hyperlink w:anchor="_Toc223262728" w:history="1">
             <w:r>
               <w:rPr>
                 <w:rStyle w:val="Hyperlink"/>
@@ -1349,7 +1346,7 @@
                 <w:noProof/>
                 <w:webHidden/>
               </w:rPr>
-              <w:instrText xml:space="preserve"> PAGEREF _Toc219898103 \h </w:instrText>
+              <w:instrText xml:space="preserve"> PAGEREF _Toc223262728 \h </w:instrText>
             </w:r>
             <w:r>
               <w:rPr>
@@ -1393,7 +1390,7 @@
               <w14:ligatures w14:val="standardContextual"/>
             </w:rPr>
           </w:pPr>
-          <w:hyperlink w:anchor="_Toc219898104" w:history="1">
+          <w:hyperlink w:anchor="_Toc223262729" w:history="1">
             <w:r>
               <w:rPr>
                 <w:rStyle w:val="Hyperlink"/>
@@ -1420,7 +1417,7 @@
                 <w:noProof/>
                 <w:webHidden/>
               </w:rPr>
-              <w:instrText xml:space="preserve"> PAGEREF _Toc219898104 \h </w:instrText>
+              <w:instrText xml:space="preserve"> PAGEREF _Toc223262729 \h </w:instrText>
             </w:r>
             <w:r>
               <w:rPr>
@@ -1467,7 +1464,7 @@
               <w14:ligatures w14:val="standardContextual"/>
             </w:rPr>
           </w:pPr>
-          <w:hyperlink w:anchor="_Toc219898105" w:history="1">
+          <w:hyperlink w:anchor="_Toc223262730" w:history="1">
             <w:r>
               <w:rPr>
                 <w:rStyle w:val="Hyperlink"/>
@@ -1496,7 +1493,7 @@
                 <w:noProof/>
                 <w:webHidden/>
               </w:rPr>
-              <w:instrText xml:space="preserve"> PAGEREF _Toc219898105 \h </w:instrText>
+              <w:instrText xml:space="preserve"> PAGEREF _Toc223262730 \h </w:instrText>
             </w:r>
             <w:r>
               <w:rPr>
@@ -1543,7 +1540,7 @@
               <w14:ligatures w14:val="standardContextual"/>
             </w:rPr>
           </w:pPr>
-          <w:hyperlink w:anchor="_Toc219898106" w:history="1">
+          <w:hyperlink w:anchor="_Toc223262731" w:history="1">
             <w:r>
               <w:rPr>
                 <w:rStyle w:val="Hyperlink"/>
@@ -1572,7 +1569,7 @@
                 <w:noProof/>
                 <w:webHidden/>
               </w:rPr>
-              <w:instrText xml:space="preserve"> PAGEREF _Toc219898106 \h </w:instrText>
+              <w:instrText xml:space="preserve"> PAGEREF _Toc223262731 \h </w:instrText>
             </w:r>
             <w:r>
               <w:rPr>
@@ -1616,7 +1613,7 @@
               <w14:ligatures w14:val="standardContextual"/>
             </w:rPr>
           </w:pPr>
-          <w:hyperlink w:anchor="_Toc219898107" w:history="1">
+          <w:hyperlink w:anchor="_Toc223262732" w:history="1">
             <w:r>
               <w:rPr>
                 <w:rStyle w:val="Hyperlink"/>
@@ -1643,7 +1640,7 @@
                 <w:noProof/>
                 <w:webHidden/>
               </w:rPr>
-              <w:instrText xml:space="preserve"> PAGEREF _Toc219898107 \h </w:instrText>
+              <w:instrText xml:space="preserve"> PAGEREF _Toc223262732 \h </w:instrText>
             </w:r>
             <w:r>
               <w:rPr>
@@ -1690,7 +1687,7 @@
               <w14:ligatures w14:val="standardContextual"/>
             </w:rPr>
           </w:pPr>
-          <w:hyperlink w:anchor="_Toc219898108" w:history="1">
+          <w:hyperlink w:anchor="_Toc223262733" w:history="1">
             <w:r>
               <w:rPr>
                 <w:rStyle w:val="Hyperlink"/>
@@ -1719,7 +1716,7 @@
                 <w:noProof/>
                 <w:webHidden/>
               </w:rPr>
-              <w:instrText xml:space="preserve"> PAGEREF _Toc219898108 \h </w:instrText>
+              <w:instrText xml:space="preserve"> PAGEREF _Toc223262733 \h </w:instrText>
             </w:r>
             <w:r>
               <w:rPr>
@@ -1766,7 +1763,7 @@
               <w14:ligatures w14:val="standardContextual"/>
             </w:rPr>
           </w:pPr>
-          <w:hyperlink w:anchor="_Toc219898109" w:history="1">
+          <w:hyperlink w:anchor="_Toc223262734" w:history="1">
             <w:r>
               <w:rPr>
                 <w:rStyle w:val="Hyperlink"/>
@@ -1829,7 +1826,200 @@
                 <w:noProof/>
                 <w:webHidden/>
               </w:rPr>
-              <w:instrText xml:space="preserve"> PAGEREF _Toc219898109 \h </w:instrText>
+              <w:instrText xml:space="preserve"> PAGEREF _Toc223262734 \h </w:instrText>
+            </w:r>
+            <w:r>
+              <w:rPr>
+                <w:noProof/>
+                <w:webHidden/>
+              </w:rPr>
+            </w:r>
+            <w:r>
+              <w:rPr>
+                <w:noProof/>
+                <w:webHidden/>
+              </w:rPr>
+              <w:fldChar w:fldCharType="separate"/>
+            </w:r>
+            <w:r>
+              <w:rPr>
+                <w:noProof/>
+                <w:webHidden/>
+              </w:rPr>
+              <w:t>8</w:t>
+            </w:r>
+            <w:r>
+              <w:rPr>
+                <w:noProof/>
+                <w:webHidden/>
+              </w:rPr>
+              <w:fldChar w:fldCharType="end"/>
+            </w:r>
+          </w:hyperlink>
+        </w:p>
+        <w:p>
+          <w:pPr>
+            <w:pStyle w:val="TOC3"/>
+            <w:tabs>
+              <w:tab w:val="right" w:leader="dot" w:pos="8296"/>
+            </w:tabs>
+            <w:bidi w:val="0"/>
+            <w:rPr>
+              <w:rFonts w:asciiTheme="minorHAnsi" w:eastAsiaTheme="minorEastAsia" w:hAnsiTheme="minorHAnsi" w:cstheme="minorBidi"/>
+              <w:noProof/>
+              <w:kern w:val="2"/>
+              <w:sz w:val="24"/>
+              <w:szCs w:val="24"/>
+              <w14:ligatures w14:val="standardContextual"/>
+            </w:rPr>
+          </w:pPr>
+          <w:hyperlink w:anchor="_Toc223262735" w:history="1">
+            <w:r>
+              <w:rPr>
+                <w:rStyle w:val="Hyperlink"/>
+                <w:rFonts w:hint="eastAsia"/>
+                <w:noProof/>
+                <w:rtl/>
+              </w:rPr>
+              <w:t>דגשים</w:t>
+            </w:r>
+            <w:r>
+              <w:rPr>
+                <w:rStyle w:val="Hyperlink"/>
+                <w:noProof/>
+                <w:rtl/>
+              </w:rPr>
+              <w:t xml:space="preserve"> </w:t>
+            </w:r>
+            <w:r>
+              <w:rPr>
+                <w:rStyle w:val="Hyperlink"/>
+                <w:rFonts w:hint="eastAsia"/>
+                <w:noProof/>
+                <w:rtl/>
+              </w:rPr>
+              <w:t>ליצירת</w:t>
+            </w:r>
+            <w:r>
+              <w:rPr>
+                <w:rStyle w:val="Hyperlink"/>
+                <w:noProof/>
+                <w:rtl/>
+              </w:rPr>
+              <w:t xml:space="preserve"> </w:t>
+            </w:r>
+            <w:r>
+              <w:rPr>
+                <w:rStyle w:val="Hyperlink"/>
+                <w:rFonts w:hint="eastAsia"/>
+                <w:noProof/>
+                <w:rtl/>
+              </w:rPr>
+              <w:t>ענפים</w:t>
+            </w:r>
+            <w:r>
+              <w:rPr>
+                <w:rStyle w:val="Hyperlink"/>
+                <w:noProof/>
+                <w:rtl/>
+              </w:rPr>
+              <w:t xml:space="preserve"> </w:t>
+            </w:r>
+            <w:r>
+              <w:rPr>
+                <w:rStyle w:val="Hyperlink"/>
+                <w:rFonts w:hint="eastAsia"/>
+                <w:noProof/>
+                <w:rtl/>
+              </w:rPr>
+              <w:t>ב</w:t>
+            </w:r>
+            <w:r>
+              <w:rPr>
+                <w:rStyle w:val="Hyperlink"/>
+                <w:noProof/>
+                <w:rtl/>
+              </w:rPr>
+              <w:t xml:space="preserve"> </w:t>
+            </w:r>
+            <w:r>
+              <w:rPr>
+                <w:rStyle w:val="Hyperlink"/>
+                <w:noProof/>
+              </w:rPr>
+              <w:t>repo</w:t>
+            </w:r>
+            <w:r>
+              <w:rPr>
+                <w:rStyle w:val="Hyperlink"/>
+                <w:noProof/>
+                <w:rtl/>
+              </w:rPr>
+              <w:t xml:space="preserve"> </w:t>
+            </w:r>
+            <w:r>
+              <w:rPr>
+                <w:rStyle w:val="Hyperlink"/>
+                <w:rFonts w:hint="eastAsia"/>
+                <w:noProof/>
+                <w:rtl/>
+              </w:rPr>
+              <w:t>של</w:t>
+            </w:r>
+            <w:r>
+              <w:rPr>
+                <w:rStyle w:val="Hyperlink"/>
+                <w:noProof/>
+                <w:rtl/>
+              </w:rPr>
+              <w:t xml:space="preserve"> </w:t>
+            </w:r>
+            <w:r>
+              <w:rPr>
+                <w:rStyle w:val="Hyperlink"/>
+                <w:rFonts w:hint="eastAsia"/>
+                <w:noProof/>
+                <w:rtl/>
+              </w:rPr>
+              <w:t>הכשרת</w:t>
+            </w:r>
+            <w:r>
+              <w:rPr>
+                <w:rStyle w:val="Hyperlink"/>
+                <w:noProof/>
+                <w:rtl/>
+              </w:rPr>
+              <w:t xml:space="preserve"> </w:t>
+            </w:r>
+            <w:r>
+              <w:rPr>
+                <w:rStyle w:val="Hyperlink"/>
+                <w:rFonts w:hint="eastAsia"/>
+                <w:noProof/>
+                <w:rtl/>
+              </w:rPr>
+              <w:t>הבדיקות</w:t>
+            </w:r>
+            <w:r>
+              <w:rPr>
+                <w:noProof/>
+                <w:webHidden/>
+              </w:rPr>
+              <w:tab/>
+            </w:r>
+            <w:r>
+              <w:rPr>
+                <w:noProof/>
+                <w:webHidden/>
+              </w:rPr>
+              <w:fldChar w:fldCharType="begin"/>
+            </w:r>
+            <w:r>
+              <w:rPr>
+                <w:noProof/>
+                <w:webHidden/>
+              </w:rPr>
+              <w:instrText xml:space="preserve"> PAGEREF _Toc223262735 \h </w:instrText>
             </w:r>
             <w:r>
               <w:rPr>
@@ -1876,7 +2066,7 @@
               <w14:ligatures w14:val="standardContextual"/>
             </w:rPr>
           </w:pPr>
-          <w:hyperlink w:anchor="_Toc219898110" w:history="1">
+          <w:hyperlink w:anchor="_Toc223262736" w:history="1">
             <w:r>
               <w:rPr>
                 <w:rStyle w:val="Hyperlink"/>
@@ -1956,7 +2146,7 @@
                 <w:noProof/>
                 <w:webHidden/>
               </w:rPr>
-              <w:instrText xml:space="preserve"> PAGEREF _Toc219898110 \h </w:instrText>
+              <w:instrText xml:space="preserve"> PAGEREF _Toc223262736 \h </w:instrText>
             </w:r>
             <w:r>
               <w:rPr>
@@ -2003,7 +2193,7 @@
               <w14:ligatures w14:val="standardContextual"/>
             </w:rPr>
           </w:pPr>
-          <w:hyperlink w:anchor="_Toc219898111" w:history="1">
+          <w:hyperlink w:anchor="_Toc223262737" w:history="1">
             <w:r>
               <w:rPr>
                 <w:rStyle w:val="Hyperlink"/>
@@ -2030,7 +2220,7 @@
                 <w:noProof/>
                 <w:webHidden/>
               </w:rPr>
-              <w:instrText xml:space="preserve"> PAGEREF _Toc219898111 \h </w:instrText>
+              <w:instrText xml:space="preserve"> PAGEREF _Toc223262737 \h </w:instrText>
             </w:r>
             <w:r>
               <w:rPr>
@@ -2077,7 +2267,7 @@
               <w14:ligatures w14:val="standardContextual"/>
             </w:rPr>
           </w:pPr>
-          <w:hyperlink w:anchor="_Toc219898112" w:history="1">
+          <w:hyperlink w:anchor="_Toc223262738" w:history="1">
             <w:r>
               <w:rPr>
                 <w:rStyle w:val="Hyperlink"/>
@@ -2104,7 +2294,7 @@
                 <w:noProof/>
                 <w:webHidden/>
               </w:rPr>
-              <w:instrText xml:space="preserve"> PAGEREF _Toc219898112 \h </w:instrText>
+              <w:instrText xml:space="preserve"> PAGEREF _Toc223262738 \h </w:instrText>
             </w:r>
             <w:r>
               <w:rPr>
@@ -2148,7 +2338,7 @@
               <w14:ligatures w14:val="standardContextual"/>
             </w:rPr>
           </w:pPr>
-          <w:hyperlink w:anchor="_Toc219898113" w:history="1">
+          <w:hyperlink w:anchor="_Toc223262739" w:history="1">
             <w:r>
               <w:rPr>
                 <w:rStyle w:val="Hyperlink"/>
@@ -2192,7 +2382,7 @@
                 <w:noProof/>
                 <w:webHidden/>
               </w:rPr>
-              <w:instrText xml:space="preserve"> PAGEREF _Toc219898113 \h </w:instrText>
+              <w:instrText xml:space="preserve"> PAGEREF _Toc223262739 \h </w:instrText>
             </w:r>
             <w:r>
               <w:rPr>
@@ -2239,7 +2429,7 @@
               <w14:ligatures w14:val="standardContextual"/>
             </w:rPr>
           </w:pPr>
-          <w:hyperlink w:anchor="_Toc219898114" w:history="1">
+          <w:hyperlink w:anchor="_Toc223262740" w:history="1">
             <w:r>
               <w:rPr>
                 <w:rStyle w:val="Hyperlink"/>
@@ -2268,7 +2458,7 @@
                 <w:noProof/>
                 <w:webHidden/>
               </w:rPr>
-              <w:instrText xml:space="preserve"> PAGEREF _Toc219898114 \h </w:instrText>
+              <w:instrText xml:space="preserve"> PAGEREF _Toc223262740 \h </w:instrText>
             </w:r>
             <w:r>
               <w:rPr>
@@ -2315,7 +2505,7 @@
               <w14:ligatures w14:val="standardContextual"/>
             </w:rPr>
           </w:pPr>
-          <w:hyperlink w:anchor="_Toc219898115" w:history="1">
+          <w:hyperlink w:anchor="_Toc223262741" w:history="1">
             <w:r>
               <w:rPr>
                 <w:rStyle w:val="Hyperlink"/>
@@ -2344,7 +2534,7 @@
                 <w:noProof/>
                 <w:webHidden/>
               </w:rPr>
-              <w:instrText xml:space="preserve"> PAGEREF _Toc219898115 \h </w:instrText>
+              <w:instrText xml:space="preserve"> PAGEREF _Toc223262741 \h </w:instrText>
             </w:r>
             <w:r>
               <w:rPr>
@@ -2391,7 +2581,7 @@
               <w14:ligatures w14:val="standardContextual"/>
             </w:rPr>
           </w:pPr>
-          <w:hyperlink w:anchor="_Toc219898116" w:history="1">
+          <w:hyperlink w:anchor="_Toc223262742" w:history="1">
             <w:r>
               <w:rPr>
                 <w:rStyle w:val="Hyperlink"/>
@@ -2437,7 +2627,7 @@
                 <w:noProof/>
                 <w:webHidden/>
               </w:rPr>
-              <w:instrText xml:space="preserve"> PAGEREF _Toc219898116 \h </w:instrText>
+              <w:instrText xml:space="preserve"> PAGEREF _Toc223262742 \h </w:instrText>
             </w:r>
             <w:r>
               <w:rPr>
@@ -2484,7 +2674,7 @@
               <w14:ligatures w14:val="standardContextual"/>
             </w:rPr>
           </w:pPr>
-          <w:hyperlink w:anchor="_Toc219898117" w:history="1">
+          <w:hyperlink w:anchor="_Toc223262743" w:history="1">
             <w:r>
               <w:rPr>
                 <w:rStyle w:val="Hyperlink"/>
@@ -2513,7 +2703,7 @@
                 <w:noProof/>
                 <w:webHidden/>
               </w:rPr>
-              <w:instrText xml:space="preserve"> PAGEREF _Toc219898117 \h </w:instrText>
+              <w:instrText xml:space="preserve"> PAGEREF _Toc223262743 \h </w:instrText>
             </w:r>
             <w:r>
               <w:rPr>
@@ -2557,7 +2747,7 @@
               <w14:ligatures w14:val="standardContextual"/>
             </w:rPr>
           </w:pPr>
-          <w:hyperlink w:anchor="_Toc219898118" w:history="1">
+          <w:hyperlink w:anchor="_Toc223262744" w:history="1">
             <w:r>
               <w:rPr>
                 <w:rStyle w:val="Hyperlink"/>
@@ -2616,7 +2806,7 @@
                 <w:noProof/>
                 <w:webHidden/>
               </w:rPr>
-              <w:instrText xml:space="preserve"> PAGEREF _Toc219898118 \h </w:instrText>
+              <w:instrText xml:space="preserve"> PAGEREF _Toc223262744 \h </w:instrText>
             </w:r>
             <w:r>
               <w:rPr>
@@ -2663,7 +2853,7 @@
               <w14:ligatures w14:val="standardContextual"/>
             </w:rPr>
           </w:pPr>
-          <w:hyperlink w:anchor="_Toc219898119" w:history="1">
+          <w:hyperlink w:anchor="_Toc223262745" w:history="1">
             <w:r>
               <w:rPr>
                 <w:rStyle w:val="Hyperlink"/>
@@ -2692,7 +2882,7 @@
                 <w:noProof/>
                 <w:webHidden/>
               </w:rPr>
-              <w:instrText xml:space="preserve"> PAGEREF _Toc219898119 \h </w:instrText>
+              <w:instrText xml:space="preserve"> PAGEREF _Toc223262745 \h </w:instrText>
             </w:r>
             <w:r>
               <w:rPr>
@@ -2739,7 +2929,7 @@
               <w14:ligatures w14:val="standardContextual"/>
             </w:rPr>
           </w:pPr>
-          <w:hyperlink w:anchor="_Toc219898120" w:history="1">
+          <w:hyperlink w:anchor="_Toc223262746" w:history="1">
             <w:r>
               <w:rPr>
                 <w:rStyle w:val="Hyperlink"/>
@@ -2783,7 +2973,7 @@
                 <w:noProof/>
                 <w:webHidden/>
               </w:rPr>
-              <w:instrText xml:space="preserve"> PAGEREF _Toc219898120 \h </w:instrText>
+              <w:instrText xml:space="preserve"> PAGEREF _Toc223262746 \h </w:instrText>
             </w:r>
             <w:r>
               <w:rPr>
@@ -2830,7 +3020,7 @@
               <w14:ligatures w14:val="standardContextual"/>
             </w:rPr>
           </w:pPr>
-          <w:hyperlink w:anchor="_Toc219898121" w:history="1">
+          <w:hyperlink w:anchor="_Toc223262747" w:history="1">
             <w:r>
               <w:rPr>
                 <w:rStyle w:val="Hyperlink"/>
@@ -2891,7 +3081,7 @@
                 <w:noProof/>
                 <w:webHidden/>
               </w:rPr>
-              <w:instrText xml:space="preserve"> PAGEREF _Toc219898121 \h </w:instrText>
+              <w:instrText xml:space="preserve"> PAGEREF _Toc223262747 \h </w:instrText>
             </w:r>
             <w:r>
               <w:rPr>
@@ -2938,7 +3128,7 @@
               <w14:ligatures w14:val="standardContextual"/>
             </w:rPr>
           </w:pPr>
-          <w:hyperlink w:anchor="_Toc219898122" w:history="1">
+          <w:hyperlink w:anchor="_Toc223262748" w:history="1">
             <w:r>
               <w:rPr>
                 <w:rStyle w:val="Hyperlink"/>
@@ -2984,7 +3174,7 @@
                 <w:noProof/>
                 <w:webHidden/>
               </w:rPr>
-              <w:instrText xml:space="preserve"> PAGEREF _Toc219898122 \h </w:instrText>
+              <w:instrText xml:space="preserve"> PAGEREF _Toc223262748 \h </w:instrText>
             </w:r>
             <w:r>
               <w:rPr>
@@ -3031,7 +3221,7 @@
               <w14:ligatures w14:val="standardContextual"/>
             </w:rPr>
           </w:pPr>
-          <w:hyperlink w:anchor="_Toc219898123" w:history="1">
+          <w:hyperlink w:anchor="_Toc223262749" w:history="1">
             <w:r>
               <w:rPr>
                 <w:rStyle w:val="Hyperlink"/>
@@ -3060,7 +3250,7 @@
                 <w:noProof/>
                 <w:webHidden/>
               </w:rPr>
-              <w:instrText xml:space="preserve"> PAGEREF _Toc219898123 \h </w:instrText>
+              <w:instrText xml:space="preserve"> PAGEREF _Toc223262749 \h </w:instrText>
             </w:r>
             <w:r>
               <w:rPr>
@@ -3107,7 +3297,7 @@
               <w14:ligatures w14:val="standardContextual"/>
             </w:rPr>
           </w:pPr>
-          <w:hyperlink w:anchor="_Toc219898124" w:history="1">
+          <w:hyperlink w:anchor="_Toc223262750" w:history="1">
             <w:r>
               <w:rPr>
                 <w:rStyle w:val="Hyperlink"/>
@@ -3136,7 +3326,7 @@
                 <w:noProof/>
                 <w:webHidden/>
               </w:rPr>
-              <w:instrText xml:space="preserve"> PAGEREF _Toc219898124 \h </w:instrText>
+              <w:instrText xml:space="preserve"> PAGEREF _Toc223262750 \h </w:instrText>
             </w:r>
             <w:r>
               <w:rPr>
@@ -3180,7 +3370,7 @@
               <w14:ligatures w14:val="standardContextual"/>
             </w:rPr>
           </w:pPr>
-          <w:hyperlink w:anchor="_Toc219898125" w:history="1">
+          <w:hyperlink w:anchor="_Toc223262751" w:history="1">
             <w:r>
               <w:rPr>
                 <w:rStyle w:val="Hyperlink"/>
@@ -3243,7 +3433,7 @@
                 <w:noProof/>
                 <w:webHidden/>
               </w:rPr>
-              <w:instrText xml:space="preserve"> PAGEREF _Toc219898125 \h </w:instrText>
+              <w:instrText xml:space="preserve"> PAGEREF _Toc223262751 \h </w:instrText>
             </w:r>
             <w:r>
               <w:rPr>
@@ -3290,7 +3480,7 @@
               <w14:ligatures w14:val="standardContextual"/>
             </w:rPr>
           </w:pPr>
-          <w:hyperlink w:anchor="_Toc219898126" w:history="1">
+          <w:hyperlink w:anchor="_Toc223262752" w:history="1">
             <w:r>
               <w:rPr>
                 <w:rStyle w:val="Hyperlink"/>
@@ -3319,7 +3509,7 @@
                 <w:noProof/>
                 <w:webHidden/>
               </w:rPr>
-              <w:instrText xml:space="preserve"> PAGEREF _Toc219898126 \h </w:instrText>
+              <w:instrText xml:space="preserve"> PAGEREF _Toc223262752 \h </w:instrText>
             </w:r>
             <w:r>
               <w:rPr>
@@ -3366,7 +3556,7 @@
               <w14:ligatures w14:val="standardContextual"/>
             </w:rPr>
           </w:pPr>
-          <w:hyperlink w:anchor="_Toc219898127" w:history="1">
+          <w:hyperlink w:anchor="_Toc223262753" w:history="1">
             <w:r>
               <w:rPr>
                 <w:rStyle w:val="Hyperlink"/>
@@ -3427,7 +3617,7 @@
                 <w:noProof/>
                 <w:webHidden/>
               </w:rPr>
-              <w:instrText xml:space="preserve"> PAGEREF _Toc219898127 \h </w:instrText>
+              <w:instrText xml:space="preserve"> PAGEREF _Toc223262753 \h </w:instrText>
             </w:r>
             <w:r>
               <w:rPr>
@@ -3474,7 +3664,7 @@
               <w14:ligatures w14:val="standardContextual"/>
             </w:rPr>
           </w:pPr>
-          <w:hyperlink w:anchor="_Toc219898128" w:history="1">
+          <w:hyperlink w:anchor="_Toc223262754" w:history="1">
             <w:r>
               <w:rPr>
                 <w:rStyle w:val="Hyperlink"/>
@@ -3537,7 +3727,7 @@
                 <w:noProof/>
                 <w:webHidden/>
               </w:rPr>
-              <w:instrText xml:space="preserve"> PAGEREF _Toc219898128 \h </w:instrText>
+              <w:instrText xml:space="preserve"> PAGEREF _Toc223262754 \h </w:instrText>
             </w:r>
             <w:r>
               <w:rPr>
@@ -3584,7 +3774,7 @@
               <w14:ligatures w14:val="standardContextual"/>
             </w:rPr>
           </w:pPr>
-          <w:hyperlink w:anchor="_Toc219898129" w:history="1">
+          <w:hyperlink w:anchor="_Toc223262755" w:history="1">
             <w:r>
               <w:rPr>
                 <w:rStyle w:val="Hyperlink"/>
@@ -3613,7 +3803,7 @@
                 <w:noProof/>
                 <w:webHidden/>
               </w:rPr>
-              <w:instrText xml:space="preserve"> PAGEREF _Toc219898129 \h </w:instrText>
+              <w:instrText xml:space="preserve"> PAGEREF _Toc223262755 \h </w:instrText>
             </w:r>
             <w:r>
               <w:rPr>
@@ -3657,7 +3847,7 @@
               <w14:ligatures w14:val="standardContextual"/>
             </w:rPr>
           </w:pPr>
-          <w:hyperlink w:anchor="_Toc219898130" w:history="1">
+          <w:hyperlink w:anchor="_Toc223262756" w:history="1">
             <w:r>
               <w:rPr>
                 <w:rStyle w:val="Hyperlink"/>
@@ -3701,7 +3891,7 @@
                 <w:noProof/>
                 <w:webHidden/>
               </w:rPr>
-              <w:instrText xml:space="preserve"> PAGEREF _Toc219898130 \h </w:instrText>
+              <w:instrText xml:space="preserve"> PAGEREF _Toc223262756 \h </w:instrText>
             </w:r>
             <w:r>
               <w:rPr>
@@ -3748,7 +3938,7 @@
               <w14:ligatures w14:val="standardContextual"/>
             </w:rPr>
           </w:pPr>
-          <w:hyperlink w:anchor="_Toc219898131" w:history="1">
+          <w:hyperlink w:anchor="_Toc223262757" w:history="1">
             <w:r>
               <w:rPr>
                 <w:rStyle w:val="Hyperlink"/>
@@ -3811,7 +4001,7 @@
                 <w:noProof/>
                 <w:webHidden/>
               </w:rPr>
-              <w:instrText xml:space="preserve"> PAGEREF _Toc219898131 \h </w:instrText>
+              <w:instrText xml:space="preserve"> PAGEREF _Toc223262757 \h </w:instrText>
             </w:r>
             <w:r>
               <w:rPr>
@@ -3858,7 +4048,7 @@
               <w14:ligatures w14:val="standardContextual"/>
             </w:rPr>
           </w:pPr>
-          <w:hyperlink w:anchor="_Toc219898132" w:history="1">
+          <w:hyperlink w:anchor="_Toc223262758" w:history="1">
             <w:r>
               <w:rPr>
                 <w:rStyle w:val="Hyperlink"/>
@@ -3885,7 +4075,7 @@
                 <w:noProof/>
                 <w:webHidden/>
               </w:rPr>
-              <w:instrText xml:space="preserve"> PAGEREF _Toc219898132 \h </w:instrText>
+              <w:instrText xml:space="preserve"> PAGEREF _Toc223262758 \h </w:instrText>
             </w:r>
             <w:r>
               <w:rPr>
@@ -3932,7 +4122,7 @@
               <w14:ligatures w14:val="standardContextual"/>
             </w:rPr>
           </w:pPr>
-          <w:hyperlink w:anchor="_Toc219898133" w:history="1">
+          <w:hyperlink w:anchor="_Toc223262759" w:history="1">
             <w:r>
               <w:rPr>
                 <w:rStyle w:val="Hyperlink"/>
@@ -3959,7 +4149,7 @@
                 <w:noProof/>
                 <w:webHidden/>
               </w:rPr>
-              <w:instrText xml:space="preserve"> PAGEREF _Toc219898133 \h </w:instrText>
+              <w:instrText xml:space="preserve"> PAGEREF _Toc223262759 \h </w:instrText>
             </w:r>
             <w:r>
               <w:rPr>
@@ -4006,7 +4196,7 @@
               <w14:ligatures w14:val="standardContextual"/>
             </w:rPr>
           </w:pPr>
-          <w:hyperlink w:anchor="_Toc219898134" w:history="1">
+          <w:hyperlink w:anchor="_Toc223262760" w:history="1">
             <w:r>
               <w:rPr>
                 <w:rStyle w:val="Hyperlink"/>
@@ -4103,7 +4293,7 @@
                 <w:noProof/>
                 <w:webHidden/>
               </w:rPr>
-              <w:instrText xml:space="preserve"> PAGEREF _Toc219898134 \h </w:instrText>
+              <w:instrText xml:space="preserve"> PAGEREF _Toc223262760 \h </w:instrText>
             </w:r>
             <w:r>
               <w:rPr>
@@ -4147,7 +4337,7 @@
               <w14:ligatures w14:val="standardContextual"/>
             </w:rPr>
           </w:pPr>
-          <w:hyperlink w:anchor="_Toc219898135" w:history="1">
+          <w:hyperlink w:anchor="_Toc223262761" w:history="1">
             <w:r>
               <w:rPr>
                 <w:rStyle w:val="Hyperlink"/>
@@ -4174,7 +4364,7 @@
                 <w:noProof/>
                 <w:webHidden/>
               </w:rPr>
-              <w:instrText xml:space="preserve"> PAGEREF _Toc219898135 \h </w:instrText>
+              <w:instrText xml:space="preserve"> PAGEREF _Toc223262761 \h </w:instrText>
             </w:r>
             <w:r>
               <w:rPr>
@@ -4221,7 +4411,7 @@
               <w14:ligatures w14:val="standardContextual"/>
             </w:rPr>
           </w:pPr>
-          <w:hyperlink w:anchor="_Toc219898136" w:history="1">
+          <w:hyperlink w:anchor="_Toc223262762" w:history="1">
             <w:r>
               <w:rPr>
                 <w:rStyle w:val="Hyperlink"/>
@@ -4250,7 +4440,7 @@
                 <w:noProof/>
                 <w:webHidden/>
               </w:rPr>
-              <w:instrText xml:space="preserve"> PAGEREF _Toc219898136 \h </w:instrText>
+              <w:instrText xml:space="preserve"> PAGEREF _Toc223262762 \h </w:instrText>
             </w:r>
             <w:r>
               <w:rPr>
@@ -4297,7 +4487,7 @@
               <w14:ligatures w14:val="standardContextual"/>
             </w:rPr>
           </w:pPr>
-          <w:hyperlink w:anchor="_Toc219898137" w:history="1">
+          <w:hyperlink w:anchor="_Toc223262763" w:history="1">
             <w:r>
               <w:rPr>
                 <w:rStyle w:val="Hyperlink"/>
@@ -4394,7 +4584,7 @@
                 <w:noProof/>
                 <w:webHidden/>
               </w:rPr>
-              <w:instrText xml:space="preserve"> PAGEREF _Toc219898137 \h </w:instrText>
+              <w:instrText xml:space="preserve"> PAGEREF _Toc223262763 \h </w:instrText>
             </w:r>
             <w:r>
               <w:rPr>
@@ -4441,7 +4631,7 @@
               <w14:ligatures w14:val="standardContextual"/>
             </w:rPr>
           </w:pPr>
-          <w:hyperlink w:anchor="_Toc219898138" w:history="1">
+          <w:hyperlink w:anchor="_Toc223262764" w:history="1">
             <w:r>
               <w:rPr>
                 <w:rStyle w:val="Hyperlink"/>
@@ -4519,7 +4709,7 @@
                 <w:noProof/>
                 <w:webHidden/>
               </w:rPr>
-              <w:instrText xml:space="preserve"> PAGEREF _Toc219898138 \h </w:instrText>
+              <w:instrText xml:space="preserve"> PAGEREF _Toc223262764 \h </w:instrText>
             </w:r>
             <w:r>
               <w:rPr>
@@ -4566,7 +4756,7 @@
               <w14:ligatures w14:val="standardContextual"/>
             </w:rPr>
           </w:pPr>
-          <w:hyperlink w:anchor="_Toc219898139" w:history="1">
+          <w:hyperlink w:anchor="_Toc223262765" w:history="1">
             <w:r>
               <w:rPr>
                 <w:rStyle w:val="Hyperlink"/>
@@ -4627,7 +4817,7 @@
                 <w:noProof/>
                 <w:webHidden/>
               </w:rPr>
-              <w:instrText xml:space="preserve"> PAGEREF _Toc219898139 \h </w:instrText>
+              <w:instrText xml:space="preserve"> PAGEREF _Toc223262765 \h </w:instrText>
             </w:r>
             <w:r>
               <w:rPr>
@@ -4674,7 +4864,7 @@
               <w14:ligatures w14:val="standardContextual"/>
             </w:rPr>
           </w:pPr>
-          <w:hyperlink w:anchor="_Toc219898140" w:history="1">
+          <w:hyperlink w:anchor="_Toc223262766" w:history="1">
             <w:r>
               <w:rPr>
                 <w:rStyle w:val="Hyperlink"/>
@@ -4720,7 +4910,7 @@
                 <w:noProof/>
                 <w:webHidden/>
               </w:rPr>
-              <w:instrText xml:space="preserve"> PAGEREF _Toc219898140 \h </w:instrText>
+              <w:instrText xml:space="preserve"> PAGEREF _Toc223262766 \h </w:instrText>
             </w:r>
             <w:r>
               <w:rPr>
@@ -4767,7 +4957,7 @@
               <w14:ligatures w14:val="standardContextual"/>
             </w:rPr>
           </w:pPr>
-          <w:hyperlink w:anchor="_Toc219898141" w:history="1">
+          <w:hyperlink w:anchor="_Toc223262767" w:history="1">
             <w:r>
               <w:rPr>
                 <w:rStyle w:val="Hyperlink"/>
@@ -4796,7 +4986,7 @@
                 <w:noProof/>
                 <w:webHidden/>
               </w:rPr>
-              <w:instrText xml:space="preserve"> PAGEREF _Toc219898141 \h </w:instrText>
+              <w:instrText xml:space="preserve"> PAGEREF _Toc223262767 \h </w:instrText>
             </w:r>
             <w:r>
               <w:rPr>
@@ -4843,7 +5033,7 @@
               <w14:ligatures w14:val="standardContextual"/>
             </w:rPr>
           </w:pPr>
-          <w:hyperlink w:anchor="_Toc219898142" w:history="1">
+          <w:hyperlink w:anchor="_Toc223262768" w:history="1">
             <w:r>
               <w:rPr>
                 <w:rStyle w:val="Hyperlink"/>
@@ -4872,7 +5062,7 @@
                 <w:noProof/>
                 <w:webHidden/>
               </w:rPr>
-              <w:instrText xml:space="preserve"> PAGEREF _Toc219898142 \h </w:instrText>
+              <w:instrText xml:space="preserve"> PAGEREF _Toc223262768 \h </w:instrText>
             </w:r>
             <w:r>
               <w:rPr>
@@ -4919,7 +5109,7 @@
               <w14:ligatures w14:val="standardContextual"/>
             </w:rPr>
           </w:pPr>
-          <w:hyperlink w:anchor="_Toc219898143" w:history="1">
+          <w:hyperlink w:anchor="_Toc223262769" w:history="1">
             <w:r>
               <w:rPr>
                 <w:rStyle w:val="Hyperlink"/>
@@ -5033,7 +5223,7 @@
                 <w:noProof/>
                 <w:webHidden/>
               </w:rPr>
-              <w:instrText xml:space="preserve"> PAGEREF _Toc219898143 \h </w:instrText>
+              <w:instrText xml:space="preserve"> PAGEREF _Toc223262769 \h </w:instrText>
             </w:r>
             <w:r>
               <w:rPr>
@@ -5080,7 +5270,7 @@
               <w14:ligatures w14:val="standardContextual"/>
             </w:rPr>
           </w:pPr>
-          <w:hyperlink w:anchor="_Toc219898144" w:history="1">
+          <w:hyperlink w:anchor="_Toc223262770" w:history="1">
             <w:r>
               <w:rPr>
                 <w:rStyle w:val="Hyperlink"/>
@@ -5109,7 +5299,7 @@
                 <w:noProof/>
                 <w:webHidden/>
               </w:rPr>
-              <w:instrText xml:space="preserve"> PAGEREF _Toc219898144 \h </w:instrText>
+              <w:instrText xml:space="preserve"> PAGEREF _Toc223262770 \h </w:instrText>
             </w:r>
             <w:r>
               <w:rPr>
@@ -5156,7 +5346,7 @@
               <w14:ligatures w14:val="standardContextual"/>
             </w:rPr>
           </w:pPr>
-          <w:hyperlink w:anchor="_Toc219898145" w:history="1">
+          <w:hyperlink w:anchor="_Toc223262771" w:history="1">
             <w:r>
               <w:rPr>
                 <w:rStyle w:val="Hyperlink"/>
@@ -5219,7 +5409,7 @@
                 <w:noProof/>
                 <w:webHidden/>
               </w:rPr>
-              <w:instrText xml:space="preserve"> PAGEREF _Toc219898145 \h </w:instrText>
+              <w:instrText xml:space="preserve"> PAGEREF _Toc223262771 \h </w:instrText>
             </w:r>
             <w:r>
               <w:rPr>
@@ -5266,7 +5456,7 @@
               <w14:ligatures w14:val="standardContextual"/>
             </w:rPr>
           </w:pPr>
-          <w:hyperlink w:anchor="_Toc219898146" w:history="1">
+          <w:hyperlink w:anchor="_Toc223262772" w:history="1">
             <w:r>
               <w:rPr>
                 <w:rStyle w:val="Hyperlink"/>
@@ -5295,7 +5485,7 @@
                 <w:noProof/>
                 <w:webHidden/>
               </w:rPr>
-              <w:instrText xml:space="preserve"> PAGEREF _Toc219898146 \h </w:instrText>
+              <w:instrText xml:space="preserve"> PAGEREF _Toc223262772 \h </w:instrText>
             </w:r>
             <w:r>
               <w:rPr>
@@ -5342,7 +5532,7 @@
               <w14:ligatures w14:val="standardContextual"/>
             </w:rPr>
           </w:pPr>
-          <w:hyperlink w:anchor="_Toc219898147" w:history="1">
+          <w:hyperlink w:anchor="_Toc223262773" w:history="1">
             <w:r>
               <w:rPr>
                 <w:rStyle w:val="Hyperlink"/>
@@ -5430,7 +5620,7 @@
                 <w:noProof/>
                 <w:webHidden/>
               </w:rPr>
-              <w:instrText xml:space="preserve"> PAGEREF _Toc219898147 \h </w:instrText>
+              <w:instrText xml:space="preserve"> PAGEREF _Toc223262773 \h </w:instrText>
             </w:r>
             <w:r>
               <w:rPr>
@@ -5477,7 +5667,7 @@
               <w14:ligatures w14:val="standardContextual"/>
             </w:rPr>
           </w:pPr>
-          <w:hyperlink w:anchor="_Toc219898148" w:history="1">
+          <w:hyperlink w:anchor="_Toc223262774" w:history="1">
             <w:r>
               <w:rPr>
                 <w:rStyle w:val="Hyperlink"/>
@@ -5521,7 +5711,7 @@
                 <w:noProof/>
                 <w:webHidden/>
               </w:rPr>
-              <w:instrText xml:space="preserve"> PAGEREF _Toc219898148 \h </w:instrText>
+              <w:instrText xml:space="preserve"> PAGEREF _Toc223262774 \h </w:instrText>
             </w:r>
             <w:r>
               <w:rPr>
@@ -5568,7 +5758,7 @@
               <w14:ligatures w14:val="standardContextual"/>
             </w:rPr>
           </w:pPr>
-          <w:hyperlink w:anchor="_Toc219898149" w:history="1">
+          <w:hyperlink w:anchor="_Toc223262775" w:history="1">
             <w:r>
               <w:rPr>
                 <w:rStyle w:val="Hyperlink"/>
@@ -5612,7 +5802,7 @@
                 <w:noProof/>
                 <w:webHidden/>
               </w:rPr>
-              <w:instrText xml:space="preserve"> PAGEREF _Toc219898149 \h </w:instrText>
+              <w:instrText xml:space="preserve"> PAGEREF _Toc223262775 \h </w:instrText>
             </w:r>
             <w:r>
               <w:rPr>
@@ -5656,7 +5846,7 @@
               <w14:ligatures w14:val="standardContextual"/>
             </w:rPr>
           </w:pPr>
-          <w:hyperlink w:anchor="_Toc219898150" w:history="1">
+          <w:hyperlink w:anchor="_Toc223262776" w:history="1">
             <w:r>
               <w:rPr>
                 <w:rStyle w:val="Hyperlink"/>
@@ -5683,7 +5873,7 @@
                 <w:noProof/>
                 <w:webHidden/>
               </w:rPr>
-              <w:instrText xml:space="preserve"> PAGEREF _Toc219898150 \h </w:instrText>
+              <w:instrText xml:space="preserve"> PAGEREF _Toc223262776 \h </w:instrText>
             </w:r>
             <w:r>
               <w:rPr>
@@ -5730,7 +5920,7 @@
               <w14:ligatures w14:val="standardContextual"/>
             </w:rPr>
           </w:pPr>
-          <w:hyperlink w:anchor="_Toc219898151" w:history="1">
+          <w:hyperlink w:anchor="_Toc223262777" w:history="1">
             <w:r>
               <w:rPr>
                 <w:rStyle w:val="Hyperlink"/>
@@ -5827,7 +6017,7 @@
                 <w:noProof/>
                 <w:webHidden/>
               </w:rPr>
-              <w:instrText xml:space="preserve"> PAGEREF _Toc219898151 \h </w:instrText>
+              <w:instrText xml:space="preserve"> PAGEREF _Toc223262777 \h </w:instrText>
             </w:r>
             <w:r>
               <w:rPr>
@@ -5874,7 +6064,7 @@
               <w14:ligatures w14:val="standardContextual"/>
             </w:rPr>
           </w:pPr>
-          <w:hyperlink w:anchor="_Toc219898152" w:history="1">
+          <w:hyperlink w:anchor="_Toc223262778" w:history="1">
             <w:r>
               <w:rPr>
                 <w:rStyle w:val="Hyperlink"/>
@@ -5952,7 +6142,7 @@
                 <w:noProof/>
                 <w:webHidden/>
               </w:rPr>
-              <w:instrText xml:space="preserve"> PAGEREF _Toc219898152 \h </w:instrText>
+              <w:instrText xml:space="preserve"> PAGEREF _Toc223262778 \h </w:instrText>
             </w:r>
             <w:r>
               <w:rPr>
@@ -5999,7 +6189,7 @@
               <w14:ligatures w14:val="standardContextual"/>
             </w:rPr>
           </w:pPr>
-          <w:hyperlink w:anchor="_Toc219898153" w:history="1">
+          <w:hyperlink w:anchor="_Toc223262779" w:history="1">
             <w:r>
               <w:rPr>
                 <w:rStyle w:val="Hyperlink"/>
@@ -6077,7 +6267,7 @@
                 <w:noProof/>
                 <w:webHidden/>
               </w:rPr>
-              <w:instrText xml:space="preserve"> PAGEREF _Toc219898153 \h </w:instrText>
+              <w:instrText xml:space="preserve"> PAGEREF _Toc223262779 \h </w:instrText>
             </w:r>
             <w:r>
               <w:rPr>
@@ -6124,7 +6314,7 @@
               <w14:ligatures w14:val="standardContextual"/>
             </w:rPr>
           </w:pPr>
-          <w:hyperlink w:anchor="_Toc219898154" w:history="1">
+          <w:hyperlink w:anchor="_Toc223262780" w:history="1">
             <w:r>
               <w:rPr>
                 <w:rStyle w:val="Hyperlink"/>
@@ -6187,7 +6377,7 @@
                 <w:noProof/>
                 <w:webHidden/>
               </w:rPr>
-              <w:instrText xml:space="preserve"> PAGEREF _Toc219898154 \h </w:instrText>
+              <w:instrText xml:space="preserve"> PAGEREF _Toc223262780 \h </w:instrText>
             </w:r>
             <w:r>
               <w:rPr>
@@ -6234,7 +6424,7 @@
               <w14:ligatures w14:val="standardContextual"/>
             </w:rPr>
           </w:pPr>
-          <w:hyperlink w:anchor="_Toc219898155" w:history="1">
+          <w:hyperlink w:anchor="_Toc223262781" w:history="1">
             <w:r>
               <w:rPr>
                 <w:rStyle w:val="Hyperlink"/>
@@ -6263,7 +6453,7 @@
                 <w:noProof/>
                 <w:webHidden/>
               </w:rPr>
-              <w:instrText xml:space="preserve"> PAGEREF _Toc219898155 \h </w:instrText>
+              <w:instrText xml:space="preserve"> PAGEREF _Toc223262781 \h </w:instrText>
             </w:r>
             <w:r>
               <w:rPr>
@@ -6310,7 +6500,7 @@
               <w14:ligatures w14:val="standardContextual"/>
             </w:rPr>
           </w:pPr>
-          <w:hyperlink w:anchor="_Toc219898156" w:history="1">
+          <w:hyperlink w:anchor="_Toc223262782" w:history="1">
             <w:r>
               <w:rPr>
                 <w:rStyle w:val="Hyperlink"/>
@@ -6339,7 +6529,7 @@
                 <w:noProof/>
                 <w:webHidden/>
               </w:rPr>
-              <w:instrText xml:space="preserve"> PAGEREF _Toc219898156 \h </w:instrText>
+              <w:instrText xml:space="preserve"> PAGEREF _Toc223262782 \h </w:instrText>
             </w:r>
             <w:r>
               <w:rPr>
@@ -6386,7 +6576,7 @@
               <w14:ligatures w14:val="standardContextual"/>
             </w:rPr>
           </w:pPr>
-          <w:hyperlink w:anchor="_Toc219898157" w:history="1">
+          <w:hyperlink w:anchor="_Toc223262783" w:history="1">
             <w:r>
               <w:rPr>
                 <w:rStyle w:val="Hyperlink"/>
@@ -6415,7 +6605,7 @@
                 <w:noProof/>
                 <w:webHidden/>
               </w:rPr>
-              <w:instrText xml:space="preserve"> PAGEREF _Toc219898157 \h </w:instrText>
+              <w:instrText xml:space="preserve"> PAGEREF _Toc223262783 \h </w:instrText>
             </w:r>
             <w:r>
               <w:rPr>
@@ -6462,7 +6652,7 @@
               <w14:ligatures w14:val="standardContextual"/>
             </w:rPr>
           </w:pPr>
-          <w:hyperlink w:anchor="_Toc219898158" w:history="1">
+          <w:hyperlink w:anchor="_Toc223262784" w:history="1">
             <w:r>
               <w:rPr>
                 <w:rStyle w:val="Hyperlink"/>
@@ -6542,7 +6732,7 @@
                 <w:noProof/>
                 <w:webHidden/>
               </w:rPr>
-              <w:instrText xml:space="preserve"> PAGEREF _Toc219898158 \h </w:instrText>
+              <w:instrText xml:space="preserve"> PAGEREF _Toc223262784 \h </w:instrText>
             </w:r>
             <w:r>
               <w:rPr>
@@ -6589,7 +6779,7 @@
               <w14:ligatures w14:val="standardContextual"/>
             </w:rPr>
           </w:pPr>
-          <w:hyperlink w:anchor="_Toc219898159" w:history="1">
+          <w:hyperlink w:anchor="_Toc223262785" w:history="1">
             <w:r>
               <w:rPr>
                 <w:rStyle w:val="Hyperlink"/>
@@ -6618,7 +6808,7 @@
                 <w:noProof/>
                 <w:webHidden/>
               </w:rPr>
-              <w:instrText xml:space="preserve"> PAGEREF _Toc219898159 \h </w:instrText>
+              <w:instrText xml:space="preserve"> PAGEREF _Toc223262785 \h </w:instrText>
             </w:r>
             <w:r>
               <w:rPr>
@@ -6665,7 +6855,7 @@
               <w14:ligatures w14:val="standardContextual"/>
             </w:rPr>
           </w:pPr>
-          <w:hyperlink w:anchor="_Toc219898160" w:history="1">
+          <w:hyperlink w:anchor="_Toc223262786" w:history="1">
             <w:r>
               <w:rPr>
                 <w:rStyle w:val="Hyperlink"/>
@@ -6711,7 +6901,7 @@
                 <w:noProof/>
                 <w:webHidden/>
               </w:rPr>
-              <w:instrText xml:space="preserve"> PAGEREF _Toc219898160 \h </w:instrText>
+              <w:instrText xml:space="preserve"> PAGEREF _Toc223262786 \h </w:instrText>
             </w:r>
             <w:r>
               <w:rPr>
@@ -6758,7 +6948,7 @@
               <w14:ligatures w14:val="standardContextual"/>
             </w:rPr>
           </w:pPr>
-          <w:hyperlink w:anchor="_Toc219898161" w:history="1">
+          <w:hyperlink w:anchor="_Toc223262787" w:history="1">
             <w:r>
               <w:rPr>
                 <w:rStyle w:val="Hyperlink"/>
@@ -6804,7 +6994,7 @@
                 <w:noProof/>
                 <w:webHidden/>
               </w:rPr>
-              <w:instrText xml:space="preserve"> PAGEREF _Toc219898161 \h </w:instrText>
+              <w:instrText xml:space="preserve"> PAGEREF _Toc223262787 \h </w:instrText>
             </w:r>
             <w:r>
               <w:rPr>
@@ -6851,7 +7041,7 @@
               <w14:ligatures w14:val="standardContextual"/>
             </w:rPr>
           </w:pPr>
-          <w:hyperlink w:anchor="_Toc219898162" w:history="1">
+          <w:hyperlink w:anchor="_Toc223262788" w:history="1">
             <w:r>
               <w:rPr>
                 <w:rStyle w:val="Hyperlink"/>
@@ -6897,7 +7087,7 @@
                 <w:noProof/>
                 <w:webHidden/>
               </w:rPr>
-              <w:instrText xml:space="preserve"> PAGEREF _Toc219898162 \h </w:instrText>
+              <w:instrText xml:space="preserve"> PAGEREF _Toc223262788 \h </w:instrText>
             </w:r>
             <w:r>
               <w:rPr>
@@ -6941,7 +7131,7 @@
               <w14:ligatures w14:val="standardContextual"/>
             </w:rPr>
           </w:pPr>
-          <w:hyperlink w:anchor="_Toc219898163" w:history="1">
+          <w:hyperlink w:anchor="_Toc223262789" w:history="1">
             <w:r>
               <w:rPr>
                 <w:rStyle w:val="Hyperlink"/>
@@ -6970,7 +7160,7 @@
                 <w:noProof/>
                 <w:webHidden/>
               </w:rPr>
-              <w:instrText xml:space="preserve"> PAGEREF _Toc219898163 \h </w:instrText>
+              <w:instrText xml:space="preserve"> PAGEREF _Toc223262789 \h </w:instrText>
             </w:r>
             <w:r>
               <w:rPr>
@@ -7017,7 +7207,7 @@
               <w14:ligatures w14:val="standardContextual"/>
             </w:rPr>
           </w:pPr>
-          <w:hyperlink w:anchor="_Toc219898164" w:history="1">
+          <w:hyperlink w:anchor="_Toc223262790" w:history="1">
             <w:r>
               <w:rPr>
                 <w:rStyle w:val="Hyperlink"/>
@@ -7112,7 +7302,7 @@
                 <w:noProof/>
                 <w:webHidden/>
               </w:rPr>
-              <w:instrText xml:space="preserve"> PAGEREF _Toc219898164 \h </w:instrText>
+              <w:instrText xml:space="preserve"> PAGEREF _Toc223262790 \h </w:instrText>
             </w:r>
             <w:r>
               <w:rPr>
@@ -7159,7 +7349,7 @@
               <w14:ligatures w14:val="standardContextual"/>
             </w:rPr>
           </w:pPr>
-          <w:hyperlink w:anchor="_Toc219898165" w:history="1">
+          <w:hyperlink w:anchor="_Toc223262791" w:history="1">
             <w:r>
               <w:rPr>
                 <w:rStyle w:val="Hyperlink"/>
@@ -7186,7 +7376,7 @@
                 <w:noProof/>
                 <w:webHidden/>
               </w:rPr>
-              <w:instrText xml:space="preserve"> PAGEREF _Toc219898165 \h </w:instrText>
+              <w:instrText xml:space="preserve"> PAGEREF _Toc223262791 \h </w:instrText>
             </w:r>
             <w:r>
               <w:rPr>
@@ -7233,7 +7423,7 @@
               <w14:ligatures w14:val="standardContextual"/>
             </w:rPr>
           </w:pPr>
-          <w:hyperlink w:anchor="_Toc219898166" w:history="1">
+          <w:hyperlink w:anchor="_Toc223262792" w:history="1">
             <w:r>
               <w:rPr>
                 <w:rStyle w:val="Hyperlink"/>
@@ -7260,7 +7450,7 @@
                 <w:noProof/>
                 <w:webHidden/>
               </w:rPr>
-              <w:instrText xml:space="preserve"> PAGEREF _Toc219898166 \h </w:instrText>
+              <w:instrText xml:space="preserve"> PAGEREF _Toc223262792 \h </w:instrText>
             </w:r>
             <w:r>
               <w:rPr>
@@ -7307,7 +7497,7 @@
               <w14:ligatures w14:val="standardContextual"/>
             </w:rPr>
           </w:pPr>
-          <w:hyperlink w:anchor="_Toc219898167" w:history="1">
+          <w:hyperlink w:anchor="_Toc223262793" w:history="1">
             <w:r>
               <w:rPr>
                 <w:rStyle w:val="Hyperlink"/>
@@ -7368,7 +7558,7 @@
                 <w:noProof/>
                 <w:webHidden/>
               </w:rPr>
-              <w:instrText xml:space="preserve"> PAGEREF _Toc219898167 \h </w:instrText>
+              <w:instrText xml:space="preserve"> PAGEREF _Toc223262793 \h </w:instrText>
             </w:r>
             <w:r>
               <w:rPr>
@@ -7415,7 +7605,7 @@
               <w14:ligatures w14:val="standardContextual"/>
             </w:rPr>
           </w:pPr>
-          <w:hyperlink w:anchor="_Toc219898168" w:history="1">
+          <w:hyperlink w:anchor="_Toc223262794" w:history="1">
             <w:r>
               <w:rPr>
                 <w:rStyle w:val="Hyperlink"/>
@@ -7476,7 +7666,7 @@
                 <w:noProof/>
                 <w:webHidden/>
               </w:rPr>
-              <w:instrText xml:space="preserve"> PAGEREF _Toc219898168 \h </w:instrText>
+              <w:instrText xml:space="preserve"> PAGEREF _Toc223262794 \h </w:instrText>
             </w:r>
             <w:r>
               <w:rPr>
@@ -7674,7 +7864,7 @@
         <w:pStyle w:val="1"/>
       </w:pPr>
       <w:bookmarkStart w:id="2" w:name="_Toc200903256"/>
-      <w:bookmarkStart w:id="3" w:name="_Toc219898096"/>
+      <w:bookmarkStart w:id="3" w:name="_Toc223262721"/>
       <w:r>
         <w:rPr>
           <w:rtl/>
@@ -7935,7 +8125,7 @@
       <w:pPr>
         <w:pStyle w:val="2"/>
       </w:pPr>
-      <w:bookmarkStart w:id="4" w:name="_Toc219898097"/>
+      <w:bookmarkStart w:id="4" w:name="_Toc223262722"/>
       <w:r>
         <w:rPr>
           <w:rFonts w:hint="cs"/>
@@ -7959,6 +8149,11 @@
       <w:bookmarkEnd w:id="4"/>
     </w:p>
     <w:p>
+      <w:pPr>
+        <w:rPr>
+          <w:rtl/>
+        </w:rPr>
+      </w:pPr>
       <w:r>
         <w:rPr>
           <w:rFonts w:hint="cs"/>
@@ -7984,30 +8179,200 @@
         <w:t>, על מנת לראות אילו תוכנות\תוספים חסרים לכם במחשב לפני שאתם מתחילים את ההכשרה.</w:t>
       </w:r>
     </w:p>
+    <w:p>
+      <w:pPr>
+        <w:rPr>
+          <w:rtl/>
+        </w:rPr>
+      </w:pPr>
+      <w:r>
+        <w:rPr>
+          <w:rFonts w:hint="cs"/>
+          <w:rtl/>
+        </w:rPr>
+        <w:t xml:space="preserve">ובשביל ליצור ענפים כמו שצריך בלי לדפוק את ה </w:t>
+      </w:r>
+      <w:r>
+        <w:t>repo</w:t>
+      </w:r>
+      <w:r>
+        <w:rPr>
+          <w:rFonts w:hint="cs"/>
+          <w:rtl/>
+        </w:rPr>
+        <w:t xml:space="preserve">, גשו לשלב </w:t>
+      </w:r>
+      <w:hyperlink w:anchor="_GitHub" w:history="1">
+        <w:proofErr w:type="spellStart"/>
+        <w:r>
+          <w:rPr>
+            <w:rStyle w:val="Hyperlink"/>
+          </w:rPr>
+          <w:t>github</w:t>
+        </w:r>
+        <w:proofErr w:type="spellEnd"/>
+      </w:hyperlink>
+    </w:p>
+    <w:p>
+      <w:pPr>
+        <w:rPr>
+          <w:rtl/>
+        </w:rPr>
+      </w:pPr>
+      <w:r>
+        <w:rPr>
+          <w:rFonts w:hint="cs"/>
+          <w:rtl/>
+        </w:rPr>
+        <w:t>ולאחר מכן, אם סיימתם את השלבים האלו ואתם מרגישים מנוסים ב:</w:t>
+      </w:r>
+    </w:p>
+    <w:p>
+      <w:pPr>
+        <w:pStyle w:val="a4"/>
+        <w:numPr>
+          <w:ilvl w:val="0"/>
+          <w:numId w:val="33"/>
+        </w:numPr>
+      </w:pPr>
+      <w:hyperlink w:anchor="_Git" w:history="1">
+        <w:r>
+          <w:rPr>
+            <w:rStyle w:val="Hyperlink"/>
+          </w:rPr>
+          <w:t>Git</w:t>
+        </w:r>
+      </w:hyperlink>
+    </w:p>
+    <w:p>
+      <w:pPr>
+        <w:pStyle w:val="a4"/>
+        <w:numPr>
+          <w:ilvl w:val="0"/>
+          <w:numId w:val="33"/>
+        </w:numPr>
+      </w:pPr>
+      <w:hyperlink w:anchor="_שפת_typescript" w:history="1">
+        <w:r>
+          <w:rPr>
+            <w:rStyle w:val="Hyperlink"/>
+          </w:rPr>
+          <w:t>TypeScript</w:t>
+        </w:r>
+      </w:hyperlink>
+    </w:p>
+    <w:p>
+      <w:pPr>
+        <w:pStyle w:val="a4"/>
+        <w:numPr>
+          <w:ilvl w:val="0"/>
+          <w:numId w:val="33"/>
+        </w:numPr>
+      </w:pPr>
+      <w:hyperlink w:anchor="_אלמנטים_באתר_האינטרנט" w:history="1">
+        <w:r>
+          <w:rPr>
+            <w:rStyle w:val="Hyperlink"/>
+            <w:rFonts w:hint="cs"/>
+            <w:rtl/>
+          </w:rPr>
+          <w:t>אלמנטים בדף האינטרנט</w:t>
+        </w:r>
+      </w:hyperlink>
+    </w:p>
+    <w:p>
+      <w:pPr>
+        <w:pStyle w:val="a4"/>
+        <w:numPr>
+          <w:ilvl w:val="0"/>
+          <w:numId w:val="33"/>
+        </w:numPr>
+      </w:pPr>
+      <w:hyperlink w:anchor="_Postman_ובקשות_API" w:history="1">
+        <w:r>
+          <w:rPr>
+            <w:rStyle w:val="Hyperlink"/>
+            <w:rFonts w:hint="cs"/>
+            <w:rtl/>
+          </w:rPr>
+          <w:t xml:space="preserve">שליחת בקשות </w:t>
+        </w:r>
+        <w:r>
+          <w:rPr>
+            <w:rStyle w:val="Hyperlink"/>
+          </w:rPr>
+          <w:t>API</w:t>
+        </w:r>
+        <w:r>
+          <w:rPr>
+            <w:rStyle w:val="Hyperlink"/>
+            <w:rFonts w:hint="cs"/>
+            <w:rtl/>
+          </w:rPr>
+          <w:t xml:space="preserve"> עם </w:t>
+        </w:r>
+        <w:r>
+          <w:rPr>
+            <w:rStyle w:val="Hyperlink"/>
+          </w:rPr>
+          <w:t>Postman</w:t>
+        </w:r>
+      </w:hyperlink>
+    </w:p>
+    <w:p>
+      <w:pPr>
+        <w:rPr>
+          <w:rtl/>
+        </w:rPr>
+      </w:pPr>
+      <w:r>
+        <w:rPr>
+          <w:rFonts w:hint="cs"/>
+          <w:rtl/>
+        </w:rPr>
+        <w:t xml:space="preserve">מוזמנים להגיע לשלב ה - </w:t>
+      </w:r>
+      <w:hyperlink w:anchor="_Playwright" w:history="1">
+        <w:r>
+          <w:rPr>
+            <w:rStyle w:val="Hyperlink"/>
+          </w:rPr>
+          <w:t>playwright</w:t>
+        </w:r>
+      </w:hyperlink>
+    </w:p>
+    <w:p>
+      <w:pPr>
+        <w:rPr>
+          <w:rFonts w:hint="cs"/>
+          <w:rtl/>
+        </w:rPr>
+      </w:pPr>
+    </w:p>
+    <w:p>
+      <w:pPr>
+        <w:rPr>
+          <w:rFonts w:hint="cs"/>
+          <w:rtl/>
+        </w:rPr>
+      </w:pPr>
+    </w:p>
     <w:p/>
     <w:p/>
+    <w:p>
+      <w:pPr>
+        <w:rPr>
+          <w:rtl/>
+        </w:rPr>
+      </w:pPr>
+    </w:p>
     <w:p/>
-    <w:p/>
-    <w:p/>
-    <w:p/>
-    <w:p/>
-    <w:p/>
-    <w:p/>
-    <w:p>
-      <w:pPr>
-        <w:rPr>
-          <w:rtl/>
-        </w:rPr>
-      </w:pPr>
-    </w:p>
-    <w:p/>
-    <w:p/>
     <w:p>
       <w:pPr>
         <w:pStyle w:val="1"/>
       </w:pPr>
       <w:bookmarkStart w:id="5" w:name="_לפני_שנתחיל"/>
-      <w:bookmarkStart w:id="6" w:name="_Toc219898098"/>
+      <w:bookmarkStart w:id="6" w:name="_Toc223262723"/>
       <w:bookmarkEnd w:id="5"/>
       <w:r>
         <w:rPr>
@@ -8032,7 +8397,7 @@
         <w:pStyle w:val="2"/>
       </w:pPr>
       <w:bookmarkStart w:id="7" w:name="_Toc200903259"/>
-      <w:bookmarkStart w:id="8" w:name="_Toc219898099"/>
+      <w:bookmarkStart w:id="8" w:name="_Toc223262724"/>
       <w:r>
         <w:t>Node.JS</w:t>
       </w:r>
@@ -8115,7 +8480,7 @@
         <w:pStyle w:val="2"/>
       </w:pPr>
       <w:bookmarkStart w:id="9" w:name="_Toc200903260"/>
-      <w:bookmarkStart w:id="10" w:name="_Toc219898100"/>
+      <w:bookmarkStart w:id="10" w:name="_Toc223262725"/>
       <w:r>
         <w:rPr>
           <w:rtl/>
@@ -8193,13 +8558,13 @@
       <w:pPr>
         <w:pStyle w:val="2"/>
       </w:pPr>
-      <w:bookmarkStart w:id="11" w:name="_Toc219898101"/>
-      <w:bookmarkStart w:id="12" w:name="_Toc200903258"/>
-      <w:bookmarkStart w:id="13" w:name="_Toc200903261"/>
+      <w:bookmarkStart w:id="11" w:name="_Toc200903258"/>
+      <w:bookmarkStart w:id="12" w:name="_Toc200903261"/>
+      <w:bookmarkStart w:id="13" w:name="_Toc223262726"/>
       <w:r>
         <w:t>Postman</w:t>
       </w:r>
-      <w:bookmarkEnd w:id="11"/>
+      <w:bookmarkEnd w:id="13"/>
     </w:p>
     <w:p>
       <w:pPr>
@@ -8289,7 +8654,7 @@
       <w:pPr>
         <w:pStyle w:val="2"/>
       </w:pPr>
-      <w:bookmarkStart w:id="14" w:name="_Toc219898102"/>
+      <w:bookmarkStart w:id="14" w:name="_Toc223262727"/>
       <w:r>
         <w:rPr>
           <w:rtl/>
@@ -8299,7 +8664,7 @@
       <w:r>
         <w:t>IDE</w:t>
       </w:r>
-      <w:bookmarkEnd w:id="12"/>
+      <w:bookmarkEnd w:id="11"/>
       <w:bookmarkEnd w:id="14"/>
     </w:p>
     <w:p>
@@ -8359,7 +8724,7 @@
       <w:pPr>
         <w:pStyle w:val="2"/>
       </w:pPr>
-      <w:bookmarkStart w:id="15" w:name="_Toc219898103"/>
+      <w:bookmarkStart w:id="15" w:name="_Toc223262728"/>
       <w:r>
         <w:rPr>
           <w:rFonts w:hint="cs"/>
@@ -8448,7 +8813,7 @@
         </w:drawing>
       </w:r>
     </w:p>
-    <w:bookmarkEnd w:id="13"/>
+    <w:bookmarkEnd w:id="12"/>
     <w:p>
       <w:pPr>
         <w:tabs>
@@ -8607,28 +8972,30 @@
         <w:pStyle w:val="1"/>
       </w:pPr>
       <w:bookmarkStart w:id="16" w:name="_Toc200903263"/>
-      <w:bookmarkStart w:id="17" w:name="_Toc219898104"/>
+      <w:bookmarkStart w:id="17" w:name="_Git"/>
+      <w:bookmarkStart w:id="18" w:name="_Toc223262729"/>
+      <w:bookmarkEnd w:id="17"/>
       <w:r>
         <w:lastRenderedPageBreak/>
         <w:t>Git</w:t>
       </w:r>
       <w:bookmarkEnd w:id="16"/>
-      <w:bookmarkEnd w:id="17"/>
+      <w:bookmarkEnd w:id="18"/>
     </w:p>
     <w:p>
       <w:pPr>
         <w:pStyle w:val="2"/>
       </w:pPr>
-      <w:bookmarkStart w:id="18" w:name="_Toc200903264"/>
-      <w:bookmarkStart w:id="19" w:name="_Toc219898105"/>
+      <w:bookmarkStart w:id="19" w:name="_Toc200903264"/>
+      <w:bookmarkStart w:id="20" w:name="_Toc223262730"/>
       <w:r>
         <w:rPr>
           <w:rtl/>
         </w:rPr>
         <w:t>מבוא</w:t>
       </w:r>
-      <w:bookmarkEnd w:id="18"/>
       <w:bookmarkEnd w:id="19"/>
+      <w:bookmarkEnd w:id="20"/>
     </w:p>
     <w:p>
       <w:r>
@@ -8708,16 +9075,16 @@
       <w:pPr>
         <w:pStyle w:val="2"/>
       </w:pPr>
-      <w:bookmarkStart w:id="20" w:name="_Toc200903265"/>
-      <w:bookmarkStart w:id="21" w:name="_Toc219898106"/>
+      <w:bookmarkStart w:id="21" w:name="_Toc200903265"/>
+      <w:bookmarkStart w:id="22" w:name="_Toc223262731"/>
       <w:r>
         <w:rPr>
           <w:rtl/>
         </w:rPr>
         <w:t>הכשרה</w:t>
       </w:r>
-      <w:bookmarkEnd w:id="20"/>
       <w:bookmarkEnd w:id="21"/>
+      <w:bookmarkEnd w:id="22"/>
     </w:p>
     <w:p>
       <w:pPr>
@@ -8822,135 +9189,137 @@
       <w:pPr>
         <w:pStyle w:val="1"/>
       </w:pPr>
-      <w:bookmarkStart w:id="22" w:name="_Toc200903266"/>
-      <w:bookmarkStart w:id="23" w:name="_Toc219898107"/>
+      <w:bookmarkStart w:id="23" w:name="_Toc200903266"/>
+      <w:bookmarkStart w:id="24" w:name="_GitHub"/>
+      <w:bookmarkStart w:id="25" w:name="_Toc223262732"/>
+      <w:bookmarkEnd w:id="24"/>
       <w:r>
         <w:lastRenderedPageBreak/>
         <w:t>GitHub</w:t>
       </w:r>
-      <w:bookmarkEnd w:id="22"/>
       <w:bookmarkEnd w:id="23"/>
+      <w:bookmarkEnd w:id="25"/>
     </w:p>
     <w:p>
       <w:pPr>
         <w:pStyle w:val="2"/>
       </w:pPr>
-      <w:bookmarkStart w:id="24" w:name="_Toc200903267"/>
-      <w:bookmarkStart w:id="25" w:name="_Toc219898108"/>
+      <w:bookmarkStart w:id="26" w:name="_Toc200903267"/>
+      <w:bookmarkStart w:id="27" w:name="_Toc223262733"/>
       <w:r>
         <w:rPr>
           <w:rtl/>
         </w:rPr>
         <w:t>מבוא</w:t>
-      </w:r>
-      <w:bookmarkEnd w:id="24"/>
-      <w:bookmarkEnd w:id="25"/>
-    </w:p>
-    <w:p>
-      <w:r>
-        <w:rPr>
-          <w:rtl/>
-        </w:rPr>
-        <w:t>בסופו של דבר, אנו נצטרך לעבוד בצוות, ועבודה בצוות, חוץ משיתוף פעולה, דורשת שיתוף של הקוד שלנו עם כל הצוות.</w:t>
-      </w:r>
-    </w:p>
-    <w:p>
-      <w:r>
-        <w:rPr>
-          <w:rtl/>
-        </w:rPr>
-        <w:t>בשביל זה, נועדו שרתים מרוחקים, שנועדו לשמור את הקוד שלנו במקום בטוח</w:t>
-      </w:r>
-    </w:p>
-    <w:p>
-      <w:r>
-        <w:rPr>
-          <w:rtl/>
-        </w:rPr>
-        <w:t xml:space="preserve">ובשביל זה, נועד גם </w:t>
-      </w:r>
-      <w:proofErr w:type="spellStart"/>
-      <w:r>
-        <w:rPr>
-          <w:rtl/>
-        </w:rPr>
-        <w:t>הגיט</w:t>
-      </w:r>
-      <w:proofErr w:type="spellEnd"/>
-      <w:r>
-        <w:rPr>
-          <w:rtl/>
-        </w:rPr>
-        <w:t>.</w:t>
-      </w:r>
-    </w:p>
-    <w:p>
-      <w:r>
-        <w:rPr>
-          <w:rtl/>
-        </w:rPr>
-        <w:t xml:space="preserve">כל הפקודות שלמדתם עכשיו </w:t>
-      </w:r>
-      <w:proofErr w:type="spellStart"/>
-      <w:r>
-        <w:rPr>
-          <w:rtl/>
-        </w:rPr>
-        <w:t>בגיט</w:t>
-      </w:r>
-      <w:proofErr w:type="spellEnd"/>
-      <w:r>
-        <w:rPr>
-          <w:rtl/>
-        </w:rPr>
-        <w:t xml:space="preserve"> נועדו ללמד אתכם איך לשתף את הקוד, ואיך להתנהל נכון עם קוד.</w:t>
-      </w:r>
-    </w:p>
-    <w:p>
-      <w:r>
-        <w:rPr>
-          <w:rtl/>
-        </w:rPr>
-        <w:t xml:space="preserve">כרגע, אנו נשתמש באתר הנקרא </w:t>
-      </w:r>
-      <w:r>
-        <w:t>GitHub</w:t>
-      </w:r>
-      <w:r>
-        <w:rPr>
-          <w:rtl/>
-        </w:rPr>
-        <w:t>, שהוא אחד מיני רבים לשמירת ותיעוד קוד נכון.</w:t>
-      </w:r>
-    </w:p>
-    <w:p>
-      <w:r>
-        <w:rPr>
-          <w:rtl/>
-        </w:rPr>
-        <w:t xml:space="preserve">אז בואו נתחיל </w:t>
-      </w:r>
-      <w:r>
-        <w:rPr>
-          <w:rFonts w:ascii="Quattrocento Sans" w:eastAsia="Quattrocento Sans" w:hAnsi="Quattrocento Sans" w:cs="Quattrocento Sans"/>
-        </w:rPr>
-        <w:t>😊</w:t>
-      </w:r>
-    </w:p>
-    <w:p>
-      <w:pPr>
-        <w:pStyle w:val="2"/>
-      </w:pPr>
-      <w:bookmarkStart w:id="26" w:name="_Toc200903268"/>
-      <w:bookmarkStart w:id="27" w:name="_Toc219898109"/>
-      <w:r>
-        <w:rPr>
-          <w:rtl/>
-        </w:rPr>
-        <w:t>הכנת סביבת העבודה</w:t>
       </w:r>
       <w:bookmarkEnd w:id="26"/>
       <w:bookmarkEnd w:id="27"/>
+    </w:p>
+    <w:p>
+      <w:r>
+        <w:rPr>
+          <w:rtl/>
+        </w:rPr>
+        <w:t>בסופו של דבר, אנו נצטרך לעבוד בצוות, ועבודה בצוות, חוץ משיתוף פעולה, דורשת שיתוף של הקוד שלנו עם כל הצוות.</w:t>
+      </w:r>
+    </w:p>
+    <w:p>
+      <w:r>
+        <w:rPr>
+          <w:rtl/>
+        </w:rPr>
+        <w:t>בשביל זה, נועדו שרתים מרוחקים, שנועדו לשמור את הקוד שלנו במקום בטוח</w:t>
+      </w:r>
+    </w:p>
+    <w:p>
+      <w:r>
+        <w:rPr>
+          <w:rtl/>
+        </w:rPr>
+        <w:t xml:space="preserve">ובשביל זה, נועד גם </w:t>
+      </w:r>
+      <w:proofErr w:type="spellStart"/>
+      <w:r>
+        <w:rPr>
+          <w:rtl/>
+        </w:rPr>
+        <w:t>הגיט</w:t>
+      </w:r>
+      <w:proofErr w:type="spellEnd"/>
+      <w:r>
+        <w:rPr>
+          <w:rtl/>
+        </w:rPr>
+        <w:t>.</w:t>
+      </w:r>
+    </w:p>
+    <w:p>
+      <w:r>
+        <w:rPr>
+          <w:rtl/>
+        </w:rPr>
+        <w:t xml:space="preserve">כל הפקודות שלמדתם עכשיו </w:t>
+      </w:r>
+      <w:proofErr w:type="spellStart"/>
+      <w:r>
+        <w:rPr>
+          <w:rtl/>
+        </w:rPr>
+        <w:t>בגיט</w:t>
+      </w:r>
+      <w:proofErr w:type="spellEnd"/>
+      <w:r>
+        <w:rPr>
+          <w:rtl/>
+        </w:rPr>
+        <w:t xml:space="preserve"> נועדו ללמד אתכם איך לשתף את הקוד, ואיך להתנהל נכון עם קוד.</w:t>
+      </w:r>
+    </w:p>
+    <w:p>
+      <w:r>
+        <w:rPr>
+          <w:rtl/>
+        </w:rPr>
+        <w:t xml:space="preserve">כרגע, אנו נשתמש באתר הנקרא </w:t>
+      </w:r>
+      <w:r>
+        <w:t>GitHub</w:t>
+      </w:r>
+      <w:r>
+        <w:rPr>
+          <w:rtl/>
+        </w:rPr>
+        <w:t>, שהוא אחד מיני רבים לשמירת ותיעוד קוד נכון.</w:t>
+      </w:r>
+    </w:p>
+    <w:p>
+      <w:r>
+        <w:rPr>
+          <w:rtl/>
+        </w:rPr>
+        <w:t xml:space="preserve">אז בואו נתחיל </w:t>
+      </w:r>
+      <w:r>
+        <w:rPr>
+          <w:rFonts w:ascii="Quattrocento Sans" w:eastAsia="Quattrocento Sans" w:hAnsi="Quattrocento Sans" w:cs="Quattrocento Sans"/>
+        </w:rPr>
+        <w:t>😊</w:t>
+      </w:r>
+    </w:p>
+    <w:p>
+      <w:pPr>
+        <w:pStyle w:val="2"/>
+      </w:pPr>
+      <w:bookmarkStart w:id="28" w:name="_Toc200903268"/>
+      <w:bookmarkStart w:id="29" w:name="_Toc223262734"/>
+      <w:r>
+        <w:rPr>
+          <w:rtl/>
+        </w:rPr>
+        <w:t>הכנת סביבת העבודה</w:t>
+      </w:r>
+      <w:bookmarkEnd w:id="28"/>
+      <w:bookmarkEnd w:id="29"/>
     </w:p>
     <w:p>
       <w:pPr>
@@ -9000,237 +9369,42 @@
       </w:r>
     </w:p>
     <w:p>
-      <w:r>
-        <w:rPr>
-          <w:rtl/>
-        </w:rPr>
-        <w:t xml:space="preserve">על שולחן העבודה שלכם, פתחו </w:t>
-      </w:r>
-      <w:r>
-        <w:t>git bash</w:t>
-      </w:r>
-      <w:r>
-        <w:rPr>
-          <w:rtl/>
-        </w:rPr>
-        <w:t>, והקלידו את הפקודה הבאה, עם הקישור הבא:</w:t>
-      </w:r>
-    </w:p>
-    <w:p>
-      <w:pPr>
-        <w:shd w:val="clear" w:color="auto" w:fill="000000" w:themeFill="text1"/>
-        <w:bidi w:val="0"/>
-        <w:rPr>
-          <w:rtl/>
-        </w:rPr>
-      </w:pPr>
-      <w:r>
-        <w:t xml:space="preserve">git clone </w:t>
-      </w:r>
-      <w:r>
-        <w:t>https://github.com/robin8360/General-QA-Training.git</w:t>
-      </w:r>
-    </w:p>
-    <w:p>
-      <w:pPr>
-        <w:rPr>
-          <w:rtl/>
-        </w:rPr>
-      </w:pPr>
-      <w:r>
-        <w:rPr>
-          <w:rtl/>
-        </w:rPr>
-        <w:t xml:space="preserve">זה יעתיק את הפרויקט </w:t>
-      </w:r>
-      <w:r>
-        <w:t>General-QA-Training</w:t>
-      </w:r>
-      <w:r>
-        <w:rPr>
+      <w:pPr>
+        <w:rPr>
+          <w:rFonts w:hint="cs"/>
+          <w:rtl/>
+        </w:rPr>
+      </w:pPr>
+      <w:r>
+        <w:rPr>
+          <w:rFonts w:hint="cs"/>
+          <w:rtl/>
+        </w:rPr>
+        <w:t xml:space="preserve">בצעו </w:t>
+      </w:r>
+      <w:r>
+        <w:t>clone</w:t>
+      </w:r>
+      <w:r>
+        <w:rPr>
+          <w:rFonts w:hint="cs"/>
+          <w:rtl/>
+        </w:rPr>
+        <w:t xml:space="preserve"> לפרויקט שנמצא בו הקובץ הזה (מן הסתם שכבר עשיתם את זה, או שהורדתם את הקובץ</w:t>
+      </w:r>
+      <w:r>
+        <w:rPr>
+          <w:rFonts w:hint="cs"/>
+          <w:rtl/>
+        </w:rPr>
+        <w:t xml:space="preserve"> ישירות למחשב</w:t>
+      </w:r>
+      <w:r>
+        <w:rPr>
+          <w:rFonts w:hint="cs"/>
           <w:rtl/>
         </w:rPr>
         <w:t xml:space="preserve"> </w:t>
-      </w:r>
-      <w:r>
-        <w:rPr>
-          <w:rtl/>
-        </w:rPr>
-        <w:t>למחשב</w:t>
-      </w:r>
-      <w:r>
-        <w:rPr>
-          <w:rFonts w:hint="cs"/>
-          <w:rtl/>
-        </w:rPr>
-        <w:t xml:space="preserve"> </w:t>
-      </w:r>
-      <w:r>
-        <w:rPr>
-          <w:rtl/>
-        </w:rPr>
-        <w:t>שלכם, בתוך תיקייה שתקרא</w:t>
-      </w:r>
-      <w:r>
-        <w:rPr>
-          <w:rFonts w:hint="cs"/>
-          <w:rtl/>
-        </w:rPr>
-        <w:t xml:space="preserve"> באותו השם של הפרויקט</w:t>
-      </w:r>
-      <w:r>
-        <w:rPr>
-          <w:rtl/>
-        </w:rPr>
-        <w:t>.</w:t>
-      </w:r>
-    </w:p>
-    <w:p>
-      <w:r>
-        <w:rPr>
-          <w:rtl/>
-        </w:rPr>
-        <w:t xml:space="preserve">אם אין לכם הרשאות ל </w:t>
-      </w:r>
-      <w:r>
-        <w:t>repository</w:t>
-      </w:r>
-      <w:r>
-        <w:rPr>
-          <w:rtl/>
-        </w:rPr>
-        <w:t xml:space="preserve"> הזה, גשו לחופף שלכם שיעניק לכם הרשאות.</w:t>
-      </w:r>
-    </w:p>
-    <w:p>
-      <w:r>
-        <w:rPr>
-          <w:rtl/>
-        </w:rPr>
-        <w:t>לאחר מכן, אתם מוכנים להתחיל לעבוד כמו מקצועניים.</w:t>
-      </w:r>
-    </w:p>
-    <w:p>
-      <w:r>
-        <w:rPr>
-          <w:rtl/>
-        </w:rPr>
-        <w:t>אז מה עושים?</w:t>
-      </w:r>
-    </w:p>
-    <w:p>
-      <w:r>
-        <w:rPr>
-          <w:highlight w:val="yellow"/>
-          <w:rtl/>
-        </w:rPr>
-        <w:t>על כל תרגיל שאתם עובדים מהיום והלאה, אתם יוצרים ענף חדש</w:t>
-      </w:r>
-    </w:p>
-    <w:p>
-      <w:r>
-        <w:rPr>
-          <w:rtl/>
-        </w:rPr>
-        <w:t xml:space="preserve">עם הפקודה המוכרת שלמדתם מההכשרה של </w:t>
-      </w:r>
-      <w:proofErr w:type="spellStart"/>
-      <w:r>
-        <w:rPr>
-          <w:rtl/>
-        </w:rPr>
-        <w:t>גיט</w:t>
-      </w:r>
-      <w:proofErr w:type="spellEnd"/>
-      <w:r>
-        <w:rPr>
-          <w:rtl/>
-        </w:rPr>
-        <w:t>:</w:t>
-      </w:r>
-    </w:p>
-    <w:p>
-      <w:pPr>
-        <w:shd w:val="clear" w:color="auto" w:fill="000000" w:themeFill="text1"/>
-        <w:bidi w:val="0"/>
-        <w:rPr>
-          <w:rtl/>
-        </w:rPr>
-      </w:pPr>
-      <w:r>
-        <w:t>git branch &lt;branch-name&gt;</w:t>
-      </w:r>
-    </w:p>
-    <w:p>
-      <w:r>
-        <w:rPr>
-          <w:rtl/>
-        </w:rPr>
-        <w:t>או (במידה ואתם רוצים לפנות לענף זה ישירות):</w:t>
-      </w:r>
-    </w:p>
-    <w:p>
-      <w:pPr>
-        <w:shd w:val="clear" w:color="auto" w:fill="000000" w:themeFill="text1"/>
-        <w:bidi w:val="0"/>
-      </w:pPr>
-      <w:bookmarkStart w:id="28" w:name="_heading=h.1y810tw" w:colFirst="0" w:colLast="0"/>
-      <w:bookmarkEnd w:id="28"/>
-      <w:r>
-        <w:t>git checkout -b &lt;branch-name&gt;</w:t>
-      </w:r>
-    </w:p>
-    <w:p>
-      <w:r>
-        <w:rPr>
-          <w:rtl/>
-        </w:rPr>
-        <w:t>לאחר מכן, אתם עובדים על התיקייה כרגיל.</w:t>
-      </w:r>
-    </w:p>
-    <w:p>
-      <w:r>
-        <w:rPr>
-          <w:rtl/>
-        </w:rPr>
-        <w:t xml:space="preserve">במידה ועשיתם המון שינויים, אתם מתחילים ליצור </w:t>
-      </w:r>
-      <w:proofErr w:type="spellStart"/>
-      <w:r>
-        <w:rPr>
-          <w:rtl/>
-        </w:rPr>
-        <w:t>קומיטים</w:t>
-      </w:r>
-      <w:proofErr w:type="spellEnd"/>
-      <w:r>
-        <w:rPr>
-          <w:rtl/>
-        </w:rPr>
-        <w:t xml:space="preserve">, כל </w:t>
-      </w:r>
-      <w:proofErr w:type="spellStart"/>
-      <w:r>
-        <w:rPr>
-          <w:rtl/>
-        </w:rPr>
-        <w:t>קומיט</w:t>
-      </w:r>
-      <w:proofErr w:type="spellEnd"/>
-      <w:r>
-        <w:rPr>
-          <w:rtl/>
-        </w:rPr>
-        <w:t xml:space="preserve"> מסביר מה כתבתם עד עכשיו בקוד.</w:t>
-      </w:r>
-    </w:p>
-    <w:p>
-      <w:r>
-        <w:rPr>
-          <w:u w:val="single"/>
-          <w:rtl/>
-        </w:rPr>
-        <w:t xml:space="preserve">שימו </w:t>
       </w:r>
       <w:r>
         <w:rPr>
@@ -9246,6 +9420,473 @@
         </w:rPr>
         <mc:AlternateContent>
           <mc:Choice Requires="w16se">
+            <w16se:symEx w16se:font="Segoe UI Emoji" w16se:char="1F631"/>
+          </mc:Choice>
+          <mc:Fallback>
+            <w:t>😱</w:t>
+          </mc:Fallback>
+        </mc:AlternateContent>
+      </w:r>
+      <w:r>
+        <w:rPr>
+          <w:rFonts w:hint="cs"/>
+          <w:rtl/>
+        </w:rPr>
+        <w:t xml:space="preserve"> מה שאומר שלא ביצעתם את הכשרת </w:t>
+      </w:r>
+      <w:r>
+        <w:t>git</w:t>
+      </w:r>
+      <w:r>
+        <w:rPr>
+          <w:rFonts w:hint="cs"/>
+          <w:rtl/>
+        </w:rPr>
+        <w:t>!!!)</w:t>
+      </w:r>
+    </w:p>
+    <w:p>
+      <w:r>
+        <w:rPr>
+          <w:rtl/>
+        </w:rPr>
+        <w:t xml:space="preserve">אם אין לכם הרשאות ל </w:t>
+      </w:r>
+      <w:r>
+        <w:t>repository</w:t>
+      </w:r>
+      <w:r>
+        <w:rPr>
+          <w:rtl/>
+        </w:rPr>
+        <w:t xml:space="preserve"> הזה, גשו לחופף שלכם שיעניק לכם הרשאות</w:t>
+      </w:r>
+      <w:r>
+        <w:rPr>
+          <w:rFonts w:hint="cs"/>
+          <w:rtl/>
+        </w:rPr>
+        <w:t xml:space="preserve"> (שלחו לו את המייל שמקושר ל </w:t>
+      </w:r>
+      <w:proofErr w:type="spellStart"/>
+      <w:r>
+        <w:t>github</w:t>
+      </w:r>
+      <w:proofErr w:type="spellEnd"/>
+      <w:r>
+        <w:rPr>
+          <w:rFonts w:hint="cs"/>
+          <w:rtl/>
+        </w:rPr>
+        <w:t>)</w:t>
+      </w:r>
+    </w:p>
+    <w:p>
+      <w:r>
+        <w:rPr>
+          <w:rtl/>
+        </w:rPr>
+        <w:t>לאחר מכן, אתם מוכנים להתחיל לעבוד כמו מקצועניים.</w:t>
+      </w:r>
+    </w:p>
+    <w:p>
+      <w:r>
+        <w:rPr>
+          <w:rtl/>
+        </w:rPr>
+        <w:t>אז מה עושים?</w:t>
+      </w:r>
+    </w:p>
+    <w:p>
+      <w:pPr>
+        <w:rPr>
+          <w:rtl/>
+        </w:rPr>
+      </w:pPr>
+      <w:r>
+        <w:rPr>
+          <w:highlight w:val="yellow"/>
+          <w:rtl/>
+        </w:rPr>
+        <w:t>על כל תרגיל שאתם עובדים מהיום והלאה, אתם יוצרים ענף חדש</w:t>
+      </w:r>
+    </w:p>
+    <w:p>
+      <w:pPr>
+        <w:rPr>
+          <w:rFonts w:hint="cs"/>
+          <w:rtl/>
+        </w:rPr>
+      </w:pPr>
+      <w:r>
+        <w:rPr>
+          <w:rFonts w:hint="cs"/>
+          <w:rtl/>
+        </w:rPr>
+        <w:t xml:space="preserve">וכאן אנו נפתח כותרת מגניבה ומטורפת, למתן דגשים עבור יצירת ענפים ב </w:t>
+      </w:r>
+      <w:r>
+        <w:t>repo</w:t>
+      </w:r>
+      <w:r>
+        <w:rPr>
+          <w:rFonts w:hint="cs"/>
+          <w:rtl/>
+        </w:rPr>
+        <w:t xml:space="preserve"> של ההכשרה</w:t>
+      </w:r>
+      <w:r>
+        <w:rPr>
+          <w:rFonts w:hint="cs"/>
+          <w:rtl/>
+        </w:rPr>
+        <w:t xml:space="preserve"> </w:t>
+      </w:r>
+      <w:r>
+        <w:rPr>
+          <mc:AlternateContent>
+            <mc:Choice Requires="w16se">
+              <w:rFonts w:hint="cs"/>
+            </mc:Choice>
+            <mc:Fallback>
+              <w:rFonts w:ascii="Segoe UI Emoji" w:eastAsia="Segoe UI Emoji" w:hAnsi="Segoe UI Emoji" w:cs="Segoe UI Emoji"/>
+            </mc:Fallback>
+          </mc:AlternateContent>
+          <w:rtl/>
+        </w:rPr>
+        <mc:AlternateContent>
+          <mc:Choice Requires="w16se">
+            <w16se:symEx w16se:font="Segoe UI Emoji" w16se:char="1F60E"/>
+          </mc:Choice>
+          <mc:Fallback>
+            <w:t>😎</w:t>
+          </mc:Fallback>
+        </mc:AlternateContent>
+      </w:r>
+    </w:p>
+    <w:p>
+      <w:pPr>
+        <w:pStyle w:val="3"/>
+        <w:rPr>
+          <w:rFonts w:hint="cs"/>
+          <w:rtl/>
+        </w:rPr>
+      </w:pPr>
+      <w:bookmarkStart w:id="30" w:name="_Toc223262735"/>
+      <w:r>
+        <w:rPr>
+          <w:rFonts w:hint="cs"/>
+          <w:rtl/>
+        </w:rPr>
+        <w:t xml:space="preserve">דגשים ליצירת ענפים ב </w:t>
+      </w:r>
+      <w:r>
+        <w:t>repo</w:t>
+      </w:r>
+      <w:r>
+        <w:rPr>
+          <w:rFonts w:hint="cs"/>
+          <w:rtl/>
+        </w:rPr>
+        <w:t xml:space="preserve"> של הכשרת הבדיקות</w:t>
+      </w:r>
+      <w:bookmarkEnd w:id="30"/>
+    </w:p>
+    <w:p>
+      <w:pPr>
+        <w:rPr>
+          <w:rFonts w:hint="cs"/>
+          <w:rtl/>
+        </w:rPr>
+      </w:pPr>
+      <w:r>
+        <w:rPr>
+          <w:rFonts w:hint="cs"/>
+          <w:rtl/>
+        </w:rPr>
+        <w:t xml:space="preserve">כאן ניתן דגשים </w:t>
+      </w:r>
+      <w:proofErr w:type="spellStart"/>
+      <w:r>
+        <w:rPr>
+          <w:rFonts w:hint="cs"/>
+          <w:rtl/>
+        </w:rPr>
+        <w:t>לאיך</w:t>
+      </w:r>
+      <w:proofErr w:type="spellEnd"/>
+      <w:r>
+        <w:rPr>
+          <w:rFonts w:hint="cs"/>
+          <w:rtl/>
+        </w:rPr>
+        <w:t xml:space="preserve"> ל</w:t>
+      </w:r>
+      <w:r>
+        <w:rPr>
+          <w:rFonts w:hint="cs"/>
+          <w:rtl/>
+        </w:rPr>
+        <w:t>עבוד</w:t>
+      </w:r>
+      <w:r>
+        <w:rPr>
+          <w:rFonts w:hint="cs"/>
+          <w:rtl/>
+        </w:rPr>
+        <w:t xml:space="preserve"> עם ה </w:t>
+      </w:r>
+      <w:r>
+        <w:t>repo</w:t>
+      </w:r>
+      <w:r>
+        <w:rPr>
+          <w:rFonts w:hint="cs"/>
+          <w:rtl/>
+        </w:rPr>
+        <w:t xml:space="preserve"> של הכשרת הבדיקות</w:t>
+      </w:r>
+    </w:p>
+    <w:p>
+      <w:pPr>
+        <w:rPr>
+          <w:rtl/>
+        </w:rPr>
+      </w:pPr>
+      <w:r>
+        <w:rPr>
+          <w:rFonts w:hint="cs"/>
+          <w:rtl/>
+        </w:rPr>
+        <w:t xml:space="preserve">אז... </w:t>
+      </w:r>
+      <w:r>
+        <w:rPr>
+          <w:rFonts w:hint="cs"/>
+          <w:rtl/>
+        </w:rPr>
+        <w:t>איך אתם יוצרים את הענף?</w:t>
+      </w:r>
+    </w:p>
+    <w:p>
+      <w:r>
+        <w:rPr>
+          <w:rFonts w:hint="cs"/>
+          <w:rtl/>
+        </w:rPr>
+        <w:t xml:space="preserve">אתם הולכים ליצור את הענף הבא, ישירות מעל ה - </w:t>
+      </w:r>
+      <w:r>
+        <w:t>main</w:t>
+      </w:r>
+    </w:p>
+    <w:p>
+      <w:r>
+        <w:rPr>
+          <w:rtl/>
+        </w:rPr>
+        <w:t xml:space="preserve">עם הפקודה המוכרת שלמדתם מההכשרה של </w:t>
+      </w:r>
+      <w:proofErr w:type="spellStart"/>
+      <w:r>
+        <w:rPr>
+          <w:rtl/>
+        </w:rPr>
+        <w:t>גיט</w:t>
+      </w:r>
+      <w:proofErr w:type="spellEnd"/>
+      <w:r>
+        <w:rPr>
+          <w:rtl/>
+        </w:rPr>
+        <w:t>:</w:t>
+      </w:r>
+    </w:p>
+    <w:p>
+      <w:pPr>
+        <w:shd w:val="clear" w:color="auto" w:fill="000000" w:themeFill="text1"/>
+        <w:bidi w:val="0"/>
+        <w:rPr>
+          <w:rtl/>
+        </w:rPr>
+      </w:pPr>
+      <w:r>
+        <w:t xml:space="preserve">git branch </w:t>
+      </w:r>
+      <w:r>
+        <w:t>dev-</w:t>
+      </w:r>
+      <w:r>
+        <w:t>&lt;</w:t>
+      </w:r>
+      <w:r>
+        <w:t>your-full-name</w:t>
+      </w:r>
+      <w:r>
+        <w:t>&gt;</w:t>
+      </w:r>
+    </w:p>
+    <w:p>
+      <w:r>
+        <w:rPr>
+          <w:rtl/>
+        </w:rPr>
+        <w:t>או (במידה ואתם רוצים לפנות לענף זה ישירות):</w:t>
+      </w:r>
+    </w:p>
+    <w:p>
+      <w:pPr>
+        <w:shd w:val="clear" w:color="auto" w:fill="000000" w:themeFill="text1"/>
+        <w:bidi w:val="0"/>
+      </w:pPr>
+      <w:bookmarkStart w:id="31" w:name="_heading=h.1y810tw" w:colFirst="0" w:colLast="0"/>
+      <w:bookmarkEnd w:id="31"/>
+      <w:r>
+        <w:t xml:space="preserve">git checkout -b </w:t>
+      </w:r>
+      <w:r>
+        <w:t>dev-&lt;your-name&gt;</w:t>
+      </w:r>
+    </w:p>
+    <w:p>
+      <w:pPr>
+        <w:rPr>
+          <w:rtl/>
+        </w:rPr>
+      </w:pPr>
+      <w:r>
+        <w:rPr>
+          <w:rtl/>
+        </w:rPr>
+        <w:t xml:space="preserve">לאחר מכן, </w:t>
+      </w:r>
+      <w:r>
+        <w:rPr>
+          <w:rFonts w:hint="cs"/>
+          <w:b/>
+          <w:bCs/>
+          <w:highlight w:val="yellow"/>
+          <w:rtl/>
+        </w:rPr>
+        <w:t xml:space="preserve">אתם יוצרים את הענפים שלכם מעל הענף </w:t>
+      </w:r>
+      <w:r>
+        <w:rPr>
+          <w:b/>
+          <w:bCs/>
+          <w:highlight w:val="yellow"/>
+        </w:rPr>
+        <w:t>dev</w:t>
+      </w:r>
+      <w:r>
+        <w:rPr>
+          <w:rFonts w:hint="cs"/>
+          <w:b/>
+          <w:bCs/>
+          <w:highlight w:val="yellow"/>
+          <w:rtl/>
+        </w:rPr>
+        <w:t xml:space="preserve"> הזה</w:t>
+      </w:r>
+      <w:r>
+        <w:rPr>
+          <w:rFonts w:hint="cs"/>
+          <w:rtl/>
+        </w:rPr>
+        <w:t>, בתוספת השינויים שלכם</w:t>
+      </w:r>
+    </w:p>
+    <w:p>
+      <w:pPr>
+        <w:rPr>
+          <w:rtl/>
+        </w:rPr>
+      </w:pPr>
+      <w:r>
+        <w:rPr>
+          <w:rFonts w:hint="cs"/>
+          <w:rtl/>
+        </w:rPr>
+        <w:lastRenderedPageBreak/>
+        <w:t xml:space="preserve">כלומר, ה - </w:t>
+      </w:r>
+      <w:r>
+        <w:t>dev</w:t>
+      </w:r>
+      <w:r>
+        <w:rPr>
+          <w:rFonts w:hint="cs"/>
+          <w:rtl/>
+        </w:rPr>
+        <w:t xml:space="preserve"> נשאר סטטי ללא שינויים, והענפים האחרים שאתם יוצרים עם שינויים.</w:t>
+      </w:r>
+    </w:p>
+    <w:p>
+      <w:pPr>
+        <w:rPr>
+          <w:rFonts w:hint="cs"/>
+          <w:rtl/>
+        </w:rPr>
+      </w:pPr>
+    </w:p>
+    <w:p>
+      <w:r>
+        <w:rPr>
+          <w:rtl/>
+        </w:rPr>
+        <w:t xml:space="preserve">במידה ועשיתם המון שינויים, אתם מתחילים ליצור </w:t>
+      </w:r>
+      <w:proofErr w:type="spellStart"/>
+      <w:r>
+        <w:rPr>
+          <w:rtl/>
+        </w:rPr>
+        <w:t>קומיטים</w:t>
+      </w:r>
+      <w:proofErr w:type="spellEnd"/>
+      <w:r>
+        <w:rPr>
+          <w:rtl/>
+        </w:rPr>
+        <w:t xml:space="preserve">, כל </w:t>
+      </w:r>
+      <w:proofErr w:type="spellStart"/>
+      <w:r>
+        <w:rPr>
+          <w:rtl/>
+        </w:rPr>
+        <w:t>קומיט</w:t>
+      </w:r>
+      <w:proofErr w:type="spellEnd"/>
+      <w:r>
+        <w:rPr>
+          <w:rtl/>
+        </w:rPr>
+        <w:t xml:space="preserve"> מסביר מה כתבתם עד עכשיו בקוד.</w:t>
+      </w:r>
+    </w:p>
+    <w:p>
+      <w:r>
+        <w:rPr>
+          <w:u w:val="single"/>
+          <w:rtl/>
+        </w:rPr>
+        <w:t xml:space="preserve">שימו </w:t>
+      </w:r>
+      <w:r>
+        <w:rPr>
+          <mc:AlternateContent>
+            <mc:Choice Requires="w16se">
+              <w:rFonts w:hint="cs"/>
+            </mc:Choice>
+            <mc:Fallback>
+              <w:rFonts w:ascii="Segoe UI Emoji" w:eastAsia="Segoe UI Emoji" w:hAnsi="Segoe UI Emoji" w:cs="Segoe UI Emoji"/>
+            </mc:Fallback>
+          </mc:AlternateContent>
+          <w:rtl/>
+        </w:rPr>
+        <mc:AlternateContent>
+          <mc:Choice Requires="w16se">
             <w16se:symEx w16se:font="Segoe UI Emoji" w16se:char="2764"/>
           </mc:Choice>
           <mc:Fallback>
@@ -9293,17 +9934,16 @@
       <w:pPr>
         <w:pStyle w:val="2"/>
       </w:pPr>
-      <w:bookmarkStart w:id="29" w:name="_Toc200903269"/>
-      <w:bookmarkStart w:id="30" w:name="_Toc219898110"/>
-      <w:r>
-        <w:rPr>
-          <w:rtl/>
-        </w:rPr>
-        <w:lastRenderedPageBreak/>
+      <w:bookmarkStart w:id="32" w:name="_Toc200903269"/>
+      <w:bookmarkStart w:id="33" w:name="_Toc223262736"/>
+      <w:r>
+        <w:rPr>
+          <w:rtl/>
+        </w:rPr>
         <w:t>דחיפת השינויים לשרת המרוחק</w:t>
       </w:r>
-      <w:bookmarkEnd w:id="29"/>
-      <w:bookmarkEnd w:id="30"/>
+      <w:bookmarkEnd w:id="32"/>
+      <w:bookmarkEnd w:id="33"/>
     </w:p>
     <w:p>
       <w:r>
@@ -9615,13 +10255,13 @@
       <w:pPr>
         <w:pStyle w:val="2"/>
       </w:pPr>
-      <w:bookmarkStart w:id="31" w:name="_Toc200903270"/>
-      <w:bookmarkStart w:id="32" w:name="_Toc219898111"/>
+      <w:bookmarkStart w:id="34" w:name="_Toc200903270"/>
+      <w:bookmarkStart w:id="35" w:name="_Toc223262737"/>
       <w:r>
         <w:t>Pull Request</w:t>
       </w:r>
-      <w:bookmarkEnd w:id="31"/>
-      <w:bookmarkEnd w:id="32"/>
+      <w:bookmarkEnd w:id="34"/>
+      <w:bookmarkEnd w:id="35"/>
     </w:p>
     <w:p>
       <w:pPr>
@@ -9736,6 +10376,7 @@
         <w:rPr>
           <w:rtl/>
         </w:rPr>
+        <w:lastRenderedPageBreak/>
         <w:t xml:space="preserve">היכנסו לפרויקט באתר, לחצו על </w:t>
       </w:r>
       <w:r>
@@ -9859,14 +10500,13 @@
           <w:rtl/>
         </w:rPr>
       </w:pPr>
-      <w:bookmarkStart w:id="33" w:name="_Toc200903271"/>
-      <w:bookmarkStart w:id="34" w:name="_Toc219898112"/>
-      <w:r>
-        <w:lastRenderedPageBreak/>
+      <w:bookmarkStart w:id="36" w:name="_Toc200903271"/>
+      <w:bookmarkStart w:id="37" w:name="_Toc223262738"/>
+      <w:r>
         <w:t>Git Rebase</w:t>
       </w:r>
-      <w:bookmarkEnd w:id="33"/>
-      <w:bookmarkEnd w:id="34"/>
+      <w:bookmarkEnd w:id="36"/>
+      <w:bookmarkEnd w:id="37"/>
     </w:p>
     <w:p>
       <w:r>
@@ -10064,40 +10704,29 @@
     <w:p/>
     <w:p/>
     <w:p/>
+    <w:p>
+      <w:pPr>
+        <w:rPr>
+          <w:rtl/>
+        </w:rPr>
+      </w:pPr>
+    </w:p>
+    <w:p>
+      <w:pPr>
+        <w:rPr>
+          <w:rtl/>
+        </w:rPr>
+      </w:pPr>
+    </w:p>
     <w:p/>
-    <w:p/>
-    <w:p/>
-    <w:p/>
-    <w:p/>
-    <w:p/>
-    <w:p>
-      <w:pPr>
-        <w:rPr>
-          <w:rtl/>
-        </w:rPr>
-      </w:pPr>
-    </w:p>
-    <w:p>
-      <w:pPr>
-        <w:rPr>
-          <w:rtl/>
-        </w:rPr>
-      </w:pPr>
-    </w:p>
-    <w:p>
-      <w:pPr>
-        <w:rPr>
-          <w:rtl/>
-        </w:rPr>
-      </w:pPr>
-    </w:p>
-    <w:p/>
     <w:p>
       <w:pPr>
         <w:pStyle w:val="1"/>
       </w:pPr>
-      <w:bookmarkStart w:id="35" w:name="_Toc200903272"/>
-      <w:bookmarkStart w:id="36" w:name="_Toc219898113"/>
+      <w:bookmarkStart w:id="38" w:name="_Toc200903272"/>
+      <w:bookmarkStart w:id="39" w:name="_שפת_typescript"/>
+      <w:bookmarkStart w:id="40" w:name="_Toc223262739"/>
+      <w:bookmarkEnd w:id="39"/>
       <w:r>
         <w:rPr>
           <w:rtl/>
@@ -10108,23 +10737,23 @@
       <w:r>
         <w:t>typescript</w:t>
       </w:r>
-      <w:bookmarkEnd w:id="35"/>
-      <w:bookmarkEnd w:id="36"/>
+      <w:bookmarkEnd w:id="38"/>
+      <w:bookmarkEnd w:id="40"/>
     </w:p>
     <w:p>
       <w:pPr>
         <w:pStyle w:val="2"/>
       </w:pPr>
-      <w:bookmarkStart w:id="37" w:name="_Toc200903273"/>
-      <w:bookmarkStart w:id="38" w:name="_Toc219898114"/>
+      <w:bookmarkStart w:id="41" w:name="_Toc200903273"/>
+      <w:bookmarkStart w:id="42" w:name="_Toc223262740"/>
       <w:r>
         <w:rPr>
           <w:rtl/>
         </w:rPr>
         <w:t>מבוא</w:t>
       </w:r>
-      <w:bookmarkEnd w:id="37"/>
-      <w:bookmarkEnd w:id="38"/>
+      <w:bookmarkEnd w:id="41"/>
+      <w:bookmarkEnd w:id="42"/>
     </w:p>
     <w:p>
       <w:pPr>
@@ -10448,8 +11077,8 @@
           <w:rtl/>
         </w:rPr>
       </w:pPr>
-      <w:bookmarkStart w:id="39" w:name="_Toc200903274"/>
-      <w:bookmarkStart w:id="40" w:name="_Toc219898115"/>
+      <w:bookmarkStart w:id="43" w:name="_Toc200903274"/>
+      <w:bookmarkStart w:id="44" w:name="_Toc223262741"/>
       <w:r>
         <w:rPr>
           <w:rtl/>
@@ -10457,23 +11086,23 @@
         <w:lastRenderedPageBreak/>
         <w:t>הכשרה</w:t>
       </w:r>
-      <w:bookmarkEnd w:id="39"/>
-      <w:bookmarkEnd w:id="40"/>
+      <w:bookmarkEnd w:id="43"/>
+      <w:bookmarkEnd w:id="44"/>
     </w:p>
     <w:p>
       <w:pPr>
         <w:pStyle w:val="3"/>
       </w:pPr>
-      <w:bookmarkStart w:id="41" w:name="_Toc200903275"/>
-      <w:bookmarkStart w:id="42" w:name="_Toc219898116"/>
+      <w:bookmarkStart w:id="45" w:name="_Toc200903275"/>
+      <w:bookmarkStart w:id="46" w:name="_Toc223262742"/>
       <w:r>
         <w:rPr>
           <w:rtl/>
         </w:rPr>
         <w:t>חומר קריאה</w:t>
       </w:r>
-      <w:bookmarkEnd w:id="41"/>
-      <w:bookmarkEnd w:id="42"/>
+      <w:bookmarkEnd w:id="45"/>
+      <w:bookmarkEnd w:id="46"/>
     </w:p>
     <w:p>
       <w:pPr>
@@ -10538,16 +11167,16 @@
       <w:pPr>
         <w:pStyle w:val="3"/>
       </w:pPr>
-      <w:bookmarkStart w:id="43" w:name="_Toc200903276"/>
-      <w:bookmarkStart w:id="44" w:name="_Toc219898117"/>
+      <w:bookmarkStart w:id="47" w:name="_Toc200903276"/>
+      <w:bookmarkStart w:id="48" w:name="_Toc223262743"/>
       <w:r>
         <w:rPr>
           <w:rtl/>
         </w:rPr>
         <w:t>תרגולים</w:t>
       </w:r>
-      <w:bookmarkEnd w:id="43"/>
-      <w:bookmarkEnd w:id="44"/>
+      <w:bookmarkEnd w:id="47"/>
+      <w:bookmarkEnd w:id="48"/>
     </w:p>
     <w:p>
       <w:pPr>
@@ -10954,7 +11583,6 @@
           <w:tab w:val="left" w:pos="1238"/>
         </w:tabs>
         <w:rPr>
-          <w:rFonts w:hint="cs"/>
           <w:rtl/>
         </w:rPr>
       </w:pPr>
@@ -11345,8 +11973,8 @@
         </w:tabs>
         <w:bidi w:val="0"/>
       </w:pPr>
-      <w:bookmarkStart w:id="45" w:name="_heading=h.2p2csry" w:colFirst="0" w:colLast="0"/>
-      <w:bookmarkEnd w:id="45"/>
+      <w:bookmarkStart w:id="49" w:name="_heading=h.2p2csry" w:colFirst="0" w:colLast="0"/>
+      <w:bookmarkEnd w:id="49"/>
       <w:proofErr w:type="spellStart"/>
       <w:r>
         <w:rPr>
@@ -11496,8 +12124,8 @@
           <w:rtl/>
         </w:rPr>
       </w:pPr>
-      <w:bookmarkStart w:id="46" w:name="_heading=h.147n2zr" w:colFirst="0" w:colLast="0"/>
-      <w:bookmarkEnd w:id="46"/>
+      <w:bookmarkStart w:id="50" w:name="_heading=h.147n2zr" w:colFirst="0" w:colLast="0"/>
+      <w:bookmarkEnd w:id="50"/>
       <w:proofErr w:type="spellStart"/>
       <w:r>
         <w:rPr>
@@ -11864,7 +12492,6 @@
           <w:tab w:val="left" w:pos="1238"/>
         </w:tabs>
         <w:rPr>
-          <w:rFonts w:hint="cs"/>
           <w:rtl/>
         </w:rPr>
       </w:pPr>
@@ -11876,8 +12503,10 @@
           <w:rtl/>
         </w:rPr>
       </w:pPr>
-      <w:bookmarkStart w:id="47" w:name="_Toc200903277"/>
-      <w:bookmarkStart w:id="48" w:name="_Toc219898118"/>
+      <w:bookmarkStart w:id="51" w:name="_Toc200903277"/>
+      <w:bookmarkStart w:id="52" w:name="_Postman_ובקשות_API"/>
+      <w:bookmarkStart w:id="53" w:name="_Toc223262744"/>
+      <w:bookmarkEnd w:id="52"/>
       <w:r>
         <w:lastRenderedPageBreak/>
         <w:t>Postman</w:t>
@@ -11892,8 +12521,8 @@
       <w:r>
         <w:t>API</w:t>
       </w:r>
-      <w:bookmarkEnd w:id="47"/>
-      <w:bookmarkEnd w:id="48"/>
+      <w:bookmarkEnd w:id="51"/>
+      <w:bookmarkEnd w:id="53"/>
     </w:p>
     <w:p>
       <w:pPr>
@@ -11902,8 +12531,8 @@
           <w:rtl/>
         </w:rPr>
       </w:pPr>
-      <w:bookmarkStart w:id="49" w:name="_Toc200903278"/>
-      <w:bookmarkStart w:id="50" w:name="_Toc219898119"/>
+      <w:bookmarkStart w:id="54" w:name="_Toc200903278"/>
+      <w:bookmarkStart w:id="55" w:name="_Toc223262745"/>
       <w:r>
         <w:rPr>
           <w:rFonts w:hint="cs"/>
@@ -11911,8 +12540,8 @@
         </w:rPr>
         <w:t>מבוא</w:t>
       </w:r>
-      <w:bookmarkEnd w:id="49"/>
-      <w:bookmarkEnd w:id="50"/>
+      <w:bookmarkEnd w:id="54"/>
+      <w:bookmarkEnd w:id="55"/>
     </w:p>
     <w:p>
       <w:pPr>
@@ -12080,8 +12709,8 @@
           <w:rtl/>
         </w:rPr>
       </w:pPr>
-      <w:bookmarkStart w:id="51" w:name="_Toc200903279"/>
-      <w:bookmarkStart w:id="52" w:name="_Toc219898120"/>
+      <w:bookmarkStart w:id="56" w:name="_Toc200903279"/>
+      <w:bookmarkStart w:id="57" w:name="_Toc223262746"/>
       <w:r>
         <w:rPr>
           <w:rFonts w:hint="cs"/>
@@ -12092,8 +12721,8 @@
       <w:r>
         <w:t>API</w:t>
       </w:r>
-      <w:bookmarkEnd w:id="51"/>
-      <w:bookmarkEnd w:id="52"/>
+      <w:bookmarkEnd w:id="56"/>
+      <w:bookmarkEnd w:id="57"/>
     </w:p>
     <w:p>
       <w:pPr>
@@ -12476,7 +13105,7 @@
           <w:rtl/>
         </w:rPr>
         <w:drawing>
-          <wp:anchor distT="0" distB="0" distL="114300" distR="114300" simplePos="0" relativeHeight="251668480" behindDoc="0" locked="0" layoutInCell="1" allowOverlap="1" wp14:anchorId="38E79974" wp14:editId="04D6A7EB">
+          <wp:anchor distT="0" distB="0" distL="114300" distR="114300" simplePos="0" relativeHeight="251668480" behindDoc="0" locked="0" layoutInCell="1" allowOverlap="1" wp14:anchorId="38E79974" wp14:editId="48A5D062">
             <wp:simplePos x="0" y="0"/>
             <wp:positionH relativeFrom="margin">
               <wp:align>left</wp:align>
@@ -14064,8 +14693,8 @@
           <w:rtl/>
         </w:rPr>
       </w:pPr>
-      <w:bookmarkStart w:id="53" w:name="_Toc200903280"/>
-      <w:bookmarkStart w:id="54" w:name="_Toc219898121"/>
+      <w:bookmarkStart w:id="58" w:name="_Toc200903280"/>
+      <w:bookmarkStart w:id="59" w:name="_Toc223262747"/>
       <w:r>
         <w:rPr>
           <w:rFonts w:hint="cs"/>
@@ -14076,8 +14705,8 @@
       <w:r>
         <w:t>Postman</w:t>
       </w:r>
-      <w:bookmarkEnd w:id="53"/>
-      <w:bookmarkEnd w:id="54"/>
+      <w:bookmarkEnd w:id="58"/>
+      <w:bookmarkEnd w:id="59"/>
     </w:p>
     <w:p>
       <w:pPr>
@@ -16009,8 +16638,8 @@
           <w:rtl/>
         </w:rPr>
       </w:pPr>
-      <w:bookmarkStart w:id="55" w:name="_Toc200903281"/>
-      <w:bookmarkStart w:id="56" w:name="_Toc219898122"/>
+      <w:bookmarkStart w:id="60" w:name="_Toc200903281"/>
+      <w:bookmarkStart w:id="61" w:name="_Toc223262748"/>
       <w:r>
         <w:rPr>
           <w:rFonts w:hint="cs"/>
@@ -16018,8 +16647,8 @@
         </w:rPr>
         <w:t>סיכום קצר</w:t>
       </w:r>
-      <w:bookmarkEnd w:id="55"/>
-      <w:bookmarkEnd w:id="56"/>
+      <w:bookmarkEnd w:id="60"/>
+      <w:bookmarkEnd w:id="61"/>
     </w:p>
     <w:p>
       <w:pPr>
@@ -16185,8 +16814,8 @@
           <w:rtl/>
         </w:rPr>
       </w:pPr>
-      <w:bookmarkStart w:id="57" w:name="_Toc200903282"/>
-      <w:bookmarkStart w:id="58" w:name="_Toc219898123"/>
+      <w:bookmarkStart w:id="62" w:name="_Toc200903282"/>
+      <w:bookmarkStart w:id="63" w:name="_Toc223262749"/>
       <w:r>
         <w:rPr>
           <w:rFonts w:hint="cs"/>
@@ -16194,8 +16823,8 @@
         </w:rPr>
         <w:t>תרגול</w:t>
       </w:r>
-      <w:bookmarkEnd w:id="57"/>
-      <w:bookmarkEnd w:id="58"/>
+      <w:bookmarkEnd w:id="62"/>
+      <w:bookmarkEnd w:id="63"/>
     </w:p>
     <w:p>
       <w:pPr>
@@ -16314,8 +16943,8 @@
           <w:rtl/>
         </w:rPr>
       </w:pPr>
-      <w:bookmarkStart w:id="59" w:name="_Toc200903283"/>
-      <w:bookmarkStart w:id="60" w:name="_Toc219898124"/>
+      <w:bookmarkStart w:id="64" w:name="_Toc200903283"/>
+      <w:bookmarkStart w:id="65" w:name="_Toc223262750"/>
       <w:r>
         <w:rPr>
           <w:rFonts w:hint="cs"/>
@@ -16323,8 +16952,8 @@
         </w:rPr>
         <w:t>בקשות</w:t>
       </w:r>
-      <w:bookmarkEnd w:id="59"/>
-      <w:bookmarkEnd w:id="60"/>
+      <w:bookmarkEnd w:id="64"/>
+      <w:bookmarkEnd w:id="65"/>
     </w:p>
     <w:p>
       <w:pPr>
@@ -16645,8 +17274,10 @@
       <w:pPr>
         <w:pStyle w:val="1"/>
       </w:pPr>
-      <w:bookmarkStart w:id="61" w:name="_Toc200903284"/>
-      <w:bookmarkStart w:id="62" w:name="_Toc219898125"/>
+      <w:bookmarkStart w:id="66" w:name="_Toc200903284"/>
+      <w:bookmarkStart w:id="67" w:name="_אלמנטים_באתר_האינטרנט"/>
+      <w:bookmarkStart w:id="68" w:name="_Toc223262751"/>
+      <w:bookmarkEnd w:id="67"/>
       <w:r>
         <w:rPr>
           <w:rtl/>
@@ -16654,23 +17285,23 @@
         <w:lastRenderedPageBreak/>
         <w:t>אלמנטים באתר האינטרנט</w:t>
       </w:r>
-      <w:bookmarkEnd w:id="61"/>
-      <w:bookmarkEnd w:id="62"/>
+      <w:bookmarkEnd w:id="66"/>
+      <w:bookmarkEnd w:id="68"/>
     </w:p>
     <w:p>
       <w:pPr>
         <w:pStyle w:val="2"/>
       </w:pPr>
-      <w:bookmarkStart w:id="63" w:name="_Toc200903285"/>
-      <w:bookmarkStart w:id="64" w:name="_Toc219898126"/>
+      <w:bookmarkStart w:id="69" w:name="_Toc200903285"/>
+      <w:bookmarkStart w:id="70" w:name="_Toc223262752"/>
       <w:r>
         <w:rPr>
           <w:rtl/>
         </w:rPr>
         <w:t>מבוא</w:t>
       </w:r>
-      <w:bookmarkEnd w:id="63"/>
-      <w:bookmarkEnd w:id="64"/>
+      <w:bookmarkEnd w:id="69"/>
+      <w:bookmarkEnd w:id="70"/>
     </w:p>
     <w:p>
       <w:r>
@@ -16721,8 +17352,8 @@
       <w:pPr>
         <w:pStyle w:val="3"/>
       </w:pPr>
-      <w:bookmarkStart w:id="65" w:name="_Toc200903286"/>
-      <w:bookmarkStart w:id="66" w:name="_Toc219898127"/>
+      <w:bookmarkStart w:id="71" w:name="_Toc200903286"/>
+      <w:bookmarkStart w:id="72" w:name="_Toc223262753"/>
       <w:r>
         <w:rPr>
           <w:rtl/>
@@ -16745,8 +17376,8 @@
       <w:r>
         <w:t>inspect</w:t>
       </w:r>
-      <w:bookmarkEnd w:id="65"/>
-      <w:bookmarkEnd w:id="66"/>
+      <w:bookmarkEnd w:id="71"/>
+      <w:bookmarkEnd w:id="72"/>
     </w:p>
     <w:p>
       <w:r>
@@ -17184,16 +17815,16 @@
       <w:pPr>
         <w:pStyle w:val="3"/>
       </w:pPr>
-      <w:bookmarkStart w:id="67" w:name="_Toc200903287"/>
-      <w:bookmarkStart w:id="68" w:name="_Toc219898128"/>
+      <w:bookmarkStart w:id="73" w:name="_Toc200903287"/>
+      <w:bookmarkStart w:id="74" w:name="_Toc223262754"/>
       <w:r>
         <w:rPr>
           <w:rtl/>
         </w:rPr>
         <w:t>מציאת זיהוי ייחודי</w:t>
       </w:r>
-      <w:bookmarkEnd w:id="67"/>
-      <w:bookmarkEnd w:id="68"/>
+      <w:bookmarkEnd w:id="73"/>
+      <w:bookmarkEnd w:id="74"/>
     </w:p>
     <w:p>
       <w:r>
@@ -17640,16 +18271,16 @@
       <w:pPr>
         <w:pStyle w:val="2"/>
       </w:pPr>
-      <w:bookmarkStart w:id="69" w:name="_Toc200903288"/>
-      <w:bookmarkStart w:id="70" w:name="_Toc219898129"/>
+      <w:bookmarkStart w:id="75" w:name="_Toc200903288"/>
+      <w:bookmarkStart w:id="76" w:name="_Toc223262755"/>
       <w:r>
         <w:rPr>
           <w:rtl/>
         </w:rPr>
         <w:t>הכשרה</w:t>
       </w:r>
-      <w:bookmarkEnd w:id="69"/>
-      <w:bookmarkEnd w:id="70"/>
+      <w:bookmarkEnd w:id="75"/>
+      <w:bookmarkEnd w:id="76"/>
     </w:p>
     <w:p>
       <w:r>
@@ -17742,7 +18373,7 @@
           <w:rtl/>
         </w:rPr>
       </w:pPr>
-      <w:bookmarkStart w:id="71" w:name="_Toc219898130"/>
+      <w:bookmarkStart w:id="77" w:name="_Toc223262756"/>
       <w:r>
         <w:lastRenderedPageBreak/>
         <w:t>Design patterns</w:t>
@@ -17754,7 +18385,7 @@
         </w:rPr>
         <w:t xml:space="preserve"> בבדיקות</w:t>
       </w:r>
-      <w:bookmarkEnd w:id="71"/>
+      <w:bookmarkEnd w:id="77"/>
     </w:p>
     <w:p>
       <w:pPr>
@@ -18330,7 +18961,7 @@
           <w:rtl/>
         </w:rPr>
       </w:pPr>
-      <w:bookmarkStart w:id="72" w:name="_Toc219898131"/>
+      <w:bookmarkStart w:id="78" w:name="_Toc223262757"/>
       <w:r>
         <w:rPr>
           <w:rFonts w:hint="cs"/>
@@ -18339,7 +18970,7 @@
         <w:lastRenderedPageBreak/>
         <w:t>תבניות עיצוב בבדיקות</w:t>
       </w:r>
-      <w:bookmarkEnd w:id="72"/>
+      <w:bookmarkEnd w:id="78"/>
     </w:p>
     <w:p>
       <w:pPr>
@@ -18376,11 +19007,11 @@
           <w:rtl/>
         </w:rPr>
       </w:pPr>
-      <w:bookmarkStart w:id="73" w:name="_Toc219898132"/>
+      <w:bookmarkStart w:id="79" w:name="_Toc223262758"/>
       <w:r>
         <w:t>POM</w:t>
       </w:r>
-      <w:bookmarkEnd w:id="73"/>
+      <w:bookmarkEnd w:id="79"/>
     </w:p>
     <w:p>
       <w:pPr>
@@ -18614,11 +19245,11 @@
           <w:rtl/>
         </w:rPr>
       </w:pPr>
-      <w:bookmarkStart w:id="74" w:name="_Toc219898133"/>
+      <w:bookmarkStart w:id="80" w:name="_Toc223262759"/>
       <w:r>
         <w:t>POR</w:t>
       </w:r>
-      <w:bookmarkEnd w:id="74"/>
+      <w:bookmarkEnd w:id="80"/>
     </w:p>
     <w:p>
       <w:pPr>
@@ -18824,7 +19455,7 @@
       <w:pPr>
         <w:pStyle w:val="2"/>
       </w:pPr>
-      <w:bookmarkStart w:id="75" w:name="_Toc219898134"/>
+      <w:bookmarkStart w:id="81" w:name="_Toc223262760"/>
       <w:r>
         <w:rPr>
           <w:rFonts w:hint="cs"/>
@@ -18832,7 +19463,7 @@
         </w:rPr>
         <w:t>הערת צד אחרונה לפני שנתחיל</w:t>
       </w:r>
-      <w:bookmarkEnd w:id="75"/>
+      <w:bookmarkEnd w:id="81"/>
     </w:p>
     <w:p>
       <w:pPr>
@@ -18918,14 +19549,16 @@
       <w:pPr>
         <w:pStyle w:val="1"/>
       </w:pPr>
-      <w:bookmarkStart w:id="76" w:name="_Toc200903289"/>
-      <w:bookmarkStart w:id="77" w:name="_Toc219898135"/>
+      <w:bookmarkStart w:id="82" w:name="_Toc200903289"/>
+      <w:bookmarkStart w:id="83" w:name="_Playwright"/>
+      <w:bookmarkStart w:id="84" w:name="_Toc223262761"/>
+      <w:bookmarkEnd w:id="83"/>
       <w:r>
         <w:lastRenderedPageBreak/>
         <w:t>Playwright</w:t>
       </w:r>
-      <w:bookmarkEnd w:id="76"/>
-      <w:bookmarkEnd w:id="77"/>
+      <w:bookmarkEnd w:id="82"/>
+      <w:bookmarkEnd w:id="84"/>
     </w:p>
     <w:p>
       <w:pPr>
@@ -18934,8 +19567,8 @@
           <w:rtl/>
         </w:rPr>
       </w:pPr>
-      <w:bookmarkStart w:id="78" w:name="_Toc219898136"/>
-      <w:bookmarkStart w:id="79" w:name="_Toc200903290"/>
+      <w:bookmarkStart w:id="85" w:name="_Toc200903290"/>
+      <w:bookmarkStart w:id="86" w:name="_Toc223262762"/>
       <w:r>
         <w:rPr>
           <w:rFonts w:hint="cs"/>
@@ -18943,7 +19576,7 @@
         </w:rPr>
         <w:t>מבוא</w:t>
       </w:r>
-      <w:bookmarkEnd w:id="78"/>
+      <w:bookmarkEnd w:id="86"/>
     </w:p>
     <w:p>
       <w:pPr>
@@ -19208,7 +19841,7 @@
       <w:pPr>
         <w:pStyle w:val="2"/>
       </w:pPr>
-      <w:bookmarkStart w:id="80" w:name="_Toc219898137"/>
+      <w:bookmarkStart w:id="87" w:name="_Toc223262763"/>
       <w:r>
         <w:rPr>
           <w:rtl/>
@@ -19230,8 +19863,8 @@
         </w:rPr>
         <w:t xml:space="preserve"> שנתחיל – דף קונבנציות</w:t>
       </w:r>
-      <w:bookmarkEnd w:id="79"/>
-      <w:bookmarkEnd w:id="80"/>
+      <w:bookmarkEnd w:id="85"/>
+      <w:bookmarkEnd w:id="87"/>
     </w:p>
     <w:p>
       <w:pPr>
@@ -19289,10 +19922,10 @@
       <w:pPr>
         <w:pStyle w:val="3"/>
       </w:pPr>
-      <w:bookmarkStart w:id="81" w:name="_קונבנציות_להכשרה_–"/>
-      <w:bookmarkStart w:id="82" w:name="_Toc200903291"/>
-      <w:bookmarkStart w:id="83" w:name="_Toc219898138"/>
-      <w:bookmarkEnd w:id="81"/>
+      <w:bookmarkStart w:id="88" w:name="_קונבנציות_להכשרה_–"/>
+      <w:bookmarkStart w:id="89" w:name="_Toc200903291"/>
+      <w:bookmarkStart w:id="90" w:name="_Toc223262764"/>
+      <w:bookmarkEnd w:id="88"/>
       <w:r>
         <w:rPr>
           <w:rtl/>
@@ -19302,8 +19935,8 @@
       <w:r>
         <w:t>TS</w:t>
       </w:r>
-      <w:bookmarkEnd w:id="82"/>
-      <w:bookmarkEnd w:id="83"/>
+      <w:bookmarkEnd w:id="89"/>
+      <w:bookmarkEnd w:id="90"/>
     </w:p>
     <w:p>
       <w:pPr>
@@ -20043,8 +20676,8 @@
           <w:rtl/>
         </w:rPr>
       </w:pPr>
-      <w:bookmarkStart w:id="84" w:name="_heading=h.19c6y18" w:colFirst="0" w:colLast="0"/>
-      <w:bookmarkEnd w:id="84"/>
+      <w:bookmarkStart w:id="91" w:name="_heading=h.19c6y18" w:colFirst="0" w:colLast="0"/>
+      <w:bookmarkEnd w:id="91"/>
     </w:p>
     <w:p>
       <w:pPr>
@@ -20294,8 +20927,8 @@
       <w:pPr>
         <w:pStyle w:val="2"/>
       </w:pPr>
-      <w:bookmarkStart w:id="85" w:name="_Toc200903294"/>
-      <w:bookmarkStart w:id="86" w:name="_Toc219898139"/>
+      <w:bookmarkStart w:id="92" w:name="_Toc200903294"/>
+      <w:bookmarkStart w:id="93" w:name="_Toc223262765"/>
       <w:r>
         <w:rPr>
           <w:rtl/>
@@ -20303,7 +20936,7 @@
         <w:lastRenderedPageBreak/>
         <w:t>לפני שנתחיל</w:t>
       </w:r>
-      <w:bookmarkEnd w:id="85"/>
+      <w:bookmarkEnd w:id="92"/>
       <w:r>
         <w:rPr>
           <w:rFonts w:hint="cs"/>
@@ -20314,7 +20947,7 @@
       <w:r>
         <w:t>async</w:t>
       </w:r>
-      <w:bookmarkEnd w:id="86"/>
+      <w:bookmarkEnd w:id="93"/>
     </w:p>
     <w:p>
       <w:pPr>
@@ -20377,16 +21010,16 @@
       <w:pPr>
         <w:pStyle w:val="3"/>
       </w:pPr>
-      <w:bookmarkStart w:id="87" w:name="_Toc200903295"/>
-      <w:bookmarkStart w:id="88" w:name="_Toc219898140"/>
+      <w:bookmarkStart w:id="94" w:name="_Toc200903295"/>
+      <w:bookmarkStart w:id="95" w:name="_Toc223262766"/>
       <w:r>
         <w:rPr>
           <w:rtl/>
         </w:rPr>
         <w:t>חומר למידה</w:t>
       </w:r>
-      <w:bookmarkEnd w:id="87"/>
-      <w:bookmarkEnd w:id="88"/>
+      <w:bookmarkEnd w:id="94"/>
+      <w:bookmarkEnd w:id="95"/>
     </w:p>
     <w:p>
       <w:r>
@@ -20460,16 +21093,16 @@
       <w:pPr>
         <w:pStyle w:val="3"/>
       </w:pPr>
-      <w:bookmarkStart w:id="89" w:name="_Toc200903296"/>
-      <w:bookmarkStart w:id="90" w:name="_Toc219898141"/>
+      <w:bookmarkStart w:id="96" w:name="_Toc200903296"/>
+      <w:bookmarkStart w:id="97" w:name="_Toc223262767"/>
       <w:r>
         <w:rPr>
           <w:rtl/>
         </w:rPr>
         <w:t>תרגול</w:t>
       </w:r>
-      <w:bookmarkEnd w:id="89"/>
-      <w:bookmarkEnd w:id="90"/>
+      <w:bookmarkEnd w:id="96"/>
+      <w:bookmarkEnd w:id="97"/>
     </w:p>
     <w:p>
       <w:pPr>
@@ -20904,8 +21537,8 @@
       <w:pPr>
         <w:pStyle w:val="2"/>
       </w:pPr>
-      <w:bookmarkStart w:id="91" w:name="_Toc200903297"/>
-      <w:bookmarkStart w:id="92" w:name="_Toc219898142"/>
+      <w:bookmarkStart w:id="98" w:name="_Toc200903297"/>
+      <w:bookmarkStart w:id="99" w:name="_Toc223262768"/>
       <w:r>
         <w:rPr>
           <w:rtl/>
@@ -20913,15 +21546,15 @@
         <w:lastRenderedPageBreak/>
         <w:t>הכשרה</w:t>
       </w:r>
-      <w:bookmarkEnd w:id="91"/>
-      <w:bookmarkEnd w:id="92"/>
+      <w:bookmarkEnd w:id="98"/>
+      <w:bookmarkEnd w:id="99"/>
     </w:p>
     <w:p>
       <w:pPr>
         <w:pStyle w:val="3"/>
       </w:pPr>
-      <w:bookmarkStart w:id="93" w:name="_Toc200903298"/>
-      <w:bookmarkStart w:id="94" w:name="_Toc219898143"/>
+      <w:bookmarkStart w:id="100" w:name="_Toc200903298"/>
+      <w:bookmarkStart w:id="101" w:name="_Toc223262769"/>
       <w:r>
         <w:rPr>
           <w:rtl/>
@@ -20981,8 +21614,8 @@
         </w:rPr>
         <w:t>בדיקות</w:t>
       </w:r>
-      <w:bookmarkEnd w:id="93"/>
-      <w:bookmarkEnd w:id="94"/>
+      <w:bookmarkEnd w:id="100"/>
+      <w:bookmarkEnd w:id="101"/>
     </w:p>
     <w:p>
       <w:pPr>
@@ -21207,7 +21840,7 @@
           <w:rtl/>
         </w:rPr>
       </w:pPr>
-      <w:bookmarkStart w:id="95" w:name="_Toc200903299"/>
+      <w:bookmarkStart w:id="102" w:name="_Toc200903299"/>
     </w:p>
     <w:p>
       <w:pPr>
@@ -21339,7 +21972,7 @@
       <w:pPr>
         <w:pStyle w:val="3"/>
       </w:pPr>
-      <w:bookmarkStart w:id="96" w:name="_Toc219898144"/>
+      <w:bookmarkStart w:id="103" w:name="_Toc223262770"/>
       <w:r>
         <w:rPr>
           <w:rtl/>
@@ -21347,8 +21980,8 @@
         <w:lastRenderedPageBreak/>
         <w:t>התשתית</w:t>
       </w:r>
-      <w:bookmarkEnd w:id="95"/>
-      <w:bookmarkEnd w:id="96"/>
+      <w:bookmarkEnd w:id="102"/>
+      <w:bookmarkEnd w:id="103"/>
     </w:p>
     <w:p>
       <w:r>
@@ -21405,16 +22038,16 @@
       <w:pPr>
         <w:pStyle w:val="3"/>
       </w:pPr>
-      <w:bookmarkStart w:id="97" w:name="_Toc200903300"/>
-      <w:bookmarkStart w:id="98" w:name="_Toc219898145"/>
+      <w:bookmarkStart w:id="104" w:name="_Toc200903300"/>
+      <w:bookmarkStart w:id="105" w:name="_Toc223262771"/>
       <w:r>
         <w:rPr>
           <w:rtl/>
         </w:rPr>
         <w:t>הסבר על התשתית</w:t>
       </w:r>
-      <w:bookmarkEnd w:id="97"/>
-      <w:bookmarkEnd w:id="98"/>
+      <w:bookmarkEnd w:id="104"/>
+      <w:bookmarkEnd w:id="105"/>
     </w:p>
     <w:p>
       <w:pPr>
@@ -22670,8 +23303,8 @@
       <w:pPr>
         <w:pStyle w:val="2"/>
       </w:pPr>
-      <w:bookmarkStart w:id="99" w:name="_Toc200903301"/>
-      <w:bookmarkStart w:id="100" w:name="_Toc219898146"/>
+      <w:bookmarkStart w:id="106" w:name="_Toc200903301"/>
+      <w:bookmarkStart w:id="107" w:name="_Toc223262772"/>
       <w:r>
         <w:rPr>
           <w:rtl/>
@@ -22679,8 +23312,8 @@
         <w:lastRenderedPageBreak/>
         <w:t>תרגול</w:t>
       </w:r>
-      <w:bookmarkEnd w:id="99"/>
-      <w:bookmarkEnd w:id="100"/>
+      <w:bookmarkEnd w:id="106"/>
+      <w:bookmarkEnd w:id="107"/>
     </w:p>
     <w:p>
       <w:pPr>
@@ -22911,8 +23544,8 @@
           <w:rtl/>
         </w:rPr>
       </w:pPr>
-      <w:bookmarkStart w:id="101" w:name="_heading=h.1egqt2p" w:colFirst="0" w:colLast="0"/>
-      <w:bookmarkEnd w:id="101"/>
+      <w:bookmarkStart w:id="108" w:name="_heading=h.1egqt2p" w:colFirst="0" w:colLast="0"/>
+      <w:bookmarkEnd w:id="108"/>
       <w:r>
         <w:rPr>
           <w:rtl/>
@@ -23012,7 +23645,7 @@
           <w:rtl/>
         </w:rPr>
       </w:pPr>
-      <w:bookmarkStart w:id="102" w:name="_Toc219898147"/>
+      <w:bookmarkStart w:id="109" w:name="_Toc223262773"/>
       <w:r>
         <w:rPr>
           <w:rFonts w:hint="cs"/>
@@ -23040,7 +23673,7 @@
         </w:rPr>
         <w:t xml:space="preserve"> לא לדלג!</w:t>
       </w:r>
-      <w:bookmarkEnd w:id="102"/>
+      <w:bookmarkEnd w:id="109"/>
     </w:p>
     <w:p>
       <w:pPr>
@@ -23299,8 +23932,8 @@
       <w:pPr>
         <w:pStyle w:val="3"/>
       </w:pPr>
-      <w:bookmarkStart w:id="103" w:name="_Toc219898148"/>
-      <w:bookmarkStart w:id="104" w:name="_Toc200903302"/>
+      <w:bookmarkStart w:id="110" w:name="_Toc200903302"/>
+      <w:bookmarkStart w:id="111" w:name="_Toc223262774"/>
       <w:r>
         <w:rPr>
           <w:rFonts w:hint="cs"/>
@@ -23312,7 +23945,7 @@
       <w:r>
         <w:t>React app</w:t>
       </w:r>
-      <w:bookmarkEnd w:id="103"/>
+      <w:bookmarkEnd w:id="111"/>
     </w:p>
     <w:p>
       <w:pPr>
@@ -23365,7 +23998,7 @@
         </w:rPr>
         <w:t xml:space="preserve"> ראשונה</w:t>
       </w:r>
-      <w:bookmarkEnd w:id="104"/>
+      <w:bookmarkEnd w:id="110"/>
       <w:r>
         <w:rPr>
           <w:rFonts w:hint="cs"/>
@@ -23842,7 +24475,7 @@
       <w:pPr>
         <w:pStyle w:val="4"/>
       </w:pPr>
-      <w:bookmarkStart w:id="105" w:name="_Toc200903303"/>
+      <w:bookmarkStart w:id="112" w:name="_Toc200903303"/>
       <w:r>
         <w:rPr>
           <w:rFonts w:hint="cs"/>
@@ -23856,7 +24489,7 @@
         </w:rPr>
         <w:t xml:space="preserve"> שנייה</w:t>
       </w:r>
-      <w:bookmarkEnd w:id="105"/>
+      <w:bookmarkEnd w:id="112"/>
       <w:r>
         <w:rPr>
           <w:rFonts w:hint="cs"/>
@@ -24287,7 +24920,7 @@
       <w:pPr>
         <w:pStyle w:val="4"/>
       </w:pPr>
-      <w:bookmarkStart w:id="106" w:name="_Toc200903304"/>
+      <w:bookmarkStart w:id="113" w:name="_Toc200903304"/>
       <w:r>
         <w:rPr>
           <w:rFonts w:hint="cs"/>
@@ -24301,7 +24934,7 @@
         </w:rPr>
         <w:t xml:space="preserve"> שלישית</w:t>
       </w:r>
-      <w:bookmarkEnd w:id="106"/>
+      <w:bookmarkEnd w:id="113"/>
       <w:r>
         <w:rPr>
           <w:rFonts w:hint="cs"/>
@@ -24669,7 +25302,7 @@
           <w:rtl/>
         </w:rPr>
       </w:pPr>
-      <w:bookmarkStart w:id="107" w:name="_Toc200903305"/>
+      <w:bookmarkStart w:id="114" w:name="_Toc200903305"/>
       <w:r>
         <w:rPr>
           <w:rFonts w:hint="cs"/>
@@ -24683,7 +25316,7 @@
         </w:rPr>
         <w:t xml:space="preserve"> </w:t>
       </w:r>
-      <w:bookmarkEnd w:id="107"/>
+      <w:bookmarkEnd w:id="114"/>
       <w:r>
         <w:rPr>
           <w:rFonts w:hint="cs"/>
@@ -25177,7 +25810,7 @@
           <w:rtl/>
         </w:rPr>
       </w:pPr>
-      <w:bookmarkStart w:id="108" w:name="_Toc219898149"/>
+      <w:bookmarkStart w:id="115" w:name="_Toc223262775"/>
       <w:r>
         <w:rPr>
           <w:rFonts w:hint="cs"/>
@@ -25188,7 +25821,7 @@
       <w:r>
         <w:t>Swag Labs</w:t>
       </w:r>
-      <w:bookmarkEnd w:id="108"/>
+      <w:bookmarkEnd w:id="115"/>
     </w:p>
     <w:p>
       <w:pPr>
@@ -26105,21 +26738,21 @@
       <w:pPr>
         <w:pStyle w:val="1"/>
       </w:pPr>
-      <w:bookmarkStart w:id="109" w:name="_Toc200903306"/>
-      <w:bookmarkStart w:id="110" w:name="_Toc219898150"/>
+      <w:bookmarkStart w:id="116" w:name="_Toc200903306"/>
+      <w:bookmarkStart w:id="117" w:name="_Toc223262776"/>
       <w:r>
         <w:lastRenderedPageBreak/>
         <w:t>Cucumber</w:t>
       </w:r>
-      <w:bookmarkEnd w:id="109"/>
-      <w:bookmarkEnd w:id="110"/>
+      <w:bookmarkEnd w:id="116"/>
+      <w:bookmarkEnd w:id="117"/>
     </w:p>
     <w:p>
       <w:pPr>
         <w:pStyle w:val="2"/>
       </w:pPr>
-      <w:bookmarkStart w:id="111" w:name="_Toc200903307"/>
-      <w:bookmarkStart w:id="112" w:name="_Toc219898151"/>
+      <w:bookmarkStart w:id="118" w:name="_Toc200903307"/>
+      <w:bookmarkStart w:id="119" w:name="_Toc223262777"/>
       <w:r>
         <w:rPr>
           <w:rtl/>
@@ -26140,8 +26773,8 @@
         </w:rPr>
         <w:t xml:space="preserve"> שנתחיל – דף קונבנציות</w:t>
       </w:r>
-      <w:bookmarkEnd w:id="111"/>
-      <w:bookmarkEnd w:id="112"/>
+      <w:bookmarkEnd w:id="118"/>
+      <w:bookmarkEnd w:id="119"/>
     </w:p>
     <w:p>
       <w:pPr>
@@ -26224,8 +26857,8 @@
       <w:pPr>
         <w:pStyle w:val="3"/>
       </w:pPr>
-      <w:bookmarkStart w:id="113" w:name="_Toc200903308"/>
-      <w:bookmarkStart w:id="114" w:name="_Toc219898152"/>
+      <w:bookmarkStart w:id="120" w:name="_Toc200903308"/>
+      <w:bookmarkStart w:id="121" w:name="_Toc223262778"/>
       <w:r>
         <w:rPr>
           <w:rtl/>
@@ -26235,8 +26868,8 @@
       <w:r>
         <w:t>feature</w:t>
       </w:r>
-      <w:bookmarkEnd w:id="113"/>
-      <w:bookmarkEnd w:id="114"/>
+      <w:bookmarkEnd w:id="120"/>
+      <w:bookmarkEnd w:id="121"/>
     </w:p>
     <w:p>
       <w:pPr>
@@ -27391,15 +28024,15 @@
           <w:rtl/>
         </w:rPr>
       </w:pPr>
-      <w:bookmarkStart w:id="115" w:name="_heading=h.1664s55" w:colFirst="0" w:colLast="0"/>
-      <w:bookmarkEnd w:id="115"/>
+      <w:bookmarkStart w:id="122" w:name="_heading=h.1664s55" w:colFirst="0" w:colLast="0"/>
+      <w:bookmarkEnd w:id="122"/>
     </w:p>
     <w:p>
       <w:pPr>
         <w:pStyle w:val="3"/>
       </w:pPr>
-      <w:bookmarkStart w:id="116" w:name="_Toc200903309"/>
-      <w:bookmarkStart w:id="117" w:name="_Toc219898153"/>
+      <w:bookmarkStart w:id="123" w:name="_Toc200903309"/>
+      <w:bookmarkStart w:id="124" w:name="_Toc223262779"/>
       <w:r>
         <w:rPr>
           <w:rtl/>
@@ -27410,8 +28043,8 @@
       <w:r>
         <w:t>step-definitions</w:t>
       </w:r>
-      <w:bookmarkEnd w:id="116"/>
-      <w:bookmarkEnd w:id="117"/>
+      <w:bookmarkEnd w:id="123"/>
+      <w:bookmarkEnd w:id="124"/>
     </w:p>
     <w:p>
       <w:pPr>
@@ -28059,23 +28692,23 @@
           <w:rtl/>
         </w:rPr>
       </w:pPr>
-      <w:bookmarkStart w:id="118" w:name="_heading=h.25b2l0r" w:colFirst="0" w:colLast="0"/>
-      <w:bookmarkEnd w:id="118"/>
+      <w:bookmarkStart w:id="125" w:name="_heading=h.25b2l0r" w:colFirst="0" w:colLast="0"/>
+      <w:bookmarkEnd w:id="125"/>
     </w:p>
     <w:p>
       <w:pPr>
         <w:pStyle w:val="3"/>
       </w:pPr>
-      <w:bookmarkStart w:id="119" w:name="_Toc200903310"/>
-      <w:bookmarkStart w:id="120" w:name="_Toc219898154"/>
+      <w:bookmarkStart w:id="126" w:name="_Toc200903310"/>
+      <w:bookmarkStart w:id="127" w:name="_Toc223262780"/>
       <w:r>
         <w:rPr>
           <w:rtl/>
         </w:rPr>
         <w:t>כללי ניסוח לצעד</w:t>
       </w:r>
-      <w:bookmarkEnd w:id="119"/>
-      <w:bookmarkEnd w:id="120"/>
+      <w:bookmarkEnd w:id="126"/>
+      <w:bookmarkEnd w:id="127"/>
     </w:p>
     <w:p>
       <w:pPr>
@@ -28193,8 +28826,8 @@
         </w:rPr>
         <w:t>"enabled"</w:t>
       </w:r>
-      <w:bookmarkStart w:id="121" w:name="_heading=h.34g0dwd" w:colFirst="0" w:colLast="0"/>
-      <w:bookmarkEnd w:id="121"/>
+      <w:bookmarkStart w:id="128" w:name="_heading=h.34g0dwd" w:colFirst="0" w:colLast="0"/>
+      <w:bookmarkEnd w:id="128"/>
     </w:p>
     <w:p>
       <w:pPr>
@@ -28749,8 +29382,8 @@
       <w:pPr>
         <w:pStyle w:val="2"/>
       </w:pPr>
-      <w:bookmarkStart w:id="122" w:name="_Toc200903311"/>
-      <w:bookmarkStart w:id="123" w:name="_Toc219898155"/>
+      <w:bookmarkStart w:id="129" w:name="_Toc200903311"/>
+      <w:bookmarkStart w:id="130" w:name="_Toc223262781"/>
       <w:r>
         <w:rPr>
           <w:rtl/>
@@ -28758,8 +29391,8 @@
         <w:lastRenderedPageBreak/>
         <w:t>מבוא</w:t>
       </w:r>
-      <w:bookmarkEnd w:id="122"/>
-      <w:bookmarkEnd w:id="123"/>
+      <w:bookmarkEnd w:id="129"/>
+      <w:bookmarkEnd w:id="130"/>
     </w:p>
     <w:p>
       <w:pPr>
@@ -28956,31 +29589,31 @@
       <w:pPr>
         <w:pStyle w:val="2"/>
       </w:pPr>
-      <w:bookmarkStart w:id="124" w:name="_Toc200903312"/>
-      <w:bookmarkStart w:id="125" w:name="_Toc219898156"/>
+      <w:bookmarkStart w:id="131" w:name="_Toc200903312"/>
+      <w:bookmarkStart w:id="132" w:name="_Toc223262782"/>
       <w:r>
         <w:rPr>
           <w:rtl/>
         </w:rPr>
         <w:t>הכשרה</w:t>
       </w:r>
-      <w:bookmarkEnd w:id="124"/>
-      <w:bookmarkEnd w:id="125"/>
+      <w:bookmarkEnd w:id="131"/>
+      <w:bookmarkEnd w:id="132"/>
     </w:p>
     <w:p>
       <w:pPr>
         <w:pStyle w:val="3"/>
       </w:pPr>
-      <w:bookmarkStart w:id="126" w:name="_Toc200903313"/>
-      <w:bookmarkStart w:id="127" w:name="_Toc219898157"/>
+      <w:bookmarkStart w:id="133" w:name="_Toc200903313"/>
+      <w:bookmarkStart w:id="134" w:name="_Toc223262783"/>
       <w:r>
         <w:rPr>
           <w:rtl/>
         </w:rPr>
         <w:t>התשתית</w:t>
       </w:r>
-      <w:bookmarkEnd w:id="126"/>
-      <w:bookmarkEnd w:id="127"/>
+      <w:bookmarkEnd w:id="133"/>
+      <w:bookmarkEnd w:id="134"/>
     </w:p>
     <w:p>
       <w:r>
@@ -29126,16 +29759,16 @@
       <w:pPr>
         <w:pStyle w:val="3"/>
       </w:pPr>
-      <w:bookmarkStart w:id="128" w:name="_Toc200903314"/>
-      <w:bookmarkStart w:id="129" w:name="_Toc219898158"/>
+      <w:bookmarkStart w:id="135" w:name="_Toc200903314"/>
+      <w:bookmarkStart w:id="136" w:name="_Toc223262784"/>
       <w:r>
         <w:rPr>
           <w:rtl/>
         </w:rPr>
         <w:t>הסבר קצר על התשתית</w:t>
       </w:r>
-      <w:bookmarkEnd w:id="128"/>
-      <w:bookmarkEnd w:id="129"/>
+      <w:bookmarkEnd w:id="135"/>
+      <w:bookmarkEnd w:id="136"/>
     </w:p>
     <w:p>
       <w:pPr>
@@ -32088,7 +32721,7 @@
           <w:szCs w:val="21"/>
         </w:rPr>
       </w:pPr>
-      <w:bookmarkStart w:id="130" w:name="_Hlk200905906"/>
+      <w:bookmarkStart w:id="137" w:name="_Hlk200905906"/>
       <w:r>
         <w:rPr>
           <w:rFonts w:ascii="Consolas" w:eastAsia="Times New Roman" w:hAnsi="Consolas" w:cs="Times New Roman"/>
@@ -32604,7 +33237,7 @@
         <w:t>)</w:t>
       </w:r>
     </w:p>
-    <w:bookmarkEnd w:id="130"/>
+    <w:bookmarkEnd w:id="137"/>
     <w:p>
       <w:pPr>
         <w:tabs>
@@ -33015,8 +33648,8 @@
           <w:szCs w:val="21"/>
         </w:rPr>
       </w:pPr>
-      <w:bookmarkStart w:id="131" w:name="_heading=h.3vac5uf" w:colFirst="0" w:colLast="0"/>
-      <w:bookmarkEnd w:id="131"/>
+      <w:bookmarkStart w:id="138" w:name="_heading=h.3vac5uf" w:colFirst="0" w:colLast="0"/>
+      <w:bookmarkEnd w:id="138"/>
       <w:proofErr w:type="spellStart"/>
       <w:r>
         <w:rPr>
@@ -33880,8 +34513,8 @@
           <w:szCs w:val="21"/>
         </w:rPr>
       </w:pPr>
-      <w:bookmarkStart w:id="132" w:name="_heading=h.pkwqa1" w:colFirst="0" w:colLast="0"/>
-      <w:bookmarkEnd w:id="132"/>
+      <w:bookmarkStart w:id="139" w:name="_heading=h.pkwqa1" w:colFirst="0" w:colLast="0"/>
+      <w:bookmarkEnd w:id="139"/>
       <w:r>
         <w:rPr>
           <w:rFonts w:ascii="Consolas" w:eastAsia="Times New Roman" w:hAnsi="Consolas" w:cs="Times New Roman"/>
@@ -34502,8 +35135,8 @@
           <w:szCs w:val="21"/>
         </w:rPr>
       </w:pPr>
-      <w:bookmarkStart w:id="133" w:name="_heading=h.39kk8xu" w:colFirst="0" w:colLast="0"/>
-      <w:bookmarkEnd w:id="133"/>
+      <w:bookmarkStart w:id="140" w:name="_heading=h.39kk8xu" w:colFirst="0" w:colLast="0"/>
+      <w:bookmarkEnd w:id="140"/>
       <w:r>
         <w:rPr>
           <w:rFonts w:ascii="Consolas" w:eastAsia="Times New Roman" w:hAnsi="Consolas" w:cs="Times New Roman"/>
@@ -34788,8 +35421,8 @@
       <w:pPr>
         <w:pStyle w:val="2"/>
       </w:pPr>
-      <w:bookmarkStart w:id="134" w:name="_Toc200903315"/>
-      <w:bookmarkStart w:id="135" w:name="_Toc219898159"/>
+      <w:bookmarkStart w:id="141" w:name="_Toc200903315"/>
+      <w:bookmarkStart w:id="142" w:name="_Toc223262785"/>
       <w:r>
         <w:rPr>
           <w:rtl/>
@@ -34797,8 +35430,8 @@
         <w:lastRenderedPageBreak/>
         <w:t>תרגול</w:t>
       </w:r>
-      <w:bookmarkEnd w:id="134"/>
-      <w:bookmarkEnd w:id="135"/>
+      <w:bookmarkEnd w:id="141"/>
+      <w:bookmarkEnd w:id="142"/>
     </w:p>
     <w:p>
       <w:r>
@@ -34839,16 +35472,16 @@
       <w:pPr>
         <w:pStyle w:val="3"/>
       </w:pPr>
-      <w:bookmarkStart w:id="136" w:name="_Toc200903316"/>
-      <w:bookmarkStart w:id="137" w:name="_Toc219898160"/>
+      <w:bookmarkStart w:id="143" w:name="_Toc200903316"/>
+      <w:bookmarkStart w:id="144" w:name="_Toc223262786"/>
       <w:r>
         <w:rPr>
           <w:rtl/>
         </w:rPr>
         <w:t>משימה ראשונה</w:t>
       </w:r>
-      <w:bookmarkEnd w:id="136"/>
-      <w:bookmarkEnd w:id="137"/>
+      <w:bookmarkEnd w:id="143"/>
+      <w:bookmarkEnd w:id="144"/>
     </w:p>
     <w:p>
       <w:r>
@@ -34976,16 +35609,16 @@
       <w:pPr>
         <w:pStyle w:val="3"/>
       </w:pPr>
-      <w:bookmarkStart w:id="138" w:name="_Toc200903317"/>
-      <w:bookmarkStart w:id="139" w:name="_Toc219898161"/>
+      <w:bookmarkStart w:id="145" w:name="_Toc200903317"/>
+      <w:bookmarkStart w:id="146" w:name="_Toc223262787"/>
       <w:r>
         <w:rPr>
           <w:rtl/>
         </w:rPr>
         <w:t>משימה שנייה</w:t>
       </w:r>
-      <w:bookmarkEnd w:id="138"/>
-      <w:bookmarkEnd w:id="139"/>
+      <w:bookmarkEnd w:id="145"/>
+      <w:bookmarkEnd w:id="146"/>
     </w:p>
     <w:p>
       <w:r>
@@ -35047,16 +35680,16 @@
       <w:pPr>
         <w:pStyle w:val="3"/>
       </w:pPr>
-      <w:bookmarkStart w:id="140" w:name="_Toc200903318"/>
-      <w:bookmarkStart w:id="141" w:name="_Toc219898162"/>
+      <w:bookmarkStart w:id="147" w:name="_Toc200903318"/>
+      <w:bookmarkStart w:id="148" w:name="_Toc223262788"/>
       <w:r>
         <w:rPr>
           <w:rtl/>
         </w:rPr>
         <w:t>משימה שלישית</w:t>
       </w:r>
-      <w:bookmarkEnd w:id="140"/>
-      <w:bookmarkEnd w:id="141"/>
+      <w:bookmarkEnd w:id="147"/>
+      <w:bookmarkEnd w:id="148"/>
     </w:p>
     <w:p>
       <w:r>
@@ -35398,7 +36031,7 @@
           <w:rtl/>
         </w:rPr>
       </w:pPr>
-      <w:bookmarkStart w:id="142" w:name="_Toc219898163"/>
+      <w:bookmarkStart w:id="149" w:name="_Toc223262789"/>
       <w:r>
         <w:rPr>
           <w:rFonts w:hint="cs"/>
@@ -35407,7 +36040,7 @@
         <w:lastRenderedPageBreak/>
         <w:t>נספחים</w:t>
       </w:r>
-      <w:bookmarkEnd w:id="142"/>
+      <w:bookmarkEnd w:id="149"/>
     </w:p>
     <w:p>
       <w:pPr>
@@ -35416,9 +36049,9 @@
           <w:rtl/>
         </w:rPr>
       </w:pPr>
-      <w:bookmarkStart w:id="143" w:name="_עץ_הקבצים_בתשתית"/>
-      <w:bookmarkStart w:id="144" w:name="_Toc219898164"/>
-      <w:bookmarkEnd w:id="143"/>
+      <w:bookmarkStart w:id="150" w:name="_עץ_הקבצים_בתשתית"/>
+      <w:bookmarkStart w:id="151" w:name="_Toc223262790"/>
+      <w:bookmarkEnd w:id="150"/>
       <w:r>
         <w:rPr>
           <w:rFonts w:hint="cs"/>
@@ -35436,18 +36069,18 @@
       <w:r>
         <w:t>typescript</w:t>
       </w:r>
-      <w:bookmarkEnd w:id="144"/>
+      <w:bookmarkEnd w:id="151"/>
     </w:p>
     <w:p>
       <w:pPr>
         <w:pStyle w:val="3"/>
       </w:pPr>
-      <w:bookmarkStart w:id="145" w:name="_Toc219898165"/>
+      <w:bookmarkStart w:id="152" w:name="_Toc223262791"/>
       <w:proofErr w:type="spellStart"/>
       <w:r>
         <w:t>package.json</w:t>
       </w:r>
-      <w:bookmarkEnd w:id="145"/>
+      <w:bookmarkEnd w:id="152"/>
       <w:proofErr w:type="spellEnd"/>
     </w:p>
     <w:p>
@@ -35497,12 +36130,12 @@
           <w:rtl/>
         </w:rPr>
       </w:pPr>
-      <w:bookmarkStart w:id="146" w:name="_Toc219898166"/>
+      <w:bookmarkStart w:id="153" w:name="_Toc223262792"/>
       <w:proofErr w:type="spellStart"/>
       <w:r>
         <w:t>tsconfig.json</w:t>
       </w:r>
-      <w:bookmarkEnd w:id="146"/>
+      <w:bookmarkEnd w:id="153"/>
       <w:proofErr w:type="spellEnd"/>
     </w:p>
     <w:p>
@@ -35548,7 +36181,7 @@
       <w:pPr>
         <w:pStyle w:val="3"/>
       </w:pPr>
-      <w:bookmarkStart w:id="147" w:name="_Toc219898167"/>
+      <w:bookmarkStart w:id="154" w:name="_Toc223262793"/>
       <w:r>
         <w:rPr>
           <w:rFonts w:hint="cs"/>
@@ -35560,7 +36193,7 @@
       <w:r>
         <w:t>src</w:t>
       </w:r>
-      <w:bookmarkEnd w:id="147"/>
+      <w:bookmarkEnd w:id="154"/>
       <w:proofErr w:type="spellEnd"/>
     </w:p>
     <w:p>
@@ -35598,7 +36231,7 @@
       <w:pPr>
         <w:pStyle w:val="3"/>
       </w:pPr>
-      <w:bookmarkStart w:id="148" w:name="_Toc219898168"/>
+      <w:bookmarkStart w:id="155" w:name="_Toc223262794"/>
       <w:r>
         <w:rPr>
           <w:rtl/>
@@ -35621,7 +36254,7 @@
       <w:r>
         <w:t>utils</w:t>
       </w:r>
-      <w:bookmarkEnd w:id="148"/>
+      <w:bookmarkEnd w:id="155"/>
     </w:p>
     <w:p>
       <w:pPr>
@@ -37009,6 +37642,92 @@
     </w:lvl>
   </w:abstractNum>
   <w:abstractNum w:abstractNumId="10" w15:restartNumberingAfterBreak="0">
+    <w:nsid w:val="19C67489"/>
+    <w:multiLevelType w:val="multilevel"/>
+    <w:tmpl w:val="860E6108"/>
+    <w:lvl w:ilvl="0">
+      <w:start w:val="1"/>
+      <w:numFmt w:val="decimal"/>
+      <w:lvlText w:val="%1."/>
+      <w:lvlJc w:val="left"/>
+      <w:pPr>
+        <w:ind w:left="720" w:hanging="360"/>
+      </w:pPr>
+    </w:lvl>
+    <w:lvl w:ilvl="1">
+      <w:start w:val="1"/>
+      <w:numFmt w:val="lowerLetter"/>
+      <w:lvlText w:val="%2."/>
+      <w:lvlJc w:val="left"/>
+      <w:pPr>
+        <w:ind w:left="1440" w:hanging="360"/>
+      </w:pPr>
+    </w:lvl>
+    <w:lvl w:ilvl="2">
+      <w:start w:val="1"/>
+      <w:numFmt w:val="lowerRoman"/>
+      <w:lvlText w:val="%3."/>
+      <w:lvlJc w:val="right"/>
+      <w:pPr>
+        <w:ind w:left="2160" w:hanging="180"/>
+      </w:pPr>
+    </w:lvl>
+    <w:lvl w:ilvl="3">
+      <w:start w:val="1"/>
+      <w:numFmt w:val="decimal"/>
+      <w:lvlText w:val="%4."/>
+      <w:lvlJc w:val="left"/>
+      <w:pPr>
+        <w:ind w:left="2880" w:hanging="360"/>
+      </w:pPr>
+    </w:lvl>
+    <w:lvl w:ilvl="4">
+      <w:start w:val="1"/>
+      <w:numFmt w:val="lowerLetter"/>
+      <w:lvlText w:val="%5."/>
+      <w:lvlJc w:val="left"/>
+      <w:pPr>
+        <w:ind w:left="3600" w:hanging="360"/>
+      </w:pPr>
+    </w:lvl>
+    <w:lvl w:ilvl="5">
+      <w:start w:val="1"/>
+      <w:numFmt w:val="lowerRoman"/>
+      <w:lvlText w:val="%6."/>
+      <w:lvlJc w:val="right"/>
+      <w:pPr>
+        <w:ind w:left="4320" w:hanging="180"/>
+      </w:pPr>
+    </w:lvl>
+    <w:lvl w:ilvl="6">
+      <w:start w:val="1"/>
+      <w:numFmt w:val="decimal"/>
+      <w:lvlText w:val="%7."/>
+      <w:lvlJc w:val="left"/>
+      <w:pPr>
+        <w:ind w:left="5040" w:hanging="360"/>
+      </w:pPr>
+    </w:lvl>
+    <w:lvl w:ilvl="7">
+      <w:start w:val="1"/>
+      <w:numFmt w:val="lowerLetter"/>
+      <w:lvlText w:val="%8."/>
+      <w:lvlJc w:val="left"/>
+      <w:pPr>
+        <w:ind w:left="5760" w:hanging="360"/>
+      </w:pPr>
+    </w:lvl>
+    <w:lvl w:ilvl="8">
+      <w:start w:val="1"/>
+      <w:numFmt w:val="lowerRoman"/>
+      <w:lvlText w:val="%9."/>
+      <w:lvlJc w:val="right"/>
+      <w:pPr>
+        <w:ind w:left="6480" w:hanging="180"/>
+      </w:pPr>
+    </w:lvl>
+  </w:abstractNum>
+  <w:abstractNum w:abstractNumId="11" w15:restartNumberingAfterBreak="0">
     <w:nsid w:val="1B914204"/>
     <w:multiLevelType w:val="multilevel"/>
     <w:tmpl w:val="860E6108"/>
@@ -37094,7 +37813,7 @@
       </w:pPr>
     </w:lvl>
   </w:abstractNum>
-  <w:abstractNum w:abstractNumId="11" w15:restartNumberingAfterBreak="0">
+  <w:abstractNum w:abstractNumId="12" w15:restartNumberingAfterBreak="0">
     <w:nsid w:val="1F680C14"/>
     <w:multiLevelType w:val="multilevel"/>
     <w:tmpl w:val="0F0805B8"/>
@@ -37180,7 +37899,7 @@
       </w:pPr>
     </w:lvl>
   </w:abstractNum>
-  <w:abstractNum w:abstractNumId="12" w15:restartNumberingAfterBreak="0">
+  <w:abstractNum w:abstractNumId="13" w15:restartNumberingAfterBreak="0">
     <w:nsid w:val="20687D2B"/>
     <w:multiLevelType w:val="multilevel"/>
     <w:tmpl w:val="68923EF4"/>
@@ -37266,7 +37985,7 @@
       </w:pPr>
     </w:lvl>
   </w:abstractNum>
-  <w:abstractNum w:abstractNumId="13" w15:restartNumberingAfterBreak="0">
+  <w:abstractNum w:abstractNumId="14" w15:restartNumberingAfterBreak="0">
     <w:nsid w:val="2ADB5EC2"/>
     <w:multiLevelType w:val="hybridMultilevel"/>
     <w:tmpl w:val="9B383590"/>
@@ -37378,7 +38097,7 @@
       </w:rPr>
     </w:lvl>
   </w:abstractNum>
-  <w:abstractNum w:abstractNumId="14" w15:restartNumberingAfterBreak="0">
+  <w:abstractNum w:abstractNumId="15" w15:restartNumberingAfterBreak="0">
     <w:nsid w:val="2C172CFA"/>
     <w:multiLevelType w:val="hybridMultilevel"/>
     <w:tmpl w:val="4918AE48"/>
@@ -37491,7 +38210,7 @@
       </w:rPr>
     </w:lvl>
   </w:abstractNum>
-  <w:abstractNum w:abstractNumId="15" w15:restartNumberingAfterBreak="0">
+  <w:abstractNum w:abstractNumId="16" w15:restartNumberingAfterBreak="0">
     <w:nsid w:val="32023CC6"/>
     <w:multiLevelType w:val="multilevel"/>
     <w:tmpl w:val="860E6108"/>
@@ -37577,7 +38296,7 @@
       </w:pPr>
     </w:lvl>
   </w:abstractNum>
-  <w:abstractNum w:abstractNumId="16" w15:restartNumberingAfterBreak="0">
+  <w:abstractNum w:abstractNumId="17" w15:restartNumberingAfterBreak="0">
     <w:nsid w:val="32C919A5"/>
     <w:multiLevelType w:val="multilevel"/>
     <w:tmpl w:val="E738DDFE"/>
@@ -37663,7 +38382,7 @@
       </w:pPr>
     </w:lvl>
   </w:abstractNum>
-  <w:abstractNum w:abstractNumId="17" w15:restartNumberingAfterBreak="0">
+  <w:abstractNum w:abstractNumId="18" w15:restartNumberingAfterBreak="0">
     <w:nsid w:val="3BA32158"/>
     <w:multiLevelType w:val="multilevel"/>
     <w:tmpl w:val="0F0805B8"/>
@@ -37749,7 +38468,7 @@
       </w:pPr>
     </w:lvl>
   </w:abstractNum>
-  <w:abstractNum w:abstractNumId="18" w15:restartNumberingAfterBreak="0">
+  <w:abstractNum w:abstractNumId="19" w15:restartNumberingAfterBreak="0">
     <w:nsid w:val="3D7871EB"/>
     <w:multiLevelType w:val="multilevel"/>
     <w:tmpl w:val="860E6108"/>
@@ -37835,7 +38554,7 @@
       </w:pPr>
     </w:lvl>
   </w:abstractNum>
-  <w:abstractNum w:abstractNumId="19" w15:restartNumberingAfterBreak="0">
+  <w:abstractNum w:abstractNumId="20" w15:restartNumberingAfterBreak="0">
     <w:nsid w:val="3E9922B1"/>
     <w:multiLevelType w:val="multilevel"/>
     <w:tmpl w:val="24485596"/>
@@ -37921,7 +38640,7 @@
       </w:pPr>
     </w:lvl>
   </w:abstractNum>
-  <w:abstractNum w:abstractNumId="20" w15:restartNumberingAfterBreak="0">
+  <w:abstractNum w:abstractNumId="21" w15:restartNumberingAfterBreak="0">
     <w:nsid w:val="426617F1"/>
     <w:multiLevelType w:val="multilevel"/>
     <w:tmpl w:val="0F0805B8"/>
@@ -38007,7 +38726,7 @@
       </w:pPr>
     </w:lvl>
   </w:abstractNum>
-  <w:abstractNum w:abstractNumId="21" w15:restartNumberingAfterBreak="0">
+  <w:abstractNum w:abstractNumId="22" w15:restartNumberingAfterBreak="0">
     <w:nsid w:val="49FC08F4"/>
     <w:multiLevelType w:val="multilevel"/>
     <w:tmpl w:val="0F0805B8"/>
@@ -38093,7 +38812,7 @@
       </w:pPr>
     </w:lvl>
   </w:abstractNum>
-  <w:abstractNum w:abstractNumId="22" w15:restartNumberingAfterBreak="0">
+  <w:abstractNum w:abstractNumId="23" w15:restartNumberingAfterBreak="0">
     <w:nsid w:val="52CC25A0"/>
     <w:multiLevelType w:val="multilevel"/>
     <w:tmpl w:val="36E43D92"/>
@@ -38179,7 +38898,7 @@
       </w:pPr>
     </w:lvl>
   </w:abstractNum>
-  <w:abstractNum w:abstractNumId="23" w15:restartNumberingAfterBreak="0">
+  <w:abstractNum w:abstractNumId="24" w15:restartNumberingAfterBreak="0">
     <w:nsid w:val="57D014BE"/>
     <w:multiLevelType w:val="hybridMultilevel"/>
     <w:tmpl w:val="EAAC470A"/>
@@ -38292,7 +39011,7 @@
       </w:rPr>
     </w:lvl>
   </w:abstractNum>
-  <w:abstractNum w:abstractNumId="24" w15:restartNumberingAfterBreak="0">
+  <w:abstractNum w:abstractNumId="25" w15:restartNumberingAfterBreak="0">
     <w:nsid w:val="59625F7E"/>
     <w:multiLevelType w:val="multilevel"/>
     <w:tmpl w:val="5EE878DE"/>
@@ -38378,7 +39097,7 @@
       </w:pPr>
     </w:lvl>
   </w:abstractNum>
-  <w:abstractNum w:abstractNumId="25" w15:restartNumberingAfterBreak="0">
+  <w:abstractNum w:abstractNumId="26" w15:restartNumberingAfterBreak="0">
     <w:nsid w:val="5E9D00E2"/>
     <w:multiLevelType w:val="multilevel"/>
     <w:tmpl w:val="0F0805B8"/>
@@ -38464,7 +39183,7 @@
       </w:pPr>
     </w:lvl>
   </w:abstractNum>
-  <w:abstractNum w:abstractNumId="26" w15:restartNumberingAfterBreak="0">
+  <w:abstractNum w:abstractNumId="27" w15:restartNumberingAfterBreak="0">
     <w:nsid w:val="5EA655C3"/>
     <w:multiLevelType w:val="multilevel"/>
     <w:tmpl w:val="0F0805B8"/>
@@ -38550,7 +39269,7 @@
       </w:pPr>
     </w:lvl>
   </w:abstractNum>
-  <w:abstractNum w:abstractNumId="27" w15:restartNumberingAfterBreak="0">
+  <w:abstractNum w:abstractNumId="28" w15:restartNumberingAfterBreak="0">
     <w:nsid w:val="7153594A"/>
     <w:multiLevelType w:val="multilevel"/>
     <w:tmpl w:val="E738DDFE"/>
@@ -38636,7 +39355,7 @@
       </w:pPr>
     </w:lvl>
   </w:abstractNum>
-  <w:abstractNum w:abstractNumId="28" w15:restartNumberingAfterBreak="0">
+  <w:abstractNum w:abstractNumId="29" w15:restartNumberingAfterBreak="0">
     <w:nsid w:val="72BD16D1"/>
     <w:multiLevelType w:val="multilevel"/>
     <w:tmpl w:val="E738DDFE"/>
@@ -38722,7 +39441,7 @@
       </w:pPr>
     </w:lvl>
   </w:abstractNum>
-  <w:abstractNum w:abstractNumId="29" w15:restartNumberingAfterBreak="0">
+  <w:abstractNum w:abstractNumId="30" w15:restartNumberingAfterBreak="0">
     <w:nsid w:val="749A1B04"/>
     <w:multiLevelType w:val="multilevel"/>
     <w:tmpl w:val="2B5CEACE"/>
@@ -38808,7 +39527,7 @@
       </w:pPr>
     </w:lvl>
   </w:abstractNum>
-  <w:abstractNum w:abstractNumId="30" w15:restartNumberingAfterBreak="0">
+  <w:abstractNum w:abstractNumId="31" w15:restartNumberingAfterBreak="0">
     <w:nsid w:val="77734A47"/>
     <w:multiLevelType w:val="multilevel"/>
     <w:tmpl w:val="8F2AE5DE"/>
@@ -38897,7 +39616,7 @@
       </w:pPr>
     </w:lvl>
   </w:abstractNum>
-  <w:abstractNum w:abstractNumId="31" w15:restartNumberingAfterBreak="0">
+  <w:abstractNum w:abstractNumId="32" w15:restartNumberingAfterBreak="0">
     <w:nsid w:val="7F6A5CE1"/>
     <w:multiLevelType w:val="multilevel"/>
     <w:tmpl w:val="E738DDFE"/>
@@ -38984,10 +39703,10 @@
     </w:lvl>
   </w:abstractNum>
   <w:num w:numId="1" w16cid:durableId="1093478461">
-    <w:abstractNumId w:val="16"/>
+    <w:abstractNumId w:val="17"/>
   </w:num>
   <w:num w:numId="2" w16cid:durableId="117921842">
-    <w:abstractNumId w:val="12"/>
+    <w:abstractNumId w:val="13"/>
   </w:num>
   <w:num w:numId="3" w16cid:durableId="1956405201">
     <w:abstractNumId w:val="5"/>
@@ -38996,7 +39715,7 @@
     <w:abstractNumId w:val="0"/>
   </w:num>
   <w:num w:numId="5" w16cid:durableId="239022876">
-    <w:abstractNumId w:val="19"/>
+    <w:abstractNumId w:val="20"/>
   </w:num>
   <w:num w:numId="6" w16cid:durableId="465319877">
     <w:abstractNumId w:val="8"/>
@@ -39008,76 +39727,79 @@
     <w:abstractNumId w:val="6"/>
   </w:num>
   <w:num w:numId="9" w16cid:durableId="241647927">
-    <w:abstractNumId w:val="24"/>
+    <w:abstractNumId w:val="25"/>
   </w:num>
   <w:num w:numId="10" w16cid:durableId="312638650">
-    <w:abstractNumId w:val="22"/>
+    <w:abstractNumId w:val="23"/>
   </w:num>
   <w:num w:numId="11" w16cid:durableId="1238595087">
-    <w:abstractNumId w:val="10"/>
+    <w:abstractNumId w:val="11"/>
   </w:num>
   <w:num w:numId="12" w16cid:durableId="1822578532">
     <w:abstractNumId w:val="2"/>
   </w:num>
   <w:num w:numId="13" w16cid:durableId="557131231">
-    <w:abstractNumId w:val="29"/>
+    <w:abstractNumId w:val="30"/>
   </w:num>
   <w:num w:numId="14" w16cid:durableId="913198224">
-    <w:abstractNumId w:val="23"/>
+    <w:abstractNumId w:val="24"/>
   </w:num>
   <w:num w:numId="15" w16cid:durableId="1082412140">
-    <w:abstractNumId w:val="30"/>
+    <w:abstractNumId w:val="31"/>
   </w:num>
   <w:num w:numId="16" w16cid:durableId="1139303078">
-    <w:abstractNumId w:val="13"/>
+    <w:abstractNumId w:val="14"/>
   </w:num>
   <w:num w:numId="17" w16cid:durableId="596058988">
+    <w:abstractNumId w:val="22"/>
+  </w:num>
+  <w:num w:numId="18" w16cid:durableId="183521319">
+    <w:abstractNumId w:val="12"/>
+  </w:num>
+  <w:num w:numId="19" w16cid:durableId="646204115">
+    <w:abstractNumId w:val="18"/>
+  </w:num>
+  <w:num w:numId="20" w16cid:durableId="347830798">
     <w:abstractNumId w:val="21"/>
   </w:num>
-  <w:num w:numId="18" w16cid:durableId="183521319">
-    <w:abstractNumId w:val="11"/>
-  </w:num>
-  <w:num w:numId="19" w16cid:durableId="646204115">
-    <w:abstractNumId w:val="17"/>
-  </w:num>
-  <w:num w:numId="20" w16cid:durableId="347830798">
-    <w:abstractNumId w:val="20"/>
-  </w:num>
   <w:num w:numId="21" w16cid:durableId="938834923">
-    <w:abstractNumId w:val="14"/>
+    <w:abstractNumId w:val="15"/>
   </w:num>
   <w:num w:numId="22" w16cid:durableId="1565338059">
     <w:abstractNumId w:val="3"/>
   </w:num>
   <w:num w:numId="23" w16cid:durableId="1515070166">
-    <w:abstractNumId w:val="26"/>
+    <w:abstractNumId w:val="27"/>
   </w:num>
   <w:num w:numId="24" w16cid:durableId="1741831833">
     <w:abstractNumId w:val="7"/>
   </w:num>
   <w:num w:numId="25" w16cid:durableId="503125785">
-    <w:abstractNumId w:val="18"/>
+    <w:abstractNumId w:val="19"/>
   </w:num>
   <w:num w:numId="26" w16cid:durableId="931543946">
-    <w:abstractNumId w:val="15"/>
+    <w:abstractNumId w:val="16"/>
   </w:num>
   <w:num w:numId="27" w16cid:durableId="526065583">
-    <w:abstractNumId w:val="25"/>
+    <w:abstractNumId w:val="26"/>
   </w:num>
   <w:num w:numId="28" w16cid:durableId="335232628">
-    <w:abstractNumId w:val="28"/>
+    <w:abstractNumId w:val="29"/>
   </w:num>
   <w:num w:numId="29" w16cid:durableId="842472900">
     <w:abstractNumId w:val="4"/>
   </w:num>
   <w:num w:numId="30" w16cid:durableId="1688406760">
-    <w:abstractNumId w:val="31"/>
+    <w:abstractNumId w:val="32"/>
   </w:num>
   <w:num w:numId="31" w16cid:durableId="807750217">
-    <w:abstractNumId w:val="27"/>
+    <w:abstractNumId w:val="28"/>
   </w:num>
   <w:num w:numId="32" w16cid:durableId="1336150721">
     <w:abstractNumId w:val="9"/>
+  </w:num>
+  <w:num w:numId="33" w16cid:durableId="1833132282">
+    <w:abstractNumId w:val="10"/>
   </w:num>
 </w:numbering>
 </file>

</xml_diff>

<commit_message>
Updated the docs some more, added to the overview another touch for developers
</commit_message>
<xml_diff>
--- a/הכשרת בדיקות אוטומטיות.docx
+++ b/הכשרת בדיקות אוטומטיות.docx
@@ -13,6 +13,9 @@
           <w:between w:val="nil"/>
         </w:pBdr>
         <w:spacing w:after="0" w:line="276" w:lineRule="auto"/>
+        <w:rPr>
+          <w:rFonts w:hint="cs"/>
+        </w:rPr>
       </w:pPr>
     </w:p>
     <w:p>
@@ -230,47 +233,13 @@
                               <w:jc w:val="center"/>
                               <w:textDirection w:val="btLr"/>
                             </w:pPr>
-                            <w:proofErr w:type="spellStart"/>
                             <w:r>
                               <w:rPr>
                                 <w:color w:val="000000"/>
                                 <w:sz w:val="88"/>
                               </w:rPr>
-                              <w:t>הכשרת</w:t>
+                              <w:t>הכשרת בדיקות אוטומטיות</w:t>
                             </w:r>
-                            <w:proofErr w:type="spellEnd"/>
-                            <w:r>
-                              <w:rPr>
-                                <w:color w:val="000000"/>
-                                <w:sz w:val="88"/>
-                              </w:rPr>
-                              <w:t xml:space="preserve"> </w:t>
-                            </w:r>
-                            <w:proofErr w:type="spellStart"/>
-                            <w:r>
-                              <w:rPr>
-                                <w:color w:val="000000"/>
-                                <w:sz w:val="88"/>
-                              </w:rPr>
-                              <w:t>בדיקות</w:t>
-                            </w:r>
-                            <w:proofErr w:type="spellEnd"/>
-                            <w:r>
-                              <w:rPr>
-                                <w:color w:val="000000"/>
-                                <w:sz w:val="88"/>
-                              </w:rPr>
-                              <w:t xml:space="preserve"> </w:t>
-                            </w:r>
-                            <w:proofErr w:type="spellStart"/>
-                            <w:r>
-                              <w:rPr>
-                                <w:color w:val="000000"/>
-                                <w:sz w:val="88"/>
-                              </w:rPr>
-                              <w:t>אוטומטיות</w:t>
-                            </w:r>
-                            <w:proofErr w:type="spellEnd"/>
                           </w:p>
                         </w:txbxContent>
                       </wps:txbx>
@@ -294,47 +263,13 @@
                         <w:jc w:val="center"/>
                         <w:textDirection w:val="btLr"/>
                       </w:pPr>
-                      <w:proofErr w:type="spellStart"/>
                       <w:r>
                         <w:rPr>
                           <w:color w:val="000000"/>
                           <w:sz w:val="88"/>
                         </w:rPr>
-                        <w:t>הכשרת</w:t>
+                        <w:t>הכשרת בדיקות אוטומטיות</w:t>
                       </w:r>
-                      <w:proofErr w:type="spellEnd"/>
-                      <w:r>
-                        <w:rPr>
-                          <w:color w:val="000000"/>
-                          <w:sz w:val="88"/>
-                        </w:rPr>
-                        <w:t xml:space="preserve"> </w:t>
-                      </w:r>
-                      <w:proofErr w:type="spellStart"/>
-                      <w:r>
-                        <w:rPr>
-                          <w:color w:val="000000"/>
-                          <w:sz w:val="88"/>
-                        </w:rPr>
-                        <w:t>בדיקות</w:t>
-                      </w:r>
-                      <w:proofErr w:type="spellEnd"/>
-                      <w:r>
-                        <w:rPr>
-                          <w:color w:val="000000"/>
-                          <w:sz w:val="88"/>
-                        </w:rPr>
-                        <w:t xml:space="preserve"> </w:t>
-                      </w:r>
-                      <w:proofErr w:type="spellStart"/>
-                      <w:r>
-                        <w:rPr>
-                          <w:color w:val="000000"/>
-                          <w:sz w:val="88"/>
-                        </w:rPr>
-                        <w:t>אוטומטיות</w:t>
-                      </w:r>
-                      <w:proofErr w:type="spellEnd"/>
                     </w:p>
                   </w:txbxContent>
                 </v:textbox>
@@ -8190,10 +8125,73 @@
           <w:rFonts w:hint="cs"/>
           <w:rtl/>
         </w:rPr>
-        <w:t xml:space="preserve">ובשביל ליצור ענפים כמו שצריך בלי לדפוק את ה </w:t>
+        <w:t xml:space="preserve">בשביל ליצור ענפים כמו שצריך </w:t>
+      </w:r>
+      <w:r>
+        <w:rPr>
+          <w:rFonts w:hint="cs"/>
+          <w:rtl/>
+        </w:rPr>
+        <w:t>(מ</w:t>
+      </w:r>
+      <w:r>
+        <w:rPr>
+          <w:rFonts w:hint="cs"/>
+          <w:rtl/>
+        </w:rPr>
+        <w:t>בלי לדפוק את ה</w:t>
+      </w:r>
+      <w:r>
+        <w:rPr>
+          <w:rFonts w:hint="cs"/>
+          <w:rtl/>
+        </w:rPr>
+        <w:t xml:space="preserve"> -</w:t>
+      </w:r>
+      <w:r>
+        <w:rPr>
+          <w:rFonts w:hint="cs"/>
+          <w:rtl/>
+        </w:rPr>
+        <w:t xml:space="preserve"> </w:t>
       </w:r>
       <w:r>
         <w:t>repo</w:t>
+      </w:r>
+      <w:r>
+        <w:rPr>
+          <w:rFonts w:hint="cs"/>
+          <w:rtl/>
+        </w:rPr>
+        <w:t xml:space="preserve"> של ההכשרה </w:t>
+      </w:r>
+      <w:r>
+        <w:rPr>
+          <mc:AlternateContent>
+            <mc:Choice Requires="w16se">
+              <w:rFonts w:hint="cs"/>
+            </mc:Choice>
+            <mc:Fallback>
+              <w:rFonts w:ascii="Segoe UI Emoji" w:eastAsia="Segoe UI Emoji" w:hAnsi="Segoe UI Emoji" w:cs="Segoe UI Emoji"/>
+            </mc:Fallback>
+          </mc:AlternateContent>
+          <w:rtl/>
+        </w:rPr>
+        <mc:AlternateContent>
+          <mc:Choice Requires="w16se">
+            <w16se:symEx w16se:font="Segoe UI Emoji" w16se:char="1F624"/>
+          </mc:Choice>
+          <mc:Fallback>
+            <w:t>😤</w:t>
+          </mc:Fallback>
+        </mc:AlternateContent>
+      </w:r>
+      <w:r>
+        <w:rPr>
+          <w:rFonts w:hint="cs"/>
+          <w:rtl/>
+        </w:rPr>
+        <w:t>)</w:t>
       </w:r>
       <w:r>
         <w:rPr>
@@ -8224,7 +8222,7 @@
           <w:rFonts w:hint="cs"/>
           <w:rtl/>
         </w:rPr>
-        <w:t>ולאחר מכן, אם סיימתם את השלבים האלו ואתם מרגישים מנוסים ב:</w:t>
+        <w:t>לאחר מכן, אם סיימתם את השלבים האלו ואתם מרגישים מנוסים ב:</w:t>
       </w:r>
     </w:p>
     <w:p>
@@ -8330,14 +8328,33 @@
           <w:rFonts w:hint="cs"/>
           <w:rtl/>
         </w:rPr>
-        <w:t xml:space="preserve">מוזמנים להגיע לשלב ה - </w:t>
-      </w:r>
-      <w:hyperlink w:anchor="_Playwright" w:history="1">
+        <w:t xml:space="preserve">מוזמנים </w:t>
+      </w:r>
+      <w:r>
+        <w:rPr>
+          <w:rFonts w:hint="cs"/>
+          <w:rtl/>
+        </w:rPr>
+        <w:t xml:space="preserve">לדלג ישירות להכשרת ה - </w:t>
+      </w:r>
+      <w:r>
+        <w:t>playwright</w:t>
+      </w:r>
+      <w:r>
+        <w:rPr>
+          <w:rFonts w:hint="cs"/>
+          <w:rtl/>
+        </w:rPr>
+        <w:t xml:space="preserve"> ולתבנית העיצוב שלה, </w:t>
+      </w:r>
+      <w:hyperlink w:anchor="_Design_patterns_בבדיקות" w:history="1">
         <w:r>
           <w:rPr>
             <w:rStyle w:val="Hyperlink"/>
+            <w:rFonts w:hint="cs"/>
+            <w:rtl/>
           </w:rPr>
-          <w:t>playwright</w:t>
+          <w:t>בקישור הזה</w:t>
         </w:r>
       </w:hyperlink>
     </w:p>
@@ -8348,11 +8365,81 @@
           <w:rtl/>
         </w:rPr>
       </w:pPr>
-    </w:p>
-    <w:p>
-      <w:pPr>
-        <w:rPr>
-          <w:rFonts w:hint="cs"/>
+      <w:r>
+        <w:rPr>
+          <w:rFonts w:hint="cs"/>
+          <w:rtl/>
+        </w:rPr>
+        <w:t xml:space="preserve">שימו </w:t>
+      </w:r>
+      <w:r>
+        <w:rPr>
+          <mc:AlternateContent>
+            <mc:Choice Requires="w16se">
+              <w:rFonts w:hint="cs"/>
+            </mc:Choice>
+            <mc:Fallback>
+              <w:rFonts w:ascii="Segoe UI Emoji" w:eastAsia="Segoe UI Emoji" w:hAnsi="Segoe UI Emoji" w:cs="Segoe UI Emoji"/>
+            </mc:Fallback>
+          </mc:AlternateContent>
+          <w:rtl/>
+        </w:rPr>
+        <mc:AlternateContent>
+          <mc:Choice Requires="w16se">
+            <w16se:symEx w16se:font="Segoe UI Emoji" w16se:char="2764"/>
+          </mc:Choice>
+          <mc:Fallback>
+            <w:t>❤</w:t>
+          </mc:Fallback>
+        </mc:AlternateContent>
+      </w:r>
+      <w:r>
+        <w:rPr>
+          <w:rFonts w:hint="cs"/>
+          <w:rtl/>
+        </w:rPr>
+        <w:t xml:space="preserve">שאם אין לכם תשתית </w:t>
+      </w:r>
+      <w:r>
+        <w:t>Cucumber</w:t>
+      </w:r>
+      <w:r>
+        <w:rPr>
+          <w:rFonts w:hint="cs"/>
+          <w:rtl/>
+        </w:rPr>
+        <w:t xml:space="preserve"> בבדיקות, אתם לא צריכים את </w:t>
+      </w:r>
+      <w:hyperlink w:anchor="_Cucumber" w:history="1">
+        <w:r>
+          <w:rPr>
+            <w:rStyle w:val="Hyperlink"/>
+            <w:rFonts w:hint="cs"/>
+            <w:rtl/>
+          </w:rPr>
+          <w:t>החל</w:t>
+        </w:r>
+        <w:r>
+          <w:rPr>
+            <w:rStyle w:val="Hyperlink"/>
+            <w:rFonts w:hint="cs"/>
+            <w:rtl/>
+          </w:rPr>
+          <w:t>ק</w:t>
+        </w:r>
+        <w:r>
+          <w:rPr>
+            <w:rStyle w:val="Hyperlink"/>
+            <w:rFonts w:hint="cs"/>
+            <w:rtl/>
+          </w:rPr>
+          <w:t xml:space="preserve"> הזה</w:t>
+        </w:r>
+      </w:hyperlink>
+    </w:p>
+    <w:p>
+      <w:pPr>
+        <w:rPr>
           <w:rtl/>
         </w:rPr>
       </w:pPr>
@@ -8558,13 +8645,13 @@
       <w:pPr>
         <w:pStyle w:val="2"/>
       </w:pPr>
-      <w:bookmarkStart w:id="11" w:name="_Toc200903258"/>
-      <w:bookmarkStart w:id="12" w:name="_Toc200903261"/>
-      <w:bookmarkStart w:id="13" w:name="_Toc223262726"/>
+      <w:bookmarkStart w:id="11" w:name="_Toc223262726"/>
+      <w:bookmarkStart w:id="12" w:name="_Toc200903258"/>
+      <w:bookmarkStart w:id="13" w:name="_Toc200903261"/>
       <w:r>
         <w:t>Postman</w:t>
       </w:r>
-      <w:bookmarkEnd w:id="13"/>
+      <w:bookmarkEnd w:id="11"/>
     </w:p>
     <w:p>
       <w:pPr>
@@ -8664,7 +8751,7 @@
       <w:r>
         <w:t>IDE</w:t>
       </w:r>
-      <w:bookmarkEnd w:id="11"/>
+      <w:bookmarkEnd w:id="12"/>
       <w:bookmarkEnd w:id="14"/>
     </w:p>
     <w:p>
@@ -8813,7 +8900,7 @@
         </w:drawing>
       </w:r>
     </w:p>
-    <w:bookmarkEnd w:id="12"/>
+    <w:bookmarkEnd w:id="13"/>
     <w:p>
       <w:pPr>
         <w:tabs>
@@ -8971,15 +9058,15 @@
       <w:pPr>
         <w:pStyle w:val="1"/>
       </w:pPr>
-      <w:bookmarkStart w:id="16" w:name="_Toc200903263"/>
-      <w:bookmarkStart w:id="17" w:name="_Git"/>
+      <w:bookmarkStart w:id="16" w:name="_Git"/>
+      <w:bookmarkStart w:id="17" w:name="_Toc200903263"/>
       <w:bookmarkStart w:id="18" w:name="_Toc223262729"/>
-      <w:bookmarkEnd w:id="17"/>
+      <w:bookmarkEnd w:id="16"/>
       <w:r>
         <w:lastRenderedPageBreak/>
         <w:t>Git</w:t>
       </w:r>
-      <w:bookmarkEnd w:id="16"/>
+      <w:bookmarkEnd w:id="17"/>
       <w:bookmarkEnd w:id="18"/>
     </w:p>
     <w:p>
@@ -9189,15 +9276,15 @@
       <w:pPr>
         <w:pStyle w:val="1"/>
       </w:pPr>
-      <w:bookmarkStart w:id="23" w:name="_Toc200903266"/>
-      <w:bookmarkStart w:id="24" w:name="_GitHub"/>
+      <w:bookmarkStart w:id="23" w:name="_GitHub"/>
+      <w:bookmarkStart w:id="24" w:name="_Toc200903266"/>
       <w:bookmarkStart w:id="25" w:name="_Toc223262732"/>
-      <w:bookmarkEnd w:id="24"/>
+      <w:bookmarkEnd w:id="23"/>
       <w:r>
         <w:lastRenderedPageBreak/>
         <w:t>GitHub</w:t>
       </w:r>
-      <w:bookmarkEnd w:id="23"/>
+      <w:bookmarkEnd w:id="24"/>
       <w:bookmarkEnd w:id="25"/>
     </w:p>
     <w:p>
@@ -9371,7 +9458,6 @@
     <w:p>
       <w:pPr>
         <w:rPr>
-          <w:rFonts w:hint="cs"/>
           <w:rtl/>
         </w:rPr>
       </w:pPr>
@@ -9514,7 +9600,6 @@
     <w:p>
       <w:pPr>
         <w:rPr>
-          <w:rFonts w:hint="cs"/>
           <w:rtl/>
         </w:rPr>
       </w:pPr>
@@ -9568,7 +9653,6 @@
       <w:pPr>
         <w:pStyle w:val="3"/>
         <w:rPr>
-          <w:rFonts w:hint="cs"/>
           <w:rtl/>
         </w:rPr>
       </w:pPr>
@@ -9595,7 +9679,6 @@
     <w:p>
       <w:pPr>
         <w:rPr>
-          <w:rFonts w:hint="cs"/>
           <w:rtl/>
         </w:rPr>
       </w:pPr>
@@ -9824,7 +9907,6 @@
     <w:p>
       <w:pPr>
         <w:rPr>
-          <w:rFonts w:hint="cs"/>
           <w:rtl/>
         </w:rPr>
       </w:pPr>
@@ -10723,10 +10805,10 @@
       <w:pPr>
         <w:pStyle w:val="1"/>
       </w:pPr>
-      <w:bookmarkStart w:id="38" w:name="_Toc200903272"/>
-      <w:bookmarkStart w:id="39" w:name="_שפת_typescript"/>
+      <w:bookmarkStart w:id="38" w:name="_שפת_typescript"/>
+      <w:bookmarkStart w:id="39" w:name="_Toc200903272"/>
       <w:bookmarkStart w:id="40" w:name="_Toc223262739"/>
-      <w:bookmarkEnd w:id="39"/>
+      <w:bookmarkEnd w:id="38"/>
       <w:r>
         <w:rPr>
           <w:rtl/>
@@ -10737,7 +10819,7 @@
       <w:r>
         <w:t>typescript</w:t>
       </w:r>
-      <w:bookmarkEnd w:id="38"/>
+      <w:bookmarkEnd w:id="39"/>
       <w:bookmarkEnd w:id="40"/>
     </w:p>
     <w:p>
@@ -12503,10 +12585,10 @@
           <w:rtl/>
         </w:rPr>
       </w:pPr>
-      <w:bookmarkStart w:id="51" w:name="_Toc200903277"/>
-      <w:bookmarkStart w:id="52" w:name="_Postman_ובקשות_API"/>
+      <w:bookmarkStart w:id="51" w:name="_Postman_ובקשות_API"/>
+      <w:bookmarkStart w:id="52" w:name="_Toc200903277"/>
       <w:bookmarkStart w:id="53" w:name="_Toc223262744"/>
-      <w:bookmarkEnd w:id="52"/>
+      <w:bookmarkEnd w:id="51"/>
       <w:r>
         <w:lastRenderedPageBreak/>
         <w:t>Postman</w:t>
@@ -12521,7 +12603,7 @@
       <w:r>
         <w:t>API</w:t>
       </w:r>
-      <w:bookmarkEnd w:id="51"/>
+      <w:bookmarkEnd w:id="52"/>
       <w:bookmarkEnd w:id="53"/>
     </w:p>
     <w:p>
@@ -13105,7 +13187,7 @@
           <w:rtl/>
         </w:rPr>
         <w:drawing>
-          <wp:anchor distT="0" distB="0" distL="114300" distR="114300" simplePos="0" relativeHeight="251668480" behindDoc="0" locked="0" layoutInCell="1" allowOverlap="1" wp14:anchorId="38E79974" wp14:editId="48A5D062">
+          <wp:anchor distT="0" distB="0" distL="114300" distR="114300" simplePos="0" relativeHeight="251668480" behindDoc="0" locked="0" layoutInCell="1" allowOverlap="1" wp14:anchorId="38E79974" wp14:editId="1D23223A">
             <wp:simplePos x="0" y="0"/>
             <wp:positionH relativeFrom="margin">
               <wp:align>left</wp:align>
@@ -17274,10 +17356,10 @@
       <w:pPr>
         <w:pStyle w:val="1"/>
       </w:pPr>
-      <w:bookmarkStart w:id="66" w:name="_Toc200903284"/>
-      <w:bookmarkStart w:id="67" w:name="_אלמנטים_באתר_האינטרנט"/>
+      <w:bookmarkStart w:id="66" w:name="_אלמנטים_באתר_האינטרנט"/>
+      <w:bookmarkStart w:id="67" w:name="_Toc200903284"/>
       <w:bookmarkStart w:id="68" w:name="_Toc223262751"/>
-      <w:bookmarkEnd w:id="67"/>
+      <w:bookmarkEnd w:id="66"/>
       <w:r>
         <w:rPr>
           <w:rtl/>
@@ -17285,7 +17367,7 @@
         <w:lastRenderedPageBreak/>
         <w:t>אלמנטים באתר האינטרנט</w:t>
       </w:r>
-      <w:bookmarkEnd w:id="66"/>
+      <w:bookmarkEnd w:id="67"/>
       <w:bookmarkEnd w:id="68"/>
     </w:p>
     <w:p>
@@ -18374,6 +18456,8 @@
         </w:rPr>
       </w:pPr>
       <w:bookmarkStart w:id="77" w:name="_Toc223262756"/>
+      <w:bookmarkStart w:id="78" w:name="_Design_patterns_בבדיקות"/>
+      <w:bookmarkEnd w:id="78"/>
       <w:r>
         <w:lastRenderedPageBreak/>
         <w:t>Design patterns</w:t>
@@ -18961,7 +19045,7 @@
           <w:rtl/>
         </w:rPr>
       </w:pPr>
-      <w:bookmarkStart w:id="78" w:name="_Toc223262757"/>
+      <w:bookmarkStart w:id="79" w:name="_Toc223262757"/>
       <w:r>
         <w:rPr>
           <w:rFonts w:hint="cs"/>
@@ -18970,7 +19054,7 @@
         <w:lastRenderedPageBreak/>
         <w:t>תבניות עיצוב בבדיקות</w:t>
       </w:r>
-      <w:bookmarkEnd w:id="78"/>
+      <w:bookmarkEnd w:id="79"/>
     </w:p>
     <w:p>
       <w:pPr>
@@ -19007,11 +19091,11 @@
           <w:rtl/>
         </w:rPr>
       </w:pPr>
-      <w:bookmarkStart w:id="79" w:name="_Toc223262758"/>
+      <w:bookmarkStart w:id="80" w:name="_Toc223262758"/>
       <w:r>
         <w:t>POM</w:t>
       </w:r>
-      <w:bookmarkEnd w:id="79"/>
+      <w:bookmarkEnd w:id="80"/>
     </w:p>
     <w:p>
       <w:pPr>
@@ -19245,11 +19329,11 @@
           <w:rtl/>
         </w:rPr>
       </w:pPr>
-      <w:bookmarkStart w:id="80" w:name="_Toc223262759"/>
+      <w:bookmarkStart w:id="81" w:name="_Toc223262759"/>
       <w:r>
         <w:t>POR</w:t>
       </w:r>
-      <w:bookmarkEnd w:id="80"/>
+      <w:bookmarkEnd w:id="81"/>
     </w:p>
     <w:p>
       <w:pPr>
@@ -19455,7 +19539,7 @@
       <w:pPr>
         <w:pStyle w:val="2"/>
       </w:pPr>
-      <w:bookmarkStart w:id="81" w:name="_Toc223262760"/>
+      <w:bookmarkStart w:id="82" w:name="_Toc223262760"/>
       <w:r>
         <w:rPr>
           <w:rFonts w:hint="cs"/>
@@ -19463,7 +19547,7 @@
         </w:rPr>
         <w:t>הערת צד אחרונה לפני שנתחיל</w:t>
       </w:r>
-      <w:bookmarkEnd w:id="81"/>
+      <w:bookmarkEnd w:id="82"/>
     </w:p>
     <w:p>
       <w:pPr>
@@ -19549,16 +19633,16 @@
       <w:pPr>
         <w:pStyle w:val="1"/>
       </w:pPr>
-      <w:bookmarkStart w:id="82" w:name="_Toc200903289"/>
       <w:bookmarkStart w:id="83" w:name="_Playwright"/>
-      <w:bookmarkStart w:id="84" w:name="_Toc223262761"/>
+      <w:bookmarkStart w:id="84" w:name="_Toc200903289"/>
+      <w:bookmarkStart w:id="85" w:name="_Toc223262761"/>
       <w:bookmarkEnd w:id="83"/>
       <w:r>
         <w:lastRenderedPageBreak/>
         <w:t>Playwright</w:t>
       </w:r>
-      <w:bookmarkEnd w:id="82"/>
       <w:bookmarkEnd w:id="84"/>
+      <w:bookmarkEnd w:id="85"/>
     </w:p>
     <w:p>
       <w:pPr>
@@ -19567,8 +19651,8 @@
           <w:rtl/>
         </w:rPr>
       </w:pPr>
-      <w:bookmarkStart w:id="85" w:name="_Toc200903290"/>
       <w:bookmarkStart w:id="86" w:name="_Toc223262762"/>
+      <w:bookmarkStart w:id="87" w:name="_Toc200903290"/>
       <w:r>
         <w:rPr>
           <w:rFonts w:hint="cs"/>
@@ -19841,7 +19925,7 @@
       <w:pPr>
         <w:pStyle w:val="2"/>
       </w:pPr>
-      <w:bookmarkStart w:id="87" w:name="_Toc223262763"/>
+      <w:bookmarkStart w:id="88" w:name="_Toc223262763"/>
       <w:r>
         <w:rPr>
           <w:rtl/>
@@ -19863,8 +19947,8 @@
         </w:rPr>
         <w:t xml:space="preserve"> שנתחיל – דף קונבנציות</w:t>
       </w:r>
-      <w:bookmarkEnd w:id="85"/>
       <w:bookmarkEnd w:id="87"/>
+      <w:bookmarkEnd w:id="88"/>
     </w:p>
     <w:p>
       <w:pPr>
@@ -19922,10 +20006,10 @@
       <w:pPr>
         <w:pStyle w:val="3"/>
       </w:pPr>
-      <w:bookmarkStart w:id="88" w:name="_קונבנציות_להכשרה_–"/>
-      <w:bookmarkStart w:id="89" w:name="_Toc200903291"/>
-      <w:bookmarkStart w:id="90" w:name="_Toc223262764"/>
-      <w:bookmarkEnd w:id="88"/>
+      <w:bookmarkStart w:id="89" w:name="_קונבנציות_להכשרה_–"/>
+      <w:bookmarkStart w:id="90" w:name="_Toc200903291"/>
+      <w:bookmarkStart w:id="91" w:name="_Toc223262764"/>
+      <w:bookmarkEnd w:id="89"/>
       <w:r>
         <w:rPr>
           <w:rtl/>
@@ -19935,8 +20019,8 @@
       <w:r>
         <w:t>TS</w:t>
       </w:r>
-      <w:bookmarkEnd w:id="89"/>
       <w:bookmarkEnd w:id="90"/>
+      <w:bookmarkEnd w:id="91"/>
     </w:p>
     <w:p>
       <w:pPr>
@@ -20676,8 +20760,8 @@
           <w:rtl/>
         </w:rPr>
       </w:pPr>
-      <w:bookmarkStart w:id="91" w:name="_heading=h.19c6y18" w:colFirst="0" w:colLast="0"/>
-      <w:bookmarkEnd w:id="91"/>
+      <w:bookmarkStart w:id="92" w:name="_heading=h.19c6y18" w:colFirst="0" w:colLast="0"/>
+      <w:bookmarkEnd w:id="92"/>
     </w:p>
     <w:p>
       <w:pPr>
@@ -20927,8 +21011,8 @@
       <w:pPr>
         <w:pStyle w:val="2"/>
       </w:pPr>
-      <w:bookmarkStart w:id="92" w:name="_Toc200903294"/>
-      <w:bookmarkStart w:id="93" w:name="_Toc223262765"/>
+      <w:bookmarkStart w:id="93" w:name="_Toc200903294"/>
+      <w:bookmarkStart w:id="94" w:name="_Toc223262765"/>
       <w:r>
         <w:rPr>
           <w:rtl/>
@@ -20936,7 +21020,7 @@
         <w:lastRenderedPageBreak/>
         <w:t>לפני שנתחיל</w:t>
       </w:r>
-      <w:bookmarkEnd w:id="92"/>
+      <w:bookmarkEnd w:id="93"/>
       <w:r>
         <w:rPr>
           <w:rFonts w:hint="cs"/>
@@ -20947,7 +21031,7 @@
       <w:r>
         <w:t>async</w:t>
       </w:r>
-      <w:bookmarkEnd w:id="93"/>
+      <w:bookmarkEnd w:id="94"/>
     </w:p>
     <w:p>
       <w:pPr>
@@ -21010,16 +21094,16 @@
       <w:pPr>
         <w:pStyle w:val="3"/>
       </w:pPr>
-      <w:bookmarkStart w:id="94" w:name="_Toc200903295"/>
-      <w:bookmarkStart w:id="95" w:name="_Toc223262766"/>
+      <w:bookmarkStart w:id="95" w:name="_Toc200903295"/>
+      <w:bookmarkStart w:id="96" w:name="_Toc223262766"/>
       <w:r>
         <w:rPr>
           <w:rtl/>
         </w:rPr>
         <w:t>חומר למידה</w:t>
       </w:r>
-      <w:bookmarkEnd w:id="94"/>
       <w:bookmarkEnd w:id="95"/>
+      <w:bookmarkEnd w:id="96"/>
     </w:p>
     <w:p>
       <w:r>
@@ -21093,16 +21177,16 @@
       <w:pPr>
         <w:pStyle w:val="3"/>
       </w:pPr>
-      <w:bookmarkStart w:id="96" w:name="_Toc200903296"/>
-      <w:bookmarkStart w:id="97" w:name="_Toc223262767"/>
+      <w:bookmarkStart w:id="97" w:name="_Toc200903296"/>
+      <w:bookmarkStart w:id="98" w:name="_Toc223262767"/>
       <w:r>
         <w:rPr>
           <w:rtl/>
         </w:rPr>
         <w:t>תרגול</w:t>
       </w:r>
-      <w:bookmarkEnd w:id="96"/>
       <w:bookmarkEnd w:id="97"/>
+      <w:bookmarkEnd w:id="98"/>
     </w:p>
     <w:p>
       <w:pPr>
@@ -21537,8 +21621,8 @@
       <w:pPr>
         <w:pStyle w:val="2"/>
       </w:pPr>
-      <w:bookmarkStart w:id="98" w:name="_Toc200903297"/>
-      <w:bookmarkStart w:id="99" w:name="_Toc223262768"/>
+      <w:bookmarkStart w:id="99" w:name="_Toc200903297"/>
+      <w:bookmarkStart w:id="100" w:name="_Toc223262768"/>
       <w:r>
         <w:rPr>
           <w:rtl/>
@@ -21546,15 +21630,15 @@
         <w:lastRenderedPageBreak/>
         <w:t>הכשרה</w:t>
       </w:r>
-      <w:bookmarkEnd w:id="98"/>
       <w:bookmarkEnd w:id="99"/>
+      <w:bookmarkEnd w:id="100"/>
     </w:p>
     <w:p>
       <w:pPr>
         <w:pStyle w:val="3"/>
       </w:pPr>
-      <w:bookmarkStart w:id="100" w:name="_Toc200903298"/>
-      <w:bookmarkStart w:id="101" w:name="_Toc223262769"/>
+      <w:bookmarkStart w:id="101" w:name="_Toc200903298"/>
+      <w:bookmarkStart w:id="102" w:name="_Toc223262769"/>
       <w:r>
         <w:rPr>
           <w:rtl/>
@@ -21614,8 +21698,8 @@
         </w:rPr>
         <w:t>בדיקות</w:t>
       </w:r>
-      <w:bookmarkEnd w:id="100"/>
       <w:bookmarkEnd w:id="101"/>
+      <w:bookmarkEnd w:id="102"/>
     </w:p>
     <w:p>
       <w:pPr>
@@ -21840,7 +21924,7 @@
           <w:rtl/>
         </w:rPr>
       </w:pPr>
-      <w:bookmarkStart w:id="102" w:name="_Toc200903299"/>
+      <w:bookmarkStart w:id="103" w:name="_Toc200903299"/>
     </w:p>
     <w:p>
       <w:pPr>
@@ -21972,7 +22056,7 @@
       <w:pPr>
         <w:pStyle w:val="3"/>
       </w:pPr>
-      <w:bookmarkStart w:id="103" w:name="_Toc223262770"/>
+      <w:bookmarkStart w:id="104" w:name="_Toc223262770"/>
       <w:r>
         <w:rPr>
           <w:rtl/>
@@ -21980,8 +22064,8 @@
         <w:lastRenderedPageBreak/>
         <w:t>התשתית</w:t>
       </w:r>
-      <w:bookmarkEnd w:id="102"/>
       <w:bookmarkEnd w:id="103"/>
+      <w:bookmarkEnd w:id="104"/>
     </w:p>
     <w:p>
       <w:r>
@@ -22038,16 +22122,16 @@
       <w:pPr>
         <w:pStyle w:val="3"/>
       </w:pPr>
-      <w:bookmarkStart w:id="104" w:name="_Toc200903300"/>
-      <w:bookmarkStart w:id="105" w:name="_Toc223262771"/>
+      <w:bookmarkStart w:id="105" w:name="_Toc200903300"/>
+      <w:bookmarkStart w:id="106" w:name="_Toc223262771"/>
       <w:r>
         <w:rPr>
           <w:rtl/>
         </w:rPr>
         <w:t>הסבר על התשתית</w:t>
       </w:r>
-      <w:bookmarkEnd w:id="104"/>
       <w:bookmarkEnd w:id="105"/>
+      <w:bookmarkEnd w:id="106"/>
     </w:p>
     <w:p>
       <w:pPr>
@@ -23303,8 +23387,8 @@
       <w:pPr>
         <w:pStyle w:val="2"/>
       </w:pPr>
-      <w:bookmarkStart w:id="106" w:name="_Toc200903301"/>
-      <w:bookmarkStart w:id="107" w:name="_Toc223262772"/>
+      <w:bookmarkStart w:id="107" w:name="_Toc200903301"/>
+      <w:bookmarkStart w:id="108" w:name="_Toc223262772"/>
       <w:r>
         <w:rPr>
           <w:rtl/>
@@ -23312,8 +23396,8 @@
         <w:lastRenderedPageBreak/>
         <w:t>תרגול</w:t>
       </w:r>
-      <w:bookmarkEnd w:id="106"/>
       <w:bookmarkEnd w:id="107"/>
+      <w:bookmarkEnd w:id="108"/>
     </w:p>
     <w:p>
       <w:pPr>
@@ -23544,8 +23628,8 @@
           <w:rtl/>
         </w:rPr>
       </w:pPr>
-      <w:bookmarkStart w:id="108" w:name="_heading=h.1egqt2p" w:colFirst="0" w:colLast="0"/>
-      <w:bookmarkEnd w:id="108"/>
+      <w:bookmarkStart w:id="109" w:name="_heading=h.1egqt2p" w:colFirst="0" w:colLast="0"/>
+      <w:bookmarkEnd w:id="109"/>
       <w:r>
         <w:rPr>
           <w:rtl/>
@@ -23645,7 +23729,7 @@
           <w:rtl/>
         </w:rPr>
       </w:pPr>
-      <w:bookmarkStart w:id="109" w:name="_Toc223262773"/>
+      <w:bookmarkStart w:id="110" w:name="_Toc223262773"/>
       <w:r>
         <w:rPr>
           <w:rFonts w:hint="cs"/>
@@ -23673,7 +23757,7 @@
         </w:rPr>
         <w:t xml:space="preserve"> לא לדלג!</w:t>
       </w:r>
-      <w:bookmarkEnd w:id="109"/>
+      <w:bookmarkEnd w:id="110"/>
     </w:p>
     <w:p>
       <w:pPr>
@@ -23932,8 +24016,8 @@
       <w:pPr>
         <w:pStyle w:val="3"/>
       </w:pPr>
-      <w:bookmarkStart w:id="110" w:name="_Toc200903302"/>
       <w:bookmarkStart w:id="111" w:name="_Toc223262774"/>
+      <w:bookmarkStart w:id="112" w:name="_Toc200903302"/>
       <w:r>
         <w:rPr>
           <w:rFonts w:hint="cs"/>
@@ -23998,7 +24082,7 @@
         </w:rPr>
         <w:t xml:space="preserve"> ראשונה</w:t>
       </w:r>
-      <w:bookmarkEnd w:id="110"/>
+      <w:bookmarkEnd w:id="112"/>
       <w:r>
         <w:rPr>
           <w:rFonts w:hint="cs"/>
@@ -24475,7 +24559,7 @@
       <w:pPr>
         <w:pStyle w:val="4"/>
       </w:pPr>
-      <w:bookmarkStart w:id="112" w:name="_Toc200903303"/>
+      <w:bookmarkStart w:id="113" w:name="_Toc200903303"/>
       <w:r>
         <w:rPr>
           <w:rFonts w:hint="cs"/>
@@ -24489,7 +24573,7 @@
         </w:rPr>
         <w:t xml:space="preserve"> שנייה</w:t>
       </w:r>
-      <w:bookmarkEnd w:id="112"/>
+      <w:bookmarkEnd w:id="113"/>
       <w:r>
         <w:rPr>
           <w:rFonts w:hint="cs"/>
@@ -24920,7 +25004,7 @@
       <w:pPr>
         <w:pStyle w:val="4"/>
       </w:pPr>
-      <w:bookmarkStart w:id="113" w:name="_Toc200903304"/>
+      <w:bookmarkStart w:id="114" w:name="_Toc200903304"/>
       <w:r>
         <w:rPr>
           <w:rFonts w:hint="cs"/>
@@ -24934,7 +25018,7 @@
         </w:rPr>
         <w:t xml:space="preserve"> שלישית</w:t>
       </w:r>
-      <w:bookmarkEnd w:id="113"/>
+      <w:bookmarkEnd w:id="114"/>
       <w:r>
         <w:rPr>
           <w:rFonts w:hint="cs"/>
@@ -25302,7 +25386,7 @@
           <w:rtl/>
         </w:rPr>
       </w:pPr>
-      <w:bookmarkStart w:id="114" w:name="_Toc200903305"/>
+      <w:bookmarkStart w:id="115" w:name="_Toc200903305"/>
       <w:r>
         <w:rPr>
           <w:rFonts w:hint="cs"/>
@@ -25316,7 +25400,7 @@
         </w:rPr>
         <w:t xml:space="preserve"> </w:t>
       </w:r>
-      <w:bookmarkEnd w:id="114"/>
+      <w:bookmarkEnd w:id="115"/>
       <w:r>
         <w:rPr>
           <w:rFonts w:hint="cs"/>
@@ -25810,7 +25894,7 @@
           <w:rtl/>
         </w:rPr>
       </w:pPr>
-      <w:bookmarkStart w:id="115" w:name="_Toc223262775"/>
+      <w:bookmarkStart w:id="116" w:name="_Toc223262775"/>
       <w:r>
         <w:rPr>
           <w:rFonts w:hint="cs"/>
@@ -25821,7 +25905,7 @@
       <w:r>
         <w:t>Swag Labs</w:t>
       </w:r>
-      <w:bookmarkEnd w:id="115"/>
+      <w:bookmarkEnd w:id="116"/>
     </w:p>
     <w:p>
       <w:pPr>
@@ -26738,21 +26822,23 @@
       <w:pPr>
         <w:pStyle w:val="1"/>
       </w:pPr>
-      <w:bookmarkStart w:id="116" w:name="_Toc200903306"/>
-      <w:bookmarkStart w:id="117" w:name="_Toc223262776"/>
+      <w:bookmarkStart w:id="117" w:name="_Toc200903306"/>
+      <w:bookmarkStart w:id="118" w:name="_Toc223262776"/>
+      <w:bookmarkStart w:id="119" w:name="_Cucumber"/>
+      <w:bookmarkEnd w:id="119"/>
       <w:r>
         <w:lastRenderedPageBreak/>
         <w:t>Cucumber</w:t>
       </w:r>
-      <w:bookmarkEnd w:id="116"/>
       <w:bookmarkEnd w:id="117"/>
+      <w:bookmarkEnd w:id="118"/>
     </w:p>
     <w:p>
       <w:pPr>
         <w:pStyle w:val="2"/>
       </w:pPr>
-      <w:bookmarkStart w:id="118" w:name="_Toc200903307"/>
-      <w:bookmarkStart w:id="119" w:name="_Toc223262777"/>
+      <w:bookmarkStart w:id="120" w:name="_Toc200903307"/>
+      <w:bookmarkStart w:id="121" w:name="_Toc223262777"/>
       <w:r>
         <w:rPr>
           <w:rtl/>
@@ -26773,8 +26859,8 @@
         </w:rPr>
         <w:t xml:space="preserve"> שנתחיל – דף קונבנציות</w:t>
       </w:r>
-      <w:bookmarkEnd w:id="118"/>
-      <w:bookmarkEnd w:id="119"/>
+      <w:bookmarkEnd w:id="120"/>
+      <w:bookmarkEnd w:id="121"/>
     </w:p>
     <w:p>
       <w:pPr>
@@ -26857,8 +26943,8 @@
       <w:pPr>
         <w:pStyle w:val="3"/>
       </w:pPr>
-      <w:bookmarkStart w:id="120" w:name="_Toc200903308"/>
-      <w:bookmarkStart w:id="121" w:name="_Toc223262778"/>
+      <w:bookmarkStart w:id="122" w:name="_Toc200903308"/>
+      <w:bookmarkStart w:id="123" w:name="_Toc223262778"/>
       <w:r>
         <w:rPr>
           <w:rtl/>
@@ -26868,8 +26954,8 @@
       <w:r>
         <w:t>feature</w:t>
       </w:r>
-      <w:bookmarkEnd w:id="120"/>
-      <w:bookmarkEnd w:id="121"/>
+      <w:bookmarkEnd w:id="122"/>
+      <w:bookmarkEnd w:id="123"/>
     </w:p>
     <w:p>
       <w:pPr>
@@ -28024,15 +28110,15 @@
           <w:rtl/>
         </w:rPr>
       </w:pPr>
-      <w:bookmarkStart w:id="122" w:name="_heading=h.1664s55" w:colFirst="0" w:colLast="0"/>
-      <w:bookmarkEnd w:id="122"/>
+      <w:bookmarkStart w:id="124" w:name="_heading=h.1664s55" w:colFirst="0" w:colLast="0"/>
+      <w:bookmarkEnd w:id="124"/>
     </w:p>
     <w:p>
       <w:pPr>
         <w:pStyle w:val="3"/>
       </w:pPr>
-      <w:bookmarkStart w:id="123" w:name="_Toc200903309"/>
-      <w:bookmarkStart w:id="124" w:name="_Toc223262779"/>
+      <w:bookmarkStart w:id="125" w:name="_Toc200903309"/>
+      <w:bookmarkStart w:id="126" w:name="_Toc223262779"/>
       <w:r>
         <w:rPr>
           <w:rtl/>
@@ -28043,8 +28129,8 @@
       <w:r>
         <w:t>step-definitions</w:t>
       </w:r>
-      <w:bookmarkEnd w:id="123"/>
-      <w:bookmarkEnd w:id="124"/>
+      <w:bookmarkEnd w:id="125"/>
+      <w:bookmarkEnd w:id="126"/>
     </w:p>
     <w:p>
       <w:pPr>
@@ -28692,23 +28778,23 @@
           <w:rtl/>
         </w:rPr>
       </w:pPr>
-      <w:bookmarkStart w:id="125" w:name="_heading=h.25b2l0r" w:colFirst="0" w:colLast="0"/>
-      <w:bookmarkEnd w:id="125"/>
+      <w:bookmarkStart w:id="127" w:name="_heading=h.25b2l0r" w:colFirst="0" w:colLast="0"/>
+      <w:bookmarkEnd w:id="127"/>
     </w:p>
     <w:p>
       <w:pPr>
         <w:pStyle w:val="3"/>
       </w:pPr>
-      <w:bookmarkStart w:id="126" w:name="_Toc200903310"/>
-      <w:bookmarkStart w:id="127" w:name="_Toc223262780"/>
+      <w:bookmarkStart w:id="128" w:name="_Toc200903310"/>
+      <w:bookmarkStart w:id="129" w:name="_Toc223262780"/>
       <w:r>
         <w:rPr>
           <w:rtl/>
         </w:rPr>
         <w:t>כללי ניסוח לצעד</w:t>
       </w:r>
-      <w:bookmarkEnd w:id="126"/>
-      <w:bookmarkEnd w:id="127"/>
+      <w:bookmarkEnd w:id="128"/>
+      <w:bookmarkEnd w:id="129"/>
     </w:p>
     <w:p>
       <w:pPr>
@@ -28826,8 +28912,8 @@
         </w:rPr>
         <w:t>"enabled"</w:t>
       </w:r>
-      <w:bookmarkStart w:id="128" w:name="_heading=h.34g0dwd" w:colFirst="0" w:colLast="0"/>
-      <w:bookmarkEnd w:id="128"/>
+      <w:bookmarkStart w:id="130" w:name="_heading=h.34g0dwd" w:colFirst="0" w:colLast="0"/>
+      <w:bookmarkEnd w:id="130"/>
     </w:p>
     <w:p>
       <w:pPr>
@@ -29382,8 +29468,8 @@
       <w:pPr>
         <w:pStyle w:val="2"/>
       </w:pPr>
-      <w:bookmarkStart w:id="129" w:name="_Toc200903311"/>
-      <w:bookmarkStart w:id="130" w:name="_Toc223262781"/>
+      <w:bookmarkStart w:id="131" w:name="_Toc200903311"/>
+      <w:bookmarkStart w:id="132" w:name="_Toc223262781"/>
       <w:r>
         <w:rPr>
           <w:rtl/>
@@ -29391,8 +29477,8 @@
         <w:lastRenderedPageBreak/>
         <w:t>מבוא</w:t>
       </w:r>
-      <w:bookmarkEnd w:id="129"/>
-      <w:bookmarkEnd w:id="130"/>
+      <w:bookmarkEnd w:id="131"/>
+      <w:bookmarkEnd w:id="132"/>
     </w:p>
     <w:p>
       <w:pPr>
@@ -29589,31 +29675,31 @@
       <w:pPr>
         <w:pStyle w:val="2"/>
       </w:pPr>
-      <w:bookmarkStart w:id="131" w:name="_Toc200903312"/>
-      <w:bookmarkStart w:id="132" w:name="_Toc223262782"/>
+      <w:bookmarkStart w:id="133" w:name="_Toc200903312"/>
+      <w:bookmarkStart w:id="134" w:name="_Toc223262782"/>
       <w:r>
         <w:rPr>
           <w:rtl/>
         </w:rPr>
         <w:t>הכשרה</w:t>
-      </w:r>
-      <w:bookmarkEnd w:id="131"/>
-      <w:bookmarkEnd w:id="132"/>
-    </w:p>
-    <w:p>
-      <w:pPr>
-        <w:pStyle w:val="3"/>
-      </w:pPr>
-      <w:bookmarkStart w:id="133" w:name="_Toc200903313"/>
-      <w:bookmarkStart w:id="134" w:name="_Toc223262783"/>
-      <w:r>
-        <w:rPr>
-          <w:rtl/>
-        </w:rPr>
-        <w:t>התשתית</w:t>
       </w:r>
       <w:bookmarkEnd w:id="133"/>
       <w:bookmarkEnd w:id="134"/>
+    </w:p>
+    <w:p>
+      <w:pPr>
+        <w:pStyle w:val="3"/>
+      </w:pPr>
+      <w:bookmarkStart w:id="135" w:name="_Toc200903313"/>
+      <w:bookmarkStart w:id="136" w:name="_Toc223262783"/>
+      <w:r>
+        <w:rPr>
+          <w:rtl/>
+        </w:rPr>
+        <w:t>התשתית</w:t>
+      </w:r>
+      <w:bookmarkEnd w:id="135"/>
+      <w:bookmarkEnd w:id="136"/>
     </w:p>
     <w:p>
       <w:r>
@@ -29759,16 +29845,16 @@
       <w:pPr>
         <w:pStyle w:val="3"/>
       </w:pPr>
-      <w:bookmarkStart w:id="135" w:name="_Toc200903314"/>
-      <w:bookmarkStart w:id="136" w:name="_Toc223262784"/>
+      <w:bookmarkStart w:id="137" w:name="_Toc200903314"/>
+      <w:bookmarkStart w:id="138" w:name="_Toc223262784"/>
       <w:r>
         <w:rPr>
           <w:rtl/>
         </w:rPr>
         <w:t>הסבר קצר על התשתית</w:t>
       </w:r>
-      <w:bookmarkEnd w:id="135"/>
-      <w:bookmarkEnd w:id="136"/>
+      <w:bookmarkEnd w:id="137"/>
+      <w:bookmarkEnd w:id="138"/>
     </w:p>
     <w:p>
       <w:pPr>
@@ -32721,7 +32807,7 @@
           <w:szCs w:val="21"/>
         </w:rPr>
       </w:pPr>
-      <w:bookmarkStart w:id="137" w:name="_Hlk200905906"/>
+      <w:bookmarkStart w:id="139" w:name="_Hlk200905906"/>
       <w:r>
         <w:rPr>
           <w:rFonts w:ascii="Consolas" w:eastAsia="Times New Roman" w:hAnsi="Consolas" w:cs="Times New Roman"/>
@@ -33237,7 +33323,7 @@
         <w:t>)</w:t>
       </w:r>
     </w:p>
-    <w:bookmarkEnd w:id="137"/>
+    <w:bookmarkEnd w:id="139"/>
     <w:p>
       <w:pPr>
         <w:tabs>
@@ -33648,8 +33734,8 @@
           <w:szCs w:val="21"/>
         </w:rPr>
       </w:pPr>
-      <w:bookmarkStart w:id="138" w:name="_heading=h.3vac5uf" w:colFirst="0" w:colLast="0"/>
-      <w:bookmarkEnd w:id="138"/>
+      <w:bookmarkStart w:id="140" w:name="_heading=h.3vac5uf" w:colFirst="0" w:colLast="0"/>
+      <w:bookmarkEnd w:id="140"/>
       <w:proofErr w:type="spellStart"/>
       <w:r>
         <w:rPr>
@@ -34513,8 +34599,8 @@
           <w:szCs w:val="21"/>
         </w:rPr>
       </w:pPr>
-      <w:bookmarkStart w:id="139" w:name="_heading=h.pkwqa1" w:colFirst="0" w:colLast="0"/>
-      <w:bookmarkEnd w:id="139"/>
+      <w:bookmarkStart w:id="141" w:name="_heading=h.pkwqa1" w:colFirst="0" w:colLast="0"/>
+      <w:bookmarkEnd w:id="141"/>
       <w:r>
         <w:rPr>
           <w:rFonts w:ascii="Consolas" w:eastAsia="Times New Roman" w:hAnsi="Consolas" w:cs="Times New Roman"/>
@@ -35135,8 +35221,8 @@
           <w:szCs w:val="21"/>
         </w:rPr>
       </w:pPr>
-      <w:bookmarkStart w:id="140" w:name="_heading=h.39kk8xu" w:colFirst="0" w:colLast="0"/>
-      <w:bookmarkEnd w:id="140"/>
+      <w:bookmarkStart w:id="142" w:name="_heading=h.39kk8xu" w:colFirst="0" w:colLast="0"/>
+      <w:bookmarkEnd w:id="142"/>
       <w:r>
         <w:rPr>
           <w:rFonts w:ascii="Consolas" w:eastAsia="Times New Roman" w:hAnsi="Consolas" w:cs="Times New Roman"/>
@@ -35421,8 +35507,8 @@
       <w:pPr>
         <w:pStyle w:val="2"/>
       </w:pPr>
-      <w:bookmarkStart w:id="141" w:name="_Toc200903315"/>
-      <w:bookmarkStart w:id="142" w:name="_Toc223262785"/>
+      <w:bookmarkStart w:id="143" w:name="_Toc200903315"/>
+      <w:bookmarkStart w:id="144" w:name="_Toc223262785"/>
       <w:r>
         <w:rPr>
           <w:rtl/>
@@ -35430,58 +35516,58 @@
         <w:lastRenderedPageBreak/>
         <w:t>תרגול</w:t>
       </w:r>
-      <w:bookmarkEnd w:id="141"/>
-      <w:bookmarkEnd w:id="142"/>
-    </w:p>
-    <w:p>
-      <w:r>
-        <w:rPr>
-          <w:rtl/>
-        </w:rPr>
-        <w:t xml:space="preserve">המשימות בחלק זה יהיו דומות ל </w:t>
-      </w:r>
-      <w:r>
-        <w:t>playwright</w:t>
-      </w:r>
-      <w:r>
-        <w:rPr>
-          <w:rtl/>
-        </w:rPr>
-        <w:t>, אבל עם יותר חשיבה פתוחה.</w:t>
-      </w:r>
-    </w:p>
-    <w:p>
-      <w:r>
-        <w:rPr>
-          <w:rtl/>
-        </w:rPr>
-        <w:t xml:space="preserve">על כל משימה שאתם מסיימים, תקראו לממונה עליכם ל </w:t>
-      </w:r>
-      <w:r>
-        <w:t>code review</w:t>
-      </w:r>
-      <w:r>
-        <w:rPr>
-          <w:rtl/>
-        </w:rPr>
-        <w:t>.</w:t>
-      </w:r>
-    </w:p>
-    <w:p/>
-    <w:p>
-      <w:pPr>
-        <w:pStyle w:val="3"/>
-      </w:pPr>
-      <w:bookmarkStart w:id="143" w:name="_Toc200903316"/>
-      <w:bookmarkStart w:id="144" w:name="_Toc223262786"/>
-      <w:r>
-        <w:rPr>
-          <w:rtl/>
-        </w:rPr>
-        <w:t>משימה ראשונה</w:t>
-      </w:r>
       <w:bookmarkEnd w:id="143"/>
       <w:bookmarkEnd w:id="144"/>
+    </w:p>
+    <w:p>
+      <w:r>
+        <w:rPr>
+          <w:rtl/>
+        </w:rPr>
+        <w:t xml:space="preserve">המשימות בחלק זה יהיו דומות ל </w:t>
+      </w:r>
+      <w:r>
+        <w:t>playwright</w:t>
+      </w:r>
+      <w:r>
+        <w:rPr>
+          <w:rtl/>
+        </w:rPr>
+        <w:t>, אבל עם יותר חשיבה פתוחה.</w:t>
+      </w:r>
+    </w:p>
+    <w:p>
+      <w:r>
+        <w:rPr>
+          <w:rtl/>
+        </w:rPr>
+        <w:t xml:space="preserve">על כל משימה שאתם מסיימים, תקראו לממונה עליכם ל </w:t>
+      </w:r>
+      <w:r>
+        <w:t>code review</w:t>
+      </w:r>
+      <w:r>
+        <w:rPr>
+          <w:rtl/>
+        </w:rPr>
+        <w:t>.</w:t>
+      </w:r>
+    </w:p>
+    <w:p/>
+    <w:p>
+      <w:pPr>
+        <w:pStyle w:val="3"/>
+      </w:pPr>
+      <w:bookmarkStart w:id="145" w:name="_Toc200903316"/>
+      <w:bookmarkStart w:id="146" w:name="_Toc223262786"/>
+      <w:r>
+        <w:rPr>
+          <w:rtl/>
+        </w:rPr>
+        <w:t>משימה ראשונה</w:t>
+      </w:r>
+      <w:bookmarkEnd w:id="145"/>
+      <w:bookmarkEnd w:id="146"/>
     </w:p>
     <w:p>
       <w:r>
@@ -35609,16 +35695,16 @@
       <w:pPr>
         <w:pStyle w:val="3"/>
       </w:pPr>
-      <w:bookmarkStart w:id="145" w:name="_Toc200903317"/>
-      <w:bookmarkStart w:id="146" w:name="_Toc223262787"/>
+      <w:bookmarkStart w:id="147" w:name="_Toc200903317"/>
+      <w:bookmarkStart w:id="148" w:name="_Toc223262787"/>
       <w:r>
         <w:rPr>
           <w:rtl/>
         </w:rPr>
         <w:t>משימה שנייה</w:t>
       </w:r>
-      <w:bookmarkEnd w:id="145"/>
-      <w:bookmarkEnd w:id="146"/>
+      <w:bookmarkEnd w:id="147"/>
+      <w:bookmarkEnd w:id="148"/>
     </w:p>
     <w:p>
       <w:r>
@@ -35680,16 +35766,16 @@
       <w:pPr>
         <w:pStyle w:val="3"/>
       </w:pPr>
-      <w:bookmarkStart w:id="147" w:name="_Toc200903318"/>
-      <w:bookmarkStart w:id="148" w:name="_Toc223262788"/>
+      <w:bookmarkStart w:id="149" w:name="_Toc200903318"/>
+      <w:bookmarkStart w:id="150" w:name="_Toc223262788"/>
       <w:r>
         <w:rPr>
           <w:rtl/>
         </w:rPr>
         <w:t>משימה שלישית</w:t>
       </w:r>
-      <w:bookmarkEnd w:id="147"/>
-      <w:bookmarkEnd w:id="148"/>
+      <w:bookmarkEnd w:id="149"/>
+      <w:bookmarkEnd w:id="150"/>
     </w:p>
     <w:p>
       <w:r>
@@ -36031,7 +36117,7 @@
           <w:rtl/>
         </w:rPr>
       </w:pPr>
-      <w:bookmarkStart w:id="149" w:name="_Toc223262789"/>
+      <w:bookmarkStart w:id="151" w:name="_Toc223262789"/>
       <w:r>
         <w:rPr>
           <w:rFonts w:hint="cs"/>
@@ -36040,7 +36126,7 @@
         <w:lastRenderedPageBreak/>
         <w:t>נספחים</w:t>
       </w:r>
-      <w:bookmarkEnd w:id="149"/>
+      <w:bookmarkEnd w:id="151"/>
     </w:p>
     <w:p>
       <w:pPr>
@@ -36049,9 +36135,9 @@
           <w:rtl/>
         </w:rPr>
       </w:pPr>
-      <w:bookmarkStart w:id="150" w:name="_עץ_הקבצים_בתשתית"/>
-      <w:bookmarkStart w:id="151" w:name="_Toc223262790"/>
-      <w:bookmarkEnd w:id="150"/>
+      <w:bookmarkStart w:id="152" w:name="_עץ_הקבצים_בתשתית"/>
+      <w:bookmarkStart w:id="153" w:name="_Toc223262790"/>
+      <w:bookmarkEnd w:id="152"/>
       <w:r>
         <w:rPr>
           <w:rFonts w:hint="cs"/>
@@ -36069,18 +36155,18 @@
       <w:r>
         <w:t>typescript</w:t>
       </w:r>
-      <w:bookmarkEnd w:id="151"/>
+      <w:bookmarkEnd w:id="153"/>
     </w:p>
     <w:p>
       <w:pPr>
         <w:pStyle w:val="3"/>
       </w:pPr>
-      <w:bookmarkStart w:id="152" w:name="_Toc223262791"/>
+      <w:bookmarkStart w:id="154" w:name="_Toc223262791"/>
       <w:proofErr w:type="spellStart"/>
       <w:r>
         <w:t>package.json</w:t>
       </w:r>
-      <w:bookmarkEnd w:id="152"/>
+      <w:bookmarkEnd w:id="154"/>
       <w:proofErr w:type="spellEnd"/>
     </w:p>
     <w:p>
@@ -36130,12 +36216,12 @@
           <w:rtl/>
         </w:rPr>
       </w:pPr>
-      <w:bookmarkStart w:id="153" w:name="_Toc223262792"/>
+      <w:bookmarkStart w:id="155" w:name="_Toc223262792"/>
       <w:proofErr w:type="spellStart"/>
       <w:r>
         <w:t>tsconfig.json</w:t>
       </w:r>
-      <w:bookmarkEnd w:id="153"/>
+      <w:bookmarkEnd w:id="155"/>
       <w:proofErr w:type="spellEnd"/>
     </w:p>
     <w:p>
@@ -36181,7 +36267,7 @@
       <w:pPr>
         <w:pStyle w:val="3"/>
       </w:pPr>
-      <w:bookmarkStart w:id="154" w:name="_Toc223262793"/>
+      <w:bookmarkStart w:id="156" w:name="_Toc223262793"/>
       <w:r>
         <w:rPr>
           <w:rFonts w:hint="cs"/>
@@ -36193,7 +36279,7 @@
       <w:r>
         <w:t>src</w:t>
       </w:r>
-      <w:bookmarkEnd w:id="154"/>
+      <w:bookmarkEnd w:id="156"/>
       <w:proofErr w:type="spellEnd"/>
     </w:p>
     <w:p>
@@ -36231,7 +36317,7 @@
       <w:pPr>
         <w:pStyle w:val="3"/>
       </w:pPr>
-      <w:bookmarkStart w:id="155" w:name="_Toc223262794"/>
+      <w:bookmarkStart w:id="157" w:name="_Toc223262794"/>
       <w:r>
         <w:rPr>
           <w:rtl/>
@@ -36254,7 +36340,7 @@
       <w:r>
         <w:t>utils</w:t>
       </w:r>
-      <w:bookmarkEnd w:id="155"/>
+      <w:bookmarkEnd w:id="157"/>
     </w:p>
     <w:p>
       <w:pPr>

</xml_diff>